<commit_message>
ajout de paramettre de statistique sur l'utilisation des velos
</commit_message>
<xml_diff>
--- a/Velo en libre service/Détails_étude_de_cas_Cyclistic.docx
+++ b/Velo en libre service/Détails_étude_de_cas_Cyclistic.docx
@@ -9,7 +9,63 @@
     </w:p>
     <w:p>
       <w:r>
-        <w:t>Transformation des fichiers csv en base de données Mysql via l’option « Table data import wizard » Selectioin des type de données par entrée, ne pas selectionner les données intulie du type « Coordionées GPS des stations de début et de fin »</w:t>
+        <w:t xml:space="preserve">Transformation des fichiers csv en base de données </w:t>
+      </w:r>
+      <w:proofErr w:type="spellStart"/>
+      <w:r>
+        <w:t>Mysql</w:t>
+      </w:r>
+      <w:proofErr w:type="spellEnd"/>
+      <w:r>
+        <w:t xml:space="preserve"> via l’option « Table data import </w:t>
+      </w:r>
+      <w:proofErr w:type="spellStart"/>
+      <w:r>
+        <w:t>wizard</w:t>
+      </w:r>
+      <w:proofErr w:type="spellEnd"/>
+      <w:r>
+        <w:t xml:space="preserve"> » </w:t>
+      </w:r>
+      <w:proofErr w:type="spellStart"/>
+      <w:r>
+        <w:t>Selectioin</w:t>
+      </w:r>
+      <w:proofErr w:type="spellEnd"/>
+      <w:r>
+        <w:t xml:space="preserve"> </w:t>
+      </w:r>
+      <w:proofErr w:type="gramStart"/>
+      <w:r>
+        <w:t>des type</w:t>
+      </w:r>
+      <w:proofErr w:type="gramEnd"/>
+      <w:r>
+        <w:t xml:space="preserve"> de données par entrée, ne pas </w:t>
+      </w:r>
+      <w:proofErr w:type="spellStart"/>
+      <w:r>
+        <w:t>selectionner</w:t>
+      </w:r>
+      <w:proofErr w:type="spellEnd"/>
+      <w:r>
+        <w:t xml:space="preserve"> les données </w:t>
+      </w:r>
+      <w:proofErr w:type="spellStart"/>
+      <w:r>
+        <w:t>intulie</w:t>
+      </w:r>
+      <w:proofErr w:type="spellEnd"/>
+      <w:r>
+        <w:t xml:space="preserve"> du type « </w:t>
+      </w:r>
+      <w:proofErr w:type="spellStart"/>
+      <w:r>
+        <w:t>Coordionées</w:t>
+      </w:r>
+      <w:proofErr w:type="spellEnd"/>
+      <w:r>
+        <w:t xml:space="preserve"> GPS des stations de début et de fin »</w:t>
       </w:r>
     </w:p>
     <w:p/>
@@ -34,8 +90,13 @@
         </w:rPr>
         <w:t>​</w:t>
       </w:r>
-      <w:r>
-        <w:t xml:space="preserve">Asks : </w:t>
+      <w:proofErr w:type="spellStart"/>
+      <w:r>
+        <w:t>Asks</w:t>
+      </w:r>
+      <w:proofErr w:type="spellEnd"/>
+      <w:r>
+        <w:t xml:space="preserve"> : </w:t>
       </w:r>
       <w:r>
         <w:rPr>
@@ -62,7 +123,15 @@
         <w:t>​</w:t>
       </w:r>
       <w:r>
-        <w:t xml:space="preserve">Pourquoi les clients occasionnels devaient [devraient] prendre un abo. </w:t>
+        <w:t xml:space="preserve">Pourquoi les clients occasionnels devaient [devraient] prendre un </w:t>
+      </w:r>
+      <w:proofErr w:type="spellStart"/>
+      <w:r>
+        <w:t>abo</w:t>
+      </w:r>
+      <w:proofErr w:type="spellEnd"/>
+      <w:r>
+        <w:t xml:space="preserve">. </w:t>
       </w:r>
       <w:r>
         <w:rPr>
@@ -188,7 +257,15 @@
         <w:t>à</w:t>
       </w:r>
       <w:r>
-        <w:t xml:space="preserve"> l'abo.</w:t>
+        <w:t xml:space="preserve"> </w:t>
+      </w:r>
+      <w:proofErr w:type="spellStart"/>
+      <w:r>
+        <w:t>l'abo</w:t>
+      </w:r>
+      <w:proofErr w:type="spellEnd"/>
+      <w:r>
+        <w:t>.</w:t>
       </w:r>
     </w:p>
     <w:p>
@@ -313,8 +390,13 @@
       </w:r>
     </w:p>
     <w:p>
-      <w:r>
-        <w:t>Prepare : BDD CSV organis</w:t>
+      <w:proofErr w:type="spellStart"/>
+      <w:r>
+        <w:t>Prepare</w:t>
+      </w:r>
+      <w:proofErr w:type="spellEnd"/>
+      <w:r>
+        <w:t xml:space="preserve"> : BDD CSV organis</w:t>
       </w:r>
       <w:r>
         <w:rPr>
@@ -341,7 +423,15 @@
         <w:t>à</w:t>
       </w:r>
       <w:r>
-        <w:t xml:space="preserve"> Excel de pr</w:t>
+        <w:t xml:space="preserve"> Excel </w:t>
+      </w:r>
+      <w:proofErr w:type="gramStart"/>
+      <w:r>
+        <w:t>de</w:t>
+      </w:r>
+      <w:proofErr w:type="gramEnd"/>
+      <w:r>
+        <w:t xml:space="preserve"> pr</w:t>
       </w:r>
       <w:r>
         <w:rPr>
@@ -368,16 +458,32 @@
         <w:t>​</w:t>
       </w:r>
       <w:r>
-        <w:t>\rightarrow Je pars du principe que la base de donn</w:t>
-      </w:r>
-      <w:r>
-        <w:rPr>
-          <w:rFonts w:ascii="Aptos" w:hAnsi="Aptos" w:cs="Aptos"/>
-        </w:rPr>
-        <w:t>é</w:t>
-      </w:r>
-      <w:r>
-        <w:t>e est bien stock</w:t>
+        <w:t>\</w:t>
+      </w:r>
+      <w:proofErr w:type="spellStart"/>
+      <w:r>
+        <w:t>rightarrow</w:t>
+      </w:r>
+      <w:proofErr w:type="spellEnd"/>
+      <w:r>
+        <w:t xml:space="preserve"> Je pars du principe que la base de </w:t>
+      </w:r>
+      <w:proofErr w:type="gramStart"/>
+      <w:r>
+        <w:t>donn</w:t>
+      </w:r>
+      <w:r>
+        <w:rPr>
+          <w:rFonts w:ascii="Aptos" w:hAnsi="Aptos" w:cs="Aptos"/>
+        </w:rPr>
+        <w:t>é</w:t>
+      </w:r>
+      <w:r>
+        <w:t>e</w:t>
+      </w:r>
+      <w:proofErr w:type="gramEnd"/>
+      <w:r>
+        <w:t xml:space="preserve"> est bien stock</w:t>
       </w:r>
       <w:r>
         <w:rPr>
@@ -440,16 +546,24 @@
         <w:t>é</w:t>
       </w:r>
       <w:r>
-        <w:t>quent. [fr</w:t>
-      </w:r>
-      <w:r>
-        <w:rPr>
-          <w:rFonts w:ascii="Aptos" w:hAnsi="Aptos" w:cs="Aptos"/>
-        </w:rPr>
-        <w:t>é</w:t>
-      </w:r>
-      <w:r>
-        <w:t xml:space="preserve">quentation] et les habitudes des clients. </w:t>
+        <w:t>quent. [</w:t>
+      </w:r>
+      <w:proofErr w:type="gramStart"/>
+      <w:r>
+        <w:t>fr</w:t>
+      </w:r>
+      <w:r>
+        <w:rPr>
+          <w:rFonts w:ascii="Aptos" w:hAnsi="Aptos" w:cs="Aptos"/>
+        </w:rPr>
+        <w:t>é</w:t>
+      </w:r>
+      <w:r>
+        <w:t>quentation</w:t>
+      </w:r>
+      <w:proofErr w:type="gramEnd"/>
+      <w:r>
+        <w:t xml:space="preserve">] et les habitudes des clients. </w:t>
       </w:r>
       <w:r>
         <w:rPr>
@@ -467,7 +581,11 @@
         <w:t>​</w:t>
       </w:r>
       <w:r>
-        <w:t>Supprimer les entr</w:t>
+        <w:t xml:space="preserve">Supprimer </w:t>
+      </w:r>
+      <w:proofErr w:type="gramStart"/>
+      <w:r>
+        <w:t>les entr</w:t>
       </w:r>
       <w:r>
         <w:rPr>
@@ -485,60 +603,61 @@
         <w:t>è</w:t>
       </w:r>
       <w:r>
-        <w:t>te en filtrant les colonnes</w:t>
-      </w:r>
-      <w:r>
-        <w:t>, erreur de ma part, ne pas avoir croisé les ID des bornes avec les nom des station, ce qu iasurement supprimé des milliers de lignes utiles</w:t>
+        <w:t>te</w:t>
+      </w:r>
+      <w:proofErr w:type="gramEnd"/>
+      <w:r>
+        <w:t xml:space="preserve"> en filtrant les colonnes</w:t>
+      </w:r>
+      <w:r>
+        <w:t xml:space="preserve">, erreur de ma part, ne pas avoir croisé les ID des bornes avec les nom des station, ce </w:t>
+      </w:r>
+      <w:proofErr w:type="spellStart"/>
+      <w:r>
+        <w:t>qu</w:t>
+      </w:r>
+      <w:proofErr w:type="spellEnd"/>
+      <w:r>
+        <w:t xml:space="preserve"> </w:t>
+      </w:r>
+      <w:proofErr w:type="spellStart"/>
+      <w:r>
+        <w:t>iasurement</w:t>
+      </w:r>
+      <w:proofErr w:type="spellEnd"/>
+      <w:r>
+        <w:t xml:space="preserve"> supprimé des milliers de lignes utiles</w:t>
       </w:r>
     </w:p>
     <w:p/>
     <w:p>
       <w:r>
-        <w:t>Mettre le format de scellule en  [H] :mm</w:t>
+        <w:t xml:space="preserve">Mettre le format de </w:t>
+      </w:r>
+      <w:proofErr w:type="spellStart"/>
+      <w:r>
+        <w:t>scellule</w:t>
+      </w:r>
+      <w:proofErr w:type="spellEnd"/>
+      <w:r>
+        <w:t xml:space="preserve"> </w:t>
+      </w:r>
+      <w:proofErr w:type="gramStart"/>
+      <w:r>
+        <w:t>en  [</w:t>
+      </w:r>
+      <w:proofErr w:type="gramEnd"/>
+      <w:r>
+        <w:t>H] :mm</w:t>
       </w:r>
     </w:p>
     <w:p/>
+    <w:p>
+      <w:r>
+        <w:t>https://github.com/git-lfs/git-lfs#getting-started</w:t>
+      </w:r>
+    </w:p>
     <w:p/>
-    <w:p>
-      <w:r>
-        <w:lastRenderedPageBreak/>
-        <w:drawing>
-          <wp:inline distT="0" distB="0" distL="0" distR="0" wp14:anchorId="5A8B0183" wp14:editId="15723529">
-            <wp:extent cx="5760720" cy="5194300"/>
-            <wp:effectExtent l="0" t="0" r="0" b="6350"/>
-            <wp:docPr id="1" name="Image 1"/>
-            <wp:cNvGraphicFramePr>
-              <a:graphicFrameLocks xmlns:a="http://schemas.openxmlformats.org/drawingml/2006/main" noChangeAspect="1"/>
-            </wp:cNvGraphicFramePr>
-            <a:graphic xmlns:a="http://schemas.openxmlformats.org/drawingml/2006/main">
-              <a:graphicData uri="http://schemas.openxmlformats.org/drawingml/2006/picture">
-                <pic:pic xmlns:pic="http://schemas.openxmlformats.org/drawingml/2006/picture">
-                  <pic:nvPicPr>
-                    <pic:cNvPr id="1" name=""/>
-                    <pic:cNvPicPr/>
-                  </pic:nvPicPr>
-                  <pic:blipFill>
-                    <a:blip r:embed="rId4"/>
-                    <a:stretch>
-                      <a:fillRect/>
-                    </a:stretch>
-                  </pic:blipFill>
-                  <pic:spPr>
-                    <a:xfrm>
-                      <a:off x="0" y="0"/>
-                      <a:ext cx="5760720" cy="5194300"/>
-                    </a:xfrm>
-                    <a:prstGeom prst="rect">
-                      <a:avLst/>
-                    </a:prstGeom>
-                  </pic:spPr>
-                </pic:pic>
-              </a:graphicData>
-            </a:graphic>
-          </wp:inline>
-        </w:drawing>
-      </w:r>
-    </w:p>
     <w:sectPr>
       <w:pgSz w:w="11906" w:h="16838"/>
       <w:pgMar w:top="1417" w:right="1417" w:bottom="1417" w:left="1417" w:header="708" w:footer="708" w:gutter="0"/>

</xml_diff>

<commit_message>
rectification liste des stations, affinage des resultats, debugage, et mise en page de ma procedure detaillee du document word etude de cas
</commit_message>
<xml_diff>
--- a/Velo en libre service/Détails_étude_de_cas_Cyclistic.docx
+++ b/Velo en libre service/Détails_étude_de_cas_Cyclistic.docx
@@ -3,660 +3,1601 @@
 <w:document xmlns:wpc="http://schemas.microsoft.com/office/word/2010/wordprocessingCanvas" xmlns:cx="http://schemas.microsoft.com/office/drawing/2014/chartex" xmlns:cx1="http://schemas.microsoft.com/office/drawing/2015/9/8/chartex" xmlns:cx2="http://schemas.microsoft.com/office/drawing/2015/10/21/chartex" xmlns:cx3="http://schemas.microsoft.com/office/drawing/2016/5/9/chartex" xmlns:cx4="http://schemas.microsoft.com/office/drawing/2016/5/10/chartex" xmlns:cx5="http://schemas.microsoft.com/office/drawing/2016/5/11/chartex" xmlns:cx6="http://schemas.microsoft.com/office/drawing/2016/5/12/chartex" xmlns:cx7="http://schemas.microsoft.com/office/drawing/2016/5/13/chartex" xmlns:cx8="http://schemas.microsoft.com/office/drawing/2016/5/14/chartex" xmlns:mc="http://schemas.openxmlformats.org/markup-compatibility/2006" xmlns:aink="http://schemas.microsoft.com/office/drawing/2016/ink" xmlns:am3d="http://schemas.microsoft.com/office/drawing/2017/model3d" xmlns:o="urn:schemas-microsoft-com:office:office" xmlns:oel="http://schemas.microsoft.com/office/2019/extlst" xmlns:r="http://schemas.openxmlformats.org/officeDocument/2006/relationships" xmlns:m="http://schemas.openxmlformats.org/officeDocument/2006/math" xmlns:v="urn:schemas-microsoft-com:vml" xmlns:wp14="http://schemas.microsoft.com/office/word/2010/wordprocessingDrawing" xmlns:wp="http://schemas.openxmlformats.org/drawingml/2006/wordprocessingDrawing" xmlns:w10="urn:schemas-microsoft-com:office:word" xmlns:w="http://schemas.openxmlformats.org/wordprocessingml/2006/main" xmlns:w14="http://schemas.microsoft.com/office/word/2010/wordml" xmlns:w15="http://schemas.microsoft.com/office/word/2012/wordml" xmlns:w16cex="http://schemas.microsoft.com/office/word/2018/wordml/cex" xmlns:w16cid="http://schemas.microsoft.com/office/word/2016/wordml/cid" xmlns:w16="http://schemas.microsoft.com/office/word/2018/wordml" xmlns:w16sdtdh="http://schemas.microsoft.com/office/word/2020/wordml/sdtdatahash" xmlns:w16se="http://schemas.microsoft.com/office/word/2015/wordml/symex" xmlns:wpg="http://schemas.microsoft.com/office/word/2010/wordprocessingGroup" xmlns:wpi="http://schemas.microsoft.com/office/word/2010/wordprocessingInk" xmlns:wne="http://schemas.microsoft.com/office/word/2006/wordml" xmlns:wps="http://schemas.microsoft.com/office/word/2010/wordprocessingShape" mc:Ignorable="w14 w15 w16se w16cid w16 w16cex w16sdtdh wp14">
   <w:body>
     <w:p>
-      <w:r>
-        <w:t>Importation des données.</w:t>
-      </w:r>
-    </w:p>
-    <w:p>
-      <w:r>
-        <w:t xml:space="preserve">Transformation des fichiers csv en base de données </w:t>
-      </w:r>
-      <w:proofErr w:type="spellStart"/>
-      <w:r>
-        <w:t>Mysql</w:t>
-      </w:r>
-      <w:proofErr w:type="spellEnd"/>
-      <w:r>
-        <w:t xml:space="preserve"> via l’option « Table data import </w:t>
-      </w:r>
-      <w:proofErr w:type="spellStart"/>
-      <w:r>
-        <w:t>wizard</w:t>
-      </w:r>
-      <w:proofErr w:type="spellEnd"/>
-      <w:r>
-        <w:t xml:space="preserve"> » </w:t>
-      </w:r>
-      <w:proofErr w:type="spellStart"/>
-      <w:r>
-        <w:t>Selectioin</w:t>
-      </w:r>
-      <w:proofErr w:type="spellEnd"/>
-      <w:r>
+      <w:pPr>
+        <w:jc w:val="center"/>
+        <w:rPr>
+          <w:b/>
+          <w:bCs/>
+          <w:sz w:val="36"/>
+          <w:szCs w:val="36"/>
+          <w:u w:val="single"/>
+        </w:rPr>
+      </w:pPr>
+      <w:r>
+        <w:rPr>
+          <w:b/>
+          <w:bCs/>
+          <w:sz w:val="36"/>
+          <w:szCs w:val="36"/>
+          <w:u w:val="single"/>
+        </w:rPr>
+        <w:t>Cas n°1 – Vélo</w:t>
+      </w:r>
+      <w:r>
+        <w:rPr>
+          <w:b/>
+          <w:bCs/>
+          <w:sz w:val="36"/>
+          <w:szCs w:val="36"/>
+          <w:u w:val="single"/>
+        </w:rPr>
+        <w:t xml:space="preserve"> ENONCE</w:t>
+      </w:r>
+    </w:p>
+    <w:p>
+      <w:pPr>
+        <w:rPr>
+          <w:b/>
+          <w:bCs/>
+        </w:rPr>
+      </w:pPr>
+      <w:r>
+        <w:rPr>
+          <w:b/>
+          <w:bCs/>
+        </w:rPr>
         <w:t xml:space="preserve"> </w:t>
       </w:r>
-      <w:proofErr w:type="gramStart"/>
-      <w:r>
-        <w:t>des type</w:t>
-      </w:r>
-      <w:proofErr w:type="gramEnd"/>
-      <w:r>
-        <w:t xml:space="preserve"> de données par entrée, ne pas </w:t>
-      </w:r>
-      <w:proofErr w:type="spellStart"/>
-      <w:r>
-        <w:t>selectionner</w:t>
-      </w:r>
-      <w:proofErr w:type="spellEnd"/>
-      <w:r>
-        <w:t xml:space="preserve"> les données </w:t>
-      </w:r>
-      <w:proofErr w:type="spellStart"/>
-      <w:r>
-        <w:t>intulie</w:t>
-      </w:r>
-      <w:proofErr w:type="spellEnd"/>
-      <w:r>
-        <w:t xml:space="preserve"> du type « </w:t>
-      </w:r>
-      <w:proofErr w:type="spellStart"/>
-      <w:r>
-        <w:t>Coordionées</w:t>
-      </w:r>
-      <w:proofErr w:type="spellEnd"/>
-      <w:r>
-        <w:t xml:space="preserve"> GPS des stations de début et de fin »</w:t>
+      <w:r>
+        <w:rPr>
+          <w:rFonts w:ascii="Arial" w:hAnsi="Arial" w:cs="Arial"/>
+          <w:b/>
+          <w:bCs/>
+        </w:rPr>
+        <w:t>​</w:t>
+      </w:r>
+      <w:r>
+        <w:rPr>
+          <w:b/>
+          <w:bCs/>
+        </w:rPr>
+        <w:t>Comment les clients r</w:t>
+      </w:r>
+      <w:r>
+        <w:rPr>
+          <w:rFonts w:ascii="Aptos" w:hAnsi="Aptos" w:cs="Aptos"/>
+          <w:b/>
+          <w:bCs/>
+        </w:rPr>
+        <w:t>é</w:t>
+      </w:r>
+      <w:r>
+        <w:rPr>
+          <w:b/>
+          <w:bCs/>
+        </w:rPr>
+        <w:t xml:space="preserve">guliers et clients occasionnels roulent. </w:t>
+      </w:r>
+      <w:r>
+        <w:rPr>
+          <w:rFonts w:ascii="Arial" w:hAnsi="Arial" w:cs="Arial"/>
+          <w:b/>
+          <w:bCs/>
+        </w:rPr>
+        <w:t>​</w:t>
+      </w:r>
+      <w:r>
+        <w:rPr>
+          <w:b/>
+          <w:bCs/>
+        </w:rPr>
+        <w:t xml:space="preserve">Pourquoi les clients occasionnels devaient [devraient] prendre un abo. </w:t>
+      </w:r>
+      <w:r>
+        <w:rPr>
+          <w:rFonts w:ascii="Arial" w:hAnsi="Arial" w:cs="Arial"/>
+          <w:b/>
+          <w:bCs/>
+        </w:rPr>
+        <w:t>​</w:t>
+      </w:r>
+      <w:r>
+        <w:rPr>
+          <w:b/>
+          <w:bCs/>
+        </w:rPr>
+        <w:t>donn</w:t>
+      </w:r>
+      <w:r>
+        <w:rPr>
+          <w:rFonts w:ascii="Aptos" w:hAnsi="Aptos" w:cs="Aptos"/>
+          <w:b/>
+          <w:bCs/>
+        </w:rPr>
+        <w:t>é</w:t>
+      </w:r>
+      <w:r>
+        <w:rPr>
+          <w:b/>
+          <w:bCs/>
+        </w:rPr>
+        <w:t>es utilis</w:t>
+      </w:r>
+      <w:r>
+        <w:rPr>
+          <w:rFonts w:ascii="Aptos" w:hAnsi="Aptos" w:cs="Aptos"/>
+          <w:b/>
+          <w:bCs/>
+        </w:rPr>
+        <w:t>é</w:t>
+      </w:r>
+      <w:r>
+        <w:rPr>
+          <w:b/>
+          <w:bCs/>
+        </w:rPr>
+        <w:t>es : Fichier CSV des trajets comprenant ID du trajet, id et nom des stations de d</w:t>
+      </w:r>
+      <w:r>
+        <w:rPr>
+          <w:rFonts w:ascii="Aptos" w:hAnsi="Aptos" w:cs="Aptos"/>
+          <w:b/>
+          <w:bCs/>
+        </w:rPr>
+        <w:t>é</w:t>
+      </w:r>
+      <w:r>
+        <w:rPr>
+          <w:b/>
+          <w:bCs/>
+        </w:rPr>
+        <w:t>part et d'arriv</w:t>
+      </w:r>
+      <w:r>
+        <w:rPr>
+          <w:rFonts w:ascii="Aptos" w:hAnsi="Aptos" w:cs="Aptos"/>
+          <w:b/>
+          <w:bCs/>
+        </w:rPr>
+        <w:t>é</w:t>
+      </w:r>
+      <w:r>
+        <w:rPr>
+          <w:b/>
+          <w:bCs/>
+        </w:rPr>
+        <w:t>e, date et heure de d</w:t>
+      </w:r>
+      <w:r>
+        <w:rPr>
+          <w:rFonts w:ascii="Aptos" w:hAnsi="Aptos" w:cs="Aptos"/>
+          <w:b/>
+          <w:bCs/>
+        </w:rPr>
+        <w:t>é</w:t>
+      </w:r>
+      <w:r>
+        <w:rPr>
+          <w:b/>
+          <w:bCs/>
+        </w:rPr>
+        <w:t>part et d'arriv</w:t>
+      </w:r>
+      <w:r>
+        <w:rPr>
+          <w:rFonts w:ascii="Aptos" w:hAnsi="Aptos" w:cs="Aptos"/>
+          <w:b/>
+          <w:bCs/>
+        </w:rPr>
+        <w:t>é</w:t>
+      </w:r>
+      <w:r>
+        <w:rPr>
+          <w:b/>
+          <w:bCs/>
+        </w:rPr>
+        <w:t>e, client R</w:t>
+      </w:r>
+      <w:r>
+        <w:rPr>
+          <w:rFonts w:ascii="Aptos" w:hAnsi="Aptos" w:cs="Aptos"/>
+          <w:b/>
+          <w:bCs/>
+        </w:rPr>
+        <w:t>é</w:t>
+      </w:r>
+      <w:r>
+        <w:rPr>
+          <w:b/>
+          <w:bCs/>
+        </w:rPr>
+        <w:t xml:space="preserve">gulier ou non. </w:t>
+      </w:r>
+      <w:r>
+        <w:rPr>
+          <w:rFonts w:ascii="Arial" w:hAnsi="Arial" w:cs="Arial"/>
+          <w:b/>
+          <w:bCs/>
+        </w:rPr>
+        <w:t>​</w:t>
+      </w:r>
+      <w:r>
+        <w:rPr>
+          <w:b/>
+          <w:bCs/>
+        </w:rPr>
+        <w:t>Probl</w:t>
+      </w:r>
+      <w:r>
+        <w:rPr>
+          <w:rFonts w:ascii="Aptos" w:hAnsi="Aptos" w:cs="Aptos"/>
+          <w:b/>
+          <w:bCs/>
+        </w:rPr>
+        <w:t>è</w:t>
+      </w:r>
+      <w:r>
+        <w:rPr>
+          <w:b/>
+          <w:bCs/>
+        </w:rPr>
+        <w:t xml:space="preserve">mes </w:t>
+      </w:r>
+      <w:r>
+        <w:rPr>
+          <w:rFonts w:ascii="Aptos" w:hAnsi="Aptos" w:cs="Aptos"/>
+          <w:b/>
+          <w:bCs/>
+        </w:rPr>
+        <w:t>à</w:t>
+      </w:r>
+      <w:r>
+        <w:rPr>
+          <w:b/>
+          <w:bCs/>
+        </w:rPr>
+        <w:t xml:space="preserve"> r</w:t>
+      </w:r>
+      <w:r>
+        <w:rPr>
+          <w:rFonts w:ascii="Aptos" w:hAnsi="Aptos" w:cs="Aptos"/>
+          <w:b/>
+          <w:bCs/>
+        </w:rPr>
+        <w:t>é</w:t>
+      </w:r>
+      <w:r>
+        <w:rPr>
+          <w:b/>
+          <w:bCs/>
+        </w:rPr>
+        <w:t xml:space="preserve">soudre : </w:t>
+      </w:r>
+      <w:r>
+        <w:rPr>
+          <w:rFonts w:ascii="Arial" w:hAnsi="Arial" w:cs="Arial"/>
+          <w:b/>
+          <w:bCs/>
+        </w:rPr>
+        <w:t>​</w:t>
+      </w:r>
+      <w:r>
+        <w:rPr>
+          <w:b/>
+          <w:bCs/>
+        </w:rPr>
+        <w:t xml:space="preserve">Faire passer de l'occasionnel </w:t>
+      </w:r>
+      <w:r>
+        <w:rPr>
+          <w:rFonts w:ascii="Aptos" w:hAnsi="Aptos" w:cs="Aptos"/>
+          <w:b/>
+          <w:bCs/>
+        </w:rPr>
+        <w:t>à</w:t>
+      </w:r>
+      <w:r>
+        <w:rPr>
+          <w:b/>
+          <w:bCs/>
+        </w:rPr>
+        <w:t xml:space="preserve"> l'abo.</w:t>
+      </w:r>
+    </w:p>
+    <w:p>
+      <w:pPr>
+        <w:rPr>
+          <w:rFonts w:ascii="Arial" w:hAnsi="Arial" w:cs="Arial"/>
+          <w:b/>
+          <w:bCs/>
+        </w:rPr>
+      </w:pPr>
+      <w:r>
+        <w:rPr>
+          <w:b/>
+          <w:bCs/>
+        </w:rPr>
+        <w:t xml:space="preserve"> </w:t>
+      </w:r>
+      <w:r>
+        <w:rPr>
+          <w:rFonts w:ascii="Arial" w:hAnsi="Arial" w:cs="Arial"/>
+          <w:b/>
+          <w:bCs/>
+        </w:rPr>
+        <w:t>​</w:t>
+      </w:r>
+      <w:r>
+        <w:rPr>
+          <w:b/>
+          <w:bCs/>
+        </w:rPr>
+        <w:t>Miser sur les endroits les plus demand</w:t>
+      </w:r>
+      <w:r>
+        <w:rPr>
+          <w:rFonts w:ascii="Aptos" w:hAnsi="Aptos" w:cs="Aptos"/>
+          <w:b/>
+          <w:bCs/>
+        </w:rPr>
+        <w:t>é</w:t>
+      </w:r>
+      <w:r>
+        <w:rPr>
+          <w:b/>
+          <w:bCs/>
+        </w:rPr>
+        <w:t>s en v</w:t>
+      </w:r>
+      <w:r>
+        <w:rPr>
+          <w:rFonts w:ascii="Aptos" w:hAnsi="Aptos" w:cs="Aptos"/>
+          <w:b/>
+          <w:bCs/>
+        </w:rPr>
+        <w:t>é</w:t>
+      </w:r>
+      <w:r>
+        <w:rPr>
+          <w:b/>
+          <w:bCs/>
+        </w:rPr>
+        <w:t xml:space="preserve">lo. </w:t>
+      </w:r>
+      <w:r>
+        <w:rPr>
+          <w:rFonts w:ascii="Arial" w:hAnsi="Arial" w:cs="Arial"/>
+          <w:b/>
+          <w:bCs/>
+        </w:rPr>
+        <w:t>​</w:t>
+      </w:r>
+      <w:r>
+        <w:rPr>
+          <w:b/>
+          <w:bCs/>
+        </w:rPr>
+        <w:t>Investir dans de v</w:t>
+      </w:r>
+      <w:r>
+        <w:rPr>
+          <w:rFonts w:ascii="Aptos" w:hAnsi="Aptos" w:cs="Aptos"/>
+          <w:b/>
+          <w:bCs/>
+        </w:rPr>
+        <w:t>é</w:t>
+      </w:r>
+      <w:r>
+        <w:rPr>
+          <w:b/>
+          <w:bCs/>
+        </w:rPr>
+        <w:t>lo classique/</w:t>
+      </w:r>
+      <w:r>
+        <w:rPr>
+          <w:rFonts w:ascii="Aptos" w:hAnsi="Aptos" w:cs="Aptos"/>
+          <w:b/>
+          <w:bCs/>
+        </w:rPr>
+        <w:t>é</w:t>
+      </w:r>
+      <w:r>
+        <w:rPr>
+          <w:b/>
+          <w:bCs/>
+        </w:rPr>
+        <w:t xml:space="preserve">lectrique selon la demande. </w:t>
+      </w:r>
+      <w:r>
+        <w:rPr>
+          <w:rFonts w:ascii="Arial" w:hAnsi="Arial" w:cs="Arial"/>
+          <w:b/>
+          <w:bCs/>
+        </w:rPr>
+        <w:t>​</w:t>
+      </w:r>
+      <w:r>
+        <w:rPr>
+          <w:rFonts w:ascii="Aptos" w:hAnsi="Aptos" w:cs="Aptos"/>
+          <w:b/>
+          <w:bCs/>
+        </w:rPr>
+        <w:t>É</w:t>
+      </w:r>
+      <w:r>
+        <w:rPr>
+          <w:b/>
+          <w:bCs/>
+        </w:rPr>
+        <w:t>nonc</w:t>
+      </w:r>
+      <w:r>
+        <w:rPr>
+          <w:rFonts w:ascii="Aptos" w:hAnsi="Aptos" w:cs="Aptos"/>
+          <w:b/>
+          <w:bCs/>
+        </w:rPr>
+        <w:t>é</w:t>
+      </w:r>
+      <w:r>
+        <w:rPr>
+          <w:b/>
+          <w:bCs/>
+        </w:rPr>
+        <w:t xml:space="preserve"> clair : Comprendre les habitudes des clients et la fr</w:t>
+      </w:r>
+      <w:r>
+        <w:rPr>
+          <w:rFonts w:ascii="Aptos" w:hAnsi="Aptos" w:cs="Aptos"/>
+          <w:b/>
+          <w:bCs/>
+        </w:rPr>
+        <w:t>é</w:t>
+      </w:r>
+      <w:r>
+        <w:rPr>
+          <w:b/>
+          <w:bCs/>
+        </w:rPr>
+        <w:t>quentation des stations, pour offrir la meilleure gamme de service (V</w:t>
+      </w:r>
+      <w:r>
+        <w:rPr>
+          <w:rFonts w:ascii="Aptos" w:hAnsi="Aptos" w:cs="Aptos"/>
+          <w:b/>
+          <w:bCs/>
+        </w:rPr>
+        <w:t>é</w:t>
+      </w:r>
+      <w:r>
+        <w:rPr>
+          <w:b/>
+          <w:bCs/>
+        </w:rPr>
+        <w:t xml:space="preserve">lo </w:t>
+      </w:r>
+      <w:r>
+        <w:rPr>
+          <w:rFonts w:ascii="Aptos" w:hAnsi="Aptos" w:cs="Aptos"/>
+          <w:b/>
+          <w:bCs/>
+        </w:rPr>
+        <w:t>é</w:t>
+      </w:r>
+      <w:r>
+        <w:rPr>
+          <w:b/>
+          <w:bCs/>
+        </w:rPr>
+        <w:t xml:space="preserve">lectrique ou classique). </w:t>
+      </w:r>
+      <w:r>
+        <w:rPr>
+          <w:rFonts w:ascii="Arial" w:hAnsi="Arial" w:cs="Arial"/>
+          <w:b/>
+          <w:bCs/>
+        </w:rPr>
+        <w:t>​</w:t>
+      </w:r>
+    </w:p>
+    <w:p>
+      <w:pPr>
+        <w:rPr>
+          <w:rFonts w:ascii="Arial" w:hAnsi="Arial" w:cs="Arial"/>
+        </w:rPr>
+      </w:pPr>
+    </w:p>
+    <w:p>
+      <w:pPr>
+        <w:rPr>
+          <w:rFonts w:ascii="Arial" w:hAnsi="Arial" w:cs="Arial"/>
+        </w:rPr>
+      </w:pPr>
+    </w:p>
+    <w:p>
+      <w:r>
+        <w:t>BDD CSV organis</w:t>
+      </w:r>
+      <w:r>
+        <w:rPr>
+          <w:rFonts w:ascii="Aptos" w:hAnsi="Aptos" w:cs="Aptos"/>
+        </w:rPr>
+        <w:t>é</w:t>
+      </w:r>
+      <w:r>
+        <w:t>e en 12 feuilles repr</w:t>
+      </w:r>
+      <w:r>
+        <w:rPr>
+          <w:rFonts w:ascii="Aptos" w:hAnsi="Aptos" w:cs="Aptos"/>
+        </w:rPr>
+        <w:t>é</w:t>
+      </w:r>
+      <w:r>
+        <w:t xml:space="preserve">sentant 12 mois </w:t>
+      </w:r>
+      <w:r>
+        <w:t xml:space="preserve">(de 01-2025 à 12-2025) </w:t>
+      </w:r>
+      <w:r>
+        <w:rPr>
+          <w:rFonts w:ascii="Arial" w:hAnsi="Arial" w:cs="Arial"/>
+        </w:rPr>
+        <w:t>​</w:t>
+      </w:r>
+      <w:r>
+        <w:t xml:space="preserve"> Je pars du principe que la base de </w:t>
+      </w:r>
+      <w:r>
+        <w:t>donn</w:t>
+      </w:r>
+      <w:r>
+        <w:rPr>
+          <w:rFonts w:ascii="Aptos" w:hAnsi="Aptos" w:cs="Aptos"/>
+        </w:rPr>
+        <w:t>é</w:t>
+      </w:r>
+      <w:r>
+        <w:t>es</w:t>
+      </w:r>
+      <w:r>
+        <w:t xml:space="preserve"> est bien stock</w:t>
+      </w:r>
+      <w:r>
+        <w:rPr>
+          <w:rFonts w:ascii="Aptos" w:hAnsi="Aptos" w:cs="Aptos"/>
+        </w:rPr>
+        <w:t>é</w:t>
+      </w:r>
+      <w:r>
+        <w:t>e et s</w:t>
+      </w:r>
+      <w:r>
+        <w:rPr>
+          <w:rFonts w:ascii="Aptos" w:hAnsi="Aptos" w:cs="Aptos"/>
+        </w:rPr>
+        <w:t>é</w:t>
+      </w:r>
+      <w:r>
+        <w:t>curis</w:t>
+      </w:r>
+      <w:r>
+        <w:rPr>
+          <w:rFonts w:ascii="Aptos" w:hAnsi="Aptos" w:cs="Aptos"/>
+        </w:rPr>
+        <w:t>é</w:t>
+      </w:r>
+      <w:r>
+        <w:t xml:space="preserve">e et accessible. </w:t>
+      </w:r>
+      <w:r>
+        <w:rPr>
+          <w:rFonts w:ascii="Arial" w:hAnsi="Arial" w:cs="Arial"/>
+        </w:rPr>
+        <w:t>​</w:t>
+      </w:r>
+      <w:r>
+        <w:t>Les donnes vont me donner des r</w:t>
+      </w:r>
+      <w:r>
+        <w:rPr>
+          <w:rFonts w:ascii="Aptos" w:hAnsi="Aptos" w:cs="Aptos"/>
+        </w:rPr>
+        <w:t>é</w:t>
+      </w:r>
+      <w:r>
+        <w:t>ponses sur la</w:t>
+      </w:r>
+      <w:r>
+        <w:t xml:space="preserve"> </w:t>
+      </w:r>
+      <w:r>
+        <w:t>fr</w:t>
+      </w:r>
+      <w:r>
+        <w:rPr>
+          <w:rFonts w:ascii="Aptos" w:hAnsi="Aptos" w:cs="Aptos"/>
+        </w:rPr>
+        <w:t>é</w:t>
+      </w:r>
+      <w:r>
+        <w:t xml:space="preserve">quentation et les habitudes des clients. </w:t>
+      </w:r>
+      <w:r>
+        <w:rPr>
+          <w:rFonts w:ascii="Arial" w:hAnsi="Arial" w:cs="Arial"/>
+        </w:rPr>
+        <w:t>​</w:t>
+      </w:r>
+      <w:r>
+        <w:t xml:space="preserve">PB avec Data : Data manquantes, erronées ou absentes. </w:t>
+      </w:r>
+      <w:r>
+        <w:rPr>
+          <w:rFonts w:ascii="Arial" w:hAnsi="Arial" w:cs="Arial"/>
+        </w:rPr>
+        <w:t>​</w:t>
+      </w:r>
+      <w:r>
+        <w:t xml:space="preserve">Supprimer </w:t>
+      </w:r>
+      <w:r>
+        <w:t>les entr</w:t>
+      </w:r>
+      <w:r>
+        <w:rPr>
+          <w:rFonts w:ascii="Aptos" w:hAnsi="Aptos" w:cs="Aptos"/>
+        </w:rPr>
+        <w:t>é</w:t>
+      </w:r>
+      <w:r>
+        <w:t>es incompl</w:t>
+      </w:r>
+      <w:r>
+        <w:rPr>
+          <w:rFonts w:ascii="Aptos" w:hAnsi="Aptos" w:cs="Aptos"/>
+        </w:rPr>
+        <w:t>è</w:t>
+      </w:r>
+      <w:r>
+        <w:t>tes</w:t>
+      </w:r>
+      <w:r>
+        <w:t xml:space="preserve"> en filtrant les colonnes</w:t>
+      </w:r>
+      <w:r>
+        <w:t>, erreur de ma part</w:t>
+      </w:r>
+      <w:r>
+        <w:t>.</w:t>
+      </w:r>
+    </w:p>
+    <w:p>
+      <w:r>
+        <w:t>Suppression</w:t>
+      </w:r>
+      <w:r>
+        <w:t xml:space="preserve"> des feuilles de calcul représentant les année 2023 et 2024 par soucis de vitesse de lenteur (voir de plantage) de l’application </w:t>
+      </w:r>
+      <w:r>
+        <w:t>Excel</w:t>
+      </w:r>
+      <w:r>
+        <w:t xml:space="preserve"> sur mon ordinateur à chaque nouvelle formules insérées.</w:t>
       </w:r>
     </w:p>
     <w:p/>
     <w:p>
-      <w:r>
-        <w:t xml:space="preserve">Cas n°1 </w:t>
-      </w:r>
-      <w:r>
-        <w:t>–</w:t>
-      </w:r>
-      <w:r>
-        <w:t xml:space="preserve"> Vélo</w:t>
-      </w:r>
-    </w:p>
-    <w:p>
-      <w:r>
+      <w:pPr>
+        <w:pStyle w:val="Paragraphedeliste"/>
+        <w:ind w:left="405"/>
+        <w:rPr>
+          <w:b/>
+          <w:bCs/>
+          <w:u w:val="single"/>
+        </w:rPr>
+      </w:pPr>
+      <w:r>
+        <w:rPr>
+          <w:b/>
+          <w:bCs/>
+          <w:u w:val="single"/>
+        </w:rPr>
+        <w:t xml:space="preserve">1 : </w:t>
+      </w:r>
+      <w:r>
+        <w:rPr>
+          <w:b/>
+          <w:bCs/>
+          <w:u w:val="single"/>
+        </w:rPr>
+        <w:t xml:space="preserve">Feuilles de calcul </w:t>
+      </w:r>
+      <w:r>
+        <w:rPr>
+          <w:b/>
+          <w:bCs/>
+          <w:u w:val="single"/>
+        </w:rPr>
         <w:t xml:space="preserve"> </w:t>
       </w:r>
       <w:r>
         <w:rPr>
-          <w:rFonts w:ascii="Arial" w:hAnsi="Arial" w:cs="Arial"/>
-        </w:rPr>
-        <w:t>​</w:t>
-      </w:r>
-      <w:proofErr w:type="spellStart"/>
-      <w:r>
-        <w:t>Asks</w:t>
-      </w:r>
-      <w:proofErr w:type="spellEnd"/>
-      <w:r>
-        <w:t xml:space="preserve"> : </w:t>
-      </w:r>
-      <w:r>
-        <w:rPr>
-          <w:rFonts w:ascii="Arial" w:hAnsi="Arial" w:cs="Arial"/>
-        </w:rPr>
-        <w:t>​</w:t>
-      </w:r>
-      <w:r>
-        <w:t>Comment les clients r</w:t>
-      </w:r>
-      <w:r>
-        <w:rPr>
-          <w:rFonts w:ascii="Aptos" w:hAnsi="Aptos" w:cs="Aptos"/>
-        </w:rPr>
-        <w:t>é</w:t>
-      </w:r>
-      <w:r>
-        <w:t xml:space="preserve">guliers et clients occasionnels roulent. </w:t>
-      </w:r>
-      <w:r>
-        <w:rPr>
-          <w:rFonts w:ascii="Arial" w:hAnsi="Arial" w:cs="Arial"/>
-        </w:rPr>
-        <w:t>​</w:t>
-      </w:r>
-      <w:r>
-        <w:t xml:space="preserve">Pourquoi les clients occasionnels devaient [devraient] prendre un </w:t>
-      </w:r>
-      <w:proofErr w:type="spellStart"/>
-      <w:r>
-        <w:t>abo</w:t>
-      </w:r>
-      <w:proofErr w:type="spellEnd"/>
-      <w:r>
-        <w:t xml:space="preserve">. </w:t>
-      </w:r>
-      <w:r>
-        <w:rPr>
-          <w:rFonts w:ascii="Arial" w:hAnsi="Arial" w:cs="Arial"/>
-        </w:rPr>
-        <w:t>​</w:t>
-      </w:r>
-      <w:r>
-        <w:t>donn</w:t>
-      </w:r>
-      <w:r>
-        <w:rPr>
-          <w:rFonts w:ascii="Aptos" w:hAnsi="Aptos" w:cs="Aptos"/>
-        </w:rPr>
-        <w:t>é</w:t>
-      </w:r>
-      <w:r>
-        <w:t>es utilis</w:t>
-      </w:r>
-      <w:r>
-        <w:rPr>
-          <w:rFonts w:ascii="Aptos" w:hAnsi="Aptos" w:cs="Aptos"/>
-        </w:rPr>
-        <w:t>é</w:t>
-      </w:r>
-      <w:r>
-        <w:t>es : Fichier CSV des trajets comprenant ID du trajet, id et nom des stations de d</w:t>
-      </w:r>
-      <w:r>
-        <w:rPr>
-          <w:rFonts w:ascii="Aptos" w:hAnsi="Aptos" w:cs="Aptos"/>
-        </w:rPr>
-        <w:t>é</w:t>
-      </w:r>
-      <w:r>
-        <w:t>part et d'arriv</w:t>
-      </w:r>
-      <w:r>
-        <w:rPr>
-          <w:rFonts w:ascii="Aptos" w:hAnsi="Aptos" w:cs="Aptos"/>
-        </w:rPr>
-        <w:t>é</w:t>
-      </w:r>
-      <w:r>
-        <w:t>e, date et heure de d</w:t>
-      </w:r>
-      <w:r>
-        <w:rPr>
-          <w:rFonts w:ascii="Aptos" w:hAnsi="Aptos" w:cs="Aptos"/>
-        </w:rPr>
-        <w:t>é</w:t>
-      </w:r>
-      <w:r>
-        <w:t>part et d'arriv</w:t>
-      </w:r>
-      <w:r>
-        <w:rPr>
-          <w:rFonts w:ascii="Aptos" w:hAnsi="Aptos" w:cs="Aptos"/>
-        </w:rPr>
-        <w:t>é</w:t>
-      </w:r>
-      <w:r>
-        <w:t>e, client R</w:t>
-      </w:r>
-      <w:r>
-        <w:rPr>
-          <w:rFonts w:ascii="Aptos" w:hAnsi="Aptos" w:cs="Aptos"/>
-        </w:rPr>
-        <w:t>é</w:t>
-      </w:r>
-      <w:r>
-        <w:t xml:space="preserve">gulier ou non. </w:t>
-      </w:r>
-      <w:r>
-        <w:rPr>
-          <w:rFonts w:ascii="Arial" w:hAnsi="Arial" w:cs="Arial"/>
-        </w:rPr>
-        <w:t>​</w:t>
-      </w:r>
-      <w:r>
-        <w:t>Probl</w:t>
-      </w:r>
-      <w:r>
-        <w:rPr>
-          <w:rFonts w:ascii="Aptos" w:hAnsi="Aptos" w:cs="Aptos"/>
-        </w:rPr>
-        <w:t>è</w:t>
-      </w:r>
-      <w:r>
-        <w:t xml:space="preserve">mes </w:t>
-      </w:r>
-      <w:r>
-        <w:rPr>
-          <w:rFonts w:ascii="Aptos" w:hAnsi="Aptos" w:cs="Aptos"/>
-        </w:rPr>
-        <w:t>à</w:t>
-      </w:r>
-      <w:r>
-        <w:t xml:space="preserve"> r</w:t>
-      </w:r>
-      <w:r>
-        <w:rPr>
-          <w:rFonts w:ascii="Aptos" w:hAnsi="Aptos" w:cs="Aptos"/>
-        </w:rPr>
-        <w:t>é</w:t>
-      </w:r>
-      <w:r>
-        <w:t xml:space="preserve">soudre : </w:t>
-      </w:r>
-      <w:r>
-        <w:rPr>
-          <w:rFonts w:ascii="Arial" w:hAnsi="Arial" w:cs="Arial"/>
-        </w:rPr>
-        <w:t>​</w:t>
-      </w:r>
-      <w:r>
-        <w:t xml:space="preserve">Faire passer de l'occasionnel </w:t>
-      </w:r>
-      <w:r>
-        <w:rPr>
-          <w:rFonts w:ascii="Aptos" w:hAnsi="Aptos" w:cs="Aptos"/>
-        </w:rPr>
-        <w:t>à</w:t>
+          <w:b/>
+          <w:bCs/>
+          <w:u w:val="single"/>
+        </w:rPr>
+        <w:t>« </w:t>
+      </w:r>
+      <w:r>
+        <w:rPr>
+          <w:b/>
+          <w:bCs/>
+          <w:u w:val="single"/>
+        </w:rPr>
+        <w:t>01 :12-2025</w:t>
+      </w:r>
+      <w:r>
+        <w:rPr>
+          <w:b/>
+          <w:bCs/>
+          <w:u w:val="single"/>
+        </w:rPr>
+        <w:t> »</w:t>
+      </w:r>
+    </w:p>
+    <w:p>
+      <w:pPr>
+        <w:pStyle w:val="Paragraphedeliste"/>
+        <w:ind w:left="405"/>
+      </w:pPr>
+    </w:p>
+    <w:p>
+      <w:pPr>
+        <w:pStyle w:val="Paragraphedeliste"/>
+        <w:numPr>
+          <w:ilvl w:val="0"/>
+          <w:numId w:val="1"/>
+        </w:numPr>
+      </w:pPr>
+      <w:r>
+        <w:t>Suppression des colone ID de la location (</w:t>
+      </w:r>
+      <w:r>
+        <w:t>ride_id</w:t>
+      </w:r>
+      <w:r>
+        <w:t>), coordonnée GPS de la station de départ</w:t>
+      </w:r>
+      <w:r>
+        <w:t xml:space="preserve"> (</w:t>
+      </w:r>
+      <w:r>
+        <w:t>start_lat</w:t>
+      </w:r>
+      <w:r>
+        <w:t xml:space="preserve"> ; </w:t>
+      </w:r>
+      <w:r>
+        <w:t>start_</w:t>
+      </w:r>
+      <w:r>
+        <w:t>lng)</w:t>
+      </w:r>
+      <w:r>
+        <w:t>, coordonnée GPS de la station d’arrivée</w:t>
+      </w:r>
+      <w:r>
+        <w:t xml:space="preserve"> (end</w:t>
+      </w:r>
+      <w:r>
+        <w:t>_lat</w:t>
+      </w:r>
+      <w:r>
+        <w:t> ; end</w:t>
+      </w:r>
+      <w:r>
+        <w:t>_l</w:t>
+      </w:r>
+      <w:r>
+        <w:t>ng)</w:t>
+      </w:r>
+    </w:p>
+    <w:p>
+      <w:pPr>
+        <w:pStyle w:val="Paragraphedeliste"/>
+        <w:ind w:left="405"/>
+      </w:pPr>
+    </w:p>
+    <w:p>
+      <w:pPr>
+        <w:pStyle w:val="Paragraphedeliste"/>
+        <w:numPr>
+          <w:ilvl w:val="0"/>
+          <w:numId w:val="1"/>
+        </w:numPr>
+      </w:pPr>
+      <w:r>
+        <w:t>Suppression des entrée</w:t>
+      </w:r>
+      <w:r>
+        <w:t>s</w:t>
+      </w:r>
+      <w:r>
+        <w:t xml:space="preserve"> ou toutes les données n’étaient pas présente : Filtrer les colone </w:t>
+      </w:r>
+      <w:r>
+        <w:t>rideable_type</w:t>
+      </w:r>
+      <w:r>
+        <w:t xml:space="preserve">, </w:t>
+      </w:r>
+      <w:r>
+        <w:t>started_at</w:t>
+      </w:r>
+      <w:r>
+        <w:t xml:space="preserve">, </w:t>
+      </w:r>
+      <w:r>
+        <w:t>ended_at</w:t>
+      </w:r>
+      <w:r>
+        <w:t xml:space="preserve">, </w:t>
+      </w:r>
+      <w:r>
+        <w:t>start_station_name</w:t>
+      </w:r>
+      <w:r>
+        <w:t xml:space="preserve">, </w:t>
+      </w:r>
+      <w:r>
+        <w:t>end_station_name</w:t>
+      </w:r>
+      <w:r>
+        <w:t xml:space="preserve"> et </w:t>
+      </w:r>
+      <w:r>
+        <w:t>member_casual</w:t>
+      </w:r>
+      <w:r>
+        <w:t>) et laisser n’apparaitre que les entrée</w:t>
+      </w:r>
+      <w:r>
+        <w:t>s</w:t>
+      </w:r>
+      <w:r>
+        <w:t xml:space="preserve"> vide </w:t>
+      </w:r>
+      <w:r>
+        <w:t>pour pouvoir en</w:t>
+      </w:r>
+      <w:r>
+        <w:t xml:space="preserve"> supprimer les lignes</w:t>
+      </w:r>
+      <w:r>
+        <w:t>/</w:t>
+      </w:r>
+      <w:r>
+        <w:t>entrée</w:t>
+      </w:r>
+      <w:r>
+        <w:t xml:space="preserve">s </w:t>
+      </w:r>
+      <w:r>
+        <w:t>vides.</w:t>
+      </w:r>
+    </w:p>
+    <w:p>
+      <w:pPr>
+        <w:pStyle w:val="Paragraphedeliste"/>
+      </w:pPr>
+    </w:p>
+    <w:p>
+      <w:pPr>
+        <w:pStyle w:val="Paragraphedeliste"/>
+        <w:numPr>
+          <w:ilvl w:val="0"/>
+          <w:numId w:val="1"/>
+        </w:numPr>
+      </w:pPr>
+      <w:r>
+        <w:t xml:space="preserve">Création d’une </w:t>
+      </w:r>
+      <w:r>
+        <w:t>ride_lenght</w:t>
+      </w:r>
+      <w:r>
+        <w:t xml:space="preserve"> pour </w:t>
+      </w:r>
+      <w:r>
+        <w:t>le c</w:t>
+      </w:r>
+      <w:r>
+        <w:t xml:space="preserve">alcul des temps moyen </w:t>
+      </w:r>
+      <w:r>
+        <w:t xml:space="preserve">mensuel </w:t>
+      </w:r>
+      <w:r>
+        <w:t>de trajet par entrée : =</w:t>
       </w:r>
       <w:r>
         <w:t xml:space="preserve"> </w:t>
       </w:r>
-      <w:proofErr w:type="spellStart"/>
-      <w:r>
-        <w:t>l'abo</w:t>
-      </w:r>
-      <w:proofErr w:type="spellEnd"/>
-      <w:r>
-        <w:t>.</w:t>
-      </w:r>
-    </w:p>
-    <w:p>
-      <w:pPr>
-        <w:rPr>
-          <w:rFonts w:ascii="Arial" w:hAnsi="Arial" w:cs="Arial"/>
-        </w:rPr>
-      </w:pPr>
+      <w:r>
+        <w:t xml:space="preserve">started_at – ended_at </w:t>
+      </w:r>
+    </w:p>
+    <w:p/>
+    <w:p>
+      <w:pPr>
+        <w:pStyle w:val="Paragraphedeliste"/>
+        <w:numPr>
+          <w:ilvl w:val="0"/>
+          <w:numId w:val="1"/>
+        </w:numPr>
+      </w:pPr>
+      <w:r>
+        <w:lastRenderedPageBreak/>
+        <w:t>Ajou</w:t>
+      </w:r>
+      <w:r>
+        <w:t>t</w:t>
+      </w:r>
+      <w:r>
+        <w:t xml:space="preserve"> d’une </w:t>
+      </w:r>
+      <w:r>
+        <w:t>colonne</w:t>
+      </w:r>
+      <w:r>
+        <w:t xml:space="preserve"> « day_of_week » qui déduira le jour de la semaine « lundi = 1, dimanche =7) par rapport à la </w:t>
+      </w:r>
+      <w:r>
+        <w:t xml:space="preserve">colonne </w:t>
+      </w:r>
+      <w:r>
+        <w:t>« started_at »</w:t>
+      </w:r>
+    </w:p>
+    <w:p>
+      <w:pPr>
+        <w:pStyle w:val="Paragraphedeliste"/>
+      </w:pPr>
+    </w:p>
+    <w:p>
+      <w:pPr>
+        <w:pStyle w:val="Paragraphedeliste"/>
+        <w:ind w:left="405"/>
+      </w:pPr>
+    </w:p>
+    <w:p>
+      <w:pPr>
+        <w:pStyle w:val="Paragraphedeliste"/>
+        <w:numPr>
+          <w:ilvl w:val="0"/>
+          <w:numId w:val="1"/>
+        </w:numPr>
+      </w:pPr>
+      <w:r>
+        <w:t>Calcul des temps moyen</w:t>
+      </w:r>
+      <w:r>
+        <w:t xml:space="preserve"> mensuel</w:t>
+      </w:r>
+      <w:r>
+        <w:t xml:space="preserve"> de trajets en vélo </w:t>
+      </w:r>
+      <w:r>
+        <w:t>électriques</w:t>
+      </w:r>
+      <w:r>
+        <w:t xml:space="preserve"> pour les utilisateurs occasionnels électriques : </w:t>
+      </w:r>
+      <w:r>
+        <w:t>=MOYENNE.SI.ENS(G:G; A:A; "electric_bike"; F:F; "casual")</w:t>
+      </w:r>
+    </w:p>
+    <w:p>
+      <w:pPr>
+        <w:ind w:left="405"/>
+      </w:pPr>
+      <w:r>
+        <w:t>Calcul des temps moyen</w:t>
+      </w:r>
       <w:r>
         <w:t xml:space="preserve"> </w:t>
       </w:r>
       <w:r>
-        <w:rPr>
-          <w:rFonts w:ascii="Arial" w:hAnsi="Arial" w:cs="Arial"/>
-        </w:rPr>
-        <w:t>​</w:t>
-      </w:r>
-      <w:r>
-        <w:t>Miser sur les endroits les plus demand</w:t>
-      </w:r>
-      <w:r>
-        <w:rPr>
-          <w:rFonts w:ascii="Aptos" w:hAnsi="Aptos" w:cs="Aptos"/>
-        </w:rPr>
-        <w:t>é</w:t>
-      </w:r>
-      <w:r>
-        <w:t>s en v</w:t>
-      </w:r>
-      <w:r>
-        <w:rPr>
-          <w:rFonts w:ascii="Aptos" w:hAnsi="Aptos" w:cs="Aptos"/>
-        </w:rPr>
-        <w:t>é</w:t>
-      </w:r>
-      <w:r>
-        <w:t xml:space="preserve">lo. </w:t>
-      </w:r>
-      <w:r>
-        <w:rPr>
-          <w:rFonts w:ascii="Arial" w:hAnsi="Arial" w:cs="Arial"/>
-        </w:rPr>
-        <w:t>​</w:t>
-      </w:r>
-      <w:r>
-        <w:t>Investir dans de v</w:t>
-      </w:r>
-      <w:r>
-        <w:rPr>
-          <w:rFonts w:ascii="Aptos" w:hAnsi="Aptos" w:cs="Aptos"/>
-        </w:rPr>
-        <w:t>é</w:t>
-      </w:r>
-      <w:r>
-        <w:t>lo classique/</w:t>
-      </w:r>
-      <w:r>
-        <w:rPr>
-          <w:rFonts w:ascii="Aptos" w:hAnsi="Aptos" w:cs="Aptos"/>
-        </w:rPr>
-        <w:t>é</w:t>
-      </w:r>
-      <w:r>
-        <w:t xml:space="preserve">lectrique selon la demande. </w:t>
-      </w:r>
-      <w:r>
-        <w:rPr>
-          <w:rFonts w:ascii="Arial" w:hAnsi="Arial" w:cs="Arial"/>
-        </w:rPr>
-        <w:t>​</w:t>
-      </w:r>
-      <w:r>
-        <w:rPr>
-          <w:rFonts w:ascii="Aptos" w:hAnsi="Aptos" w:cs="Aptos"/>
-        </w:rPr>
-        <w:t>É</w:t>
-      </w:r>
-      <w:r>
-        <w:t>nonc</w:t>
-      </w:r>
-      <w:r>
-        <w:rPr>
-          <w:rFonts w:ascii="Aptos" w:hAnsi="Aptos" w:cs="Aptos"/>
-        </w:rPr>
-        <w:t>é</w:t>
-      </w:r>
-      <w:r>
-        <w:t xml:space="preserve"> clair : Comprendre les habitudes des clients et la fr</w:t>
-      </w:r>
-      <w:r>
-        <w:rPr>
-          <w:rFonts w:ascii="Aptos" w:hAnsi="Aptos" w:cs="Aptos"/>
-        </w:rPr>
-        <w:t>é</w:t>
-      </w:r>
-      <w:r>
-        <w:t>quentation des stations, pour offrir la meilleure gamme de service (V</w:t>
-      </w:r>
-      <w:r>
-        <w:rPr>
-          <w:rFonts w:ascii="Aptos" w:hAnsi="Aptos" w:cs="Aptos"/>
-        </w:rPr>
-        <w:t>é</w:t>
-      </w:r>
-      <w:r>
-        <w:t xml:space="preserve">lo </w:t>
-      </w:r>
-      <w:r>
-        <w:rPr>
-          <w:rFonts w:ascii="Aptos" w:hAnsi="Aptos" w:cs="Aptos"/>
-        </w:rPr>
-        <w:t>é</w:t>
-      </w:r>
-      <w:r>
-        <w:t xml:space="preserve">lectrique ou classique). </w:t>
-      </w:r>
-      <w:r>
-        <w:rPr>
-          <w:rFonts w:ascii="Arial" w:hAnsi="Arial" w:cs="Arial"/>
-        </w:rPr>
-        <w:t>​</w:t>
-      </w:r>
-    </w:p>
-    <w:p>
-      <w:proofErr w:type="spellStart"/>
-      <w:r>
-        <w:t>Prepare</w:t>
-      </w:r>
-      <w:proofErr w:type="spellEnd"/>
-      <w:r>
-        <w:t xml:space="preserve"> : BDD CSV organis</w:t>
-      </w:r>
-      <w:r>
-        <w:rPr>
-          <w:rFonts w:ascii="Aptos" w:hAnsi="Aptos" w:cs="Aptos"/>
-        </w:rPr>
-        <w:t>é</w:t>
-      </w:r>
-      <w:r>
-        <w:t>e en 12 feuilles repr</w:t>
-      </w:r>
-      <w:r>
-        <w:rPr>
-          <w:rFonts w:ascii="Aptos" w:hAnsi="Aptos" w:cs="Aptos"/>
-        </w:rPr>
-        <w:t>é</w:t>
-      </w:r>
-      <w:r>
-        <w:t xml:space="preserve">sentant 12 mois (passer de CSV </w:t>
-      </w:r>
-      <w:r>
-        <w:rPr>
-          <w:rFonts w:ascii="Aptos" w:hAnsi="Aptos" w:cs="Aptos"/>
-        </w:rPr>
-        <w:t>à</w:t>
-      </w:r>
-      <w:r>
-        <w:t xml:space="preserve"> Excel </w:t>
-      </w:r>
-      <w:proofErr w:type="gramStart"/>
-      <w:r>
-        <w:t>de</w:t>
-      </w:r>
-      <w:proofErr w:type="gramEnd"/>
-      <w:r>
-        <w:t xml:space="preserve"> pr</w:t>
-      </w:r>
-      <w:r>
-        <w:rPr>
-          <w:rFonts w:ascii="Aptos" w:hAnsi="Aptos" w:cs="Aptos"/>
-        </w:rPr>
-        <w:t>é</w:t>
-      </w:r>
-      <w:r>
-        <w:t>f</w:t>
-      </w:r>
-      <w:r>
-        <w:rPr>
-          <w:rFonts w:ascii="Aptos" w:hAnsi="Aptos" w:cs="Aptos"/>
-        </w:rPr>
-        <w:t>é</w:t>
-      </w:r>
-      <w:r>
-        <w:t xml:space="preserve">rence). </w:t>
-      </w:r>
-      <w:r>
-        <w:rPr>
-          <w:rFonts w:ascii="Arial" w:hAnsi="Arial" w:cs="Arial"/>
-        </w:rPr>
-        <w:t>​</w:t>
-      </w:r>
-      <w:r>
-        <w:t>\</w:t>
-      </w:r>
-      <w:proofErr w:type="spellStart"/>
-      <w:r>
-        <w:t>rightarrow</w:t>
-      </w:r>
-      <w:proofErr w:type="spellEnd"/>
-      <w:r>
-        <w:t xml:space="preserve"> Je pars du principe que la base de </w:t>
-      </w:r>
-      <w:proofErr w:type="gramStart"/>
-      <w:r>
-        <w:t>donn</w:t>
-      </w:r>
-      <w:r>
-        <w:rPr>
-          <w:rFonts w:ascii="Aptos" w:hAnsi="Aptos" w:cs="Aptos"/>
-        </w:rPr>
-        <w:t>é</w:t>
-      </w:r>
-      <w:r>
-        <w:t>e</w:t>
-      </w:r>
-      <w:proofErr w:type="gramEnd"/>
-      <w:r>
-        <w:t xml:space="preserve"> est bien stock</w:t>
-      </w:r>
-      <w:r>
-        <w:rPr>
-          <w:rFonts w:ascii="Aptos" w:hAnsi="Aptos" w:cs="Aptos"/>
-        </w:rPr>
-        <w:t>é</w:t>
-      </w:r>
-      <w:r>
-        <w:t>e et s</w:t>
-      </w:r>
-      <w:r>
-        <w:rPr>
-          <w:rFonts w:ascii="Aptos" w:hAnsi="Aptos" w:cs="Aptos"/>
-        </w:rPr>
-        <w:t>é</w:t>
-      </w:r>
-      <w:r>
-        <w:t>curis</w:t>
-      </w:r>
-      <w:r>
-        <w:rPr>
-          <w:rFonts w:ascii="Aptos" w:hAnsi="Aptos" w:cs="Aptos"/>
-        </w:rPr>
-        <w:t>é</w:t>
-      </w:r>
-      <w:r>
-        <w:t xml:space="preserve">e et accessible. </w:t>
-      </w:r>
-      <w:r>
-        <w:rPr>
-          <w:rFonts w:ascii="Arial" w:hAnsi="Arial" w:cs="Arial"/>
-        </w:rPr>
-        <w:t>​</w:t>
-      </w:r>
-      <w:r>
-        <w:t>Les donnes [donn</w:t>
-      </w:r>
-      <w:r>
-        <w:rPr>
-          <w:rFonts w:ascii="Aptos" w:hAnsi="Aptos" w:cs="Aptos"/>
-        </w:rPr>
-        <w:t>é</w:t>
-      </w:r>
-      <w:r>
-        <w:t>es] vont me donner des r</w:t>
-      </w:r>
-      <w:r>
-        <w:rPr>
-          <w:rFonts w:ascii="Aptos" w:hAnsi="Aptos" w:cs="Aptos"/>
-        </w:rPr>
-        <w:t>é</w:t>
-      </w:r>
-      <w:r>
-        <w:t>ponses sur la fr</w:t>
-      </w:r>
-      <w:r>
-        <w:rPr>
-          <w:rFonts w:ascii="Aptos" w:hAnsi="Aptos" w:cs="Aptos"/>
-        </w:rPr>
-        <w:t>é</w:t>
-      </w:r>
-      <w:r>
-        <w:t>quent. [</w:t>
-      </w:r>
-      <w:proofErr w:type="gramStart"/>
-      <w:r>
-        <w:t>fr</w:t>
-      </w:r>
-      <w:r>
-        <w:rPr>
-          <w:rFonts w:ascii="Aptos" w:hAnsi="Aptos" w:cs="Aptos"/>
-        </w:rPr>
-        <w:t>é</w:t>
-      </w:r>
-      <w:r>
-        <w:t>quentation</w:t>
-      </w:r>
-      <w:proofErr w:type="gramEnd"/>
-      <w:r>
-        <w:t xml:space="preserve">] et les habitudes des clients. </w:t>
-      </w:r>
-      <w:r>
-        <w:rPr>
-          <w:rFonts w:ascii="Arial" w:hAnsi="Arial" w:cs="Arial"/>
-        </w:rPr>
-        <w:t>​</w:t>
-      </w:r>
-      <w:r>
-        <w:t xml:space="preserve">PB avec Data : Data manquantes, erronées ou absentes. </w:t>
-      </w:r>
-      <w:r>
-        <w:rPr>
-          <w:rFonts w:ascii="Arial" w:hAnsi="Arial" w:cs="Arial"/>
-        </w:rPr>
-        <w:t>​</w:t>
-      </w:r>
-      <w:r>
-        <w:t xml:space="preserve">Supprimer </w:t>
-      </w:r>
-      <w:proofErr w:type="gramStart"/>
-      <w:r>
-        <w:t>les entr</w:t>
-      </w:r>
-      <w:r>
-        <w:rPr>
-          <w:rFonts w:ascii="Aptos" w:hAnsi="Aptos" w:cs="Aptos"/>
-        </w:rPr>
-        <w:t>é</w:t>
-      </w:r>
-      <w:r>
-        <w:t>es incompl</w:t>
-      </w:r>
-      <w:r>
-        <w:rPr>
-          <w:rFonts w:ascii="Aptos" w:hAnsi="Aptos" w:cs="Aptos"/>
-        </w:rPr>
-        <w:t>è</w:t>
-      </w:r>
-      <w:r>
-        <w:t>te</w:t>
-      </w:r>
-      <w:proofErr w:type="gramEnd"/>
-      <w:r>
-        <w:t xml:space="preserve"> en filtrant les colonnes</w:t>
-      </w:r>
-      <w:r>
-        <w:t xml:space="preserve">, erreur de ma part, ne pas avoir croisé les ID des bornes avec les nom des station, ce </w:t>
-      </w:r>
-      <w:proofErr w:type="spellStart"/>
-      <w:r>
-        <w:t>qu</w:t>
-      </w:r>
-      <w:proofErr w:type="spellEnd"/>
+        <w:t>mensuel</w:t>
+      </w:r>
+      <w:r>
+        <w:t xml:space="preserve"> de trajets en vélo classiques pour les utilisateurs occasionnels classiques : </w:t>
+      </w:r>
+      <w:r>
+        <w:t>=MOYENNE.SI.ENS(G:G; A:A; "classic_bike"; F:F; "casual")</w:t>
+      </w:r>
+    </w:p>
+    <w:p>
+      <w:pPr>
+        <w:ind w:left="405"/>
+      </w:pPr>
+      <w:r>
+        <w:t xml:space="preserve">Calcul des temps moyen </w:t>
+      </w:r>
+      <w:r>
+        <w:t xml:space="preserve">mensuel </w:t>
+      </w:r>
+      <w:r>
+        <w:t>de trajets en vélo classique par les utilisateurs membre</w:t>
+      </w:r>
+      <w:r>
+        <w:t xml:space="preserve"> : </w:t>
+      </w:r>
+      <w:r>
+        <w:t>=MOYENNE.SI.ENS(G:G; A:A; "electric_bike"; F:F; "</w:t>
+      </w:r>
+      <w:r>
+        <w:t>member</w:t>
+      </w:r>
+      <w:r>
+        <w:t>")</w:t>
+      </w:r>
+    </w:p>
+    <w:p>
+      <w:pPr>
+        <w:ind w:left="405"/>
+      </w:pPr>
+    </w:p>
+    <w:p>
+      <w:pPr>
+        <w:pStyle w:val="Paragraphedeliste"/>
+        <w:numPr>
+          <w:ilvl w:val="0"/>
+          <w:numId w:val="1"/>
+        </w:numPr>
+      </w:pPr>
+      <w:r>
+        <w:t xml:space="preserve">Calcul des temps moyen </w:t>
+      </w:r>
+      <w:r>
+        <w:t xml:space="preserve">mensuel </w:t>
+      </w:r>
+      <w:r>
+        <w:t>de trajets en vélo électriques des utilisateur membres</w:t>
+      </w:r>
+      <w:r>
+        <w:t xml:space="preserve"> : </w:t>
+      </w:r>
+      <w:r>
+        <w:t>=MOYENNE.SI.ENS(G:G; A:A; "</w:t>
+      </w:r>
+      <w:r>
+        <w:t>classic</w:t>
+      </w:r>
+      <w:r>
+        <w:t>_bike"; F:F; "casual")</w:t>
+      </w:r>
       <w:r>
         <w:t xml:space="preserve"> </w:t>
       </w:r>
-      <w:proofErr w:type="spellStart"/>
-      <w:r>
-        <w:t>iasurement</w:t>
-      </w:r>
-      <w:proofErr w:type="spellEnd"/>
-      <w:r>
-        <w:t xml:space="preserve"> supprimé des milliers de lignes utiles</w:t>
+    </w:p>
+    <w:p>
+      <w:pPr>
+        <w:pStyle w:val="Paragraphedeliste"/>
+        <w:ind w:left="405"/>
+      </w:pPr>
+    </w:p>
+    <w:p>
+      <w:pPr>
+        <w:pStyle w:val="Paragraphedeliste"/>
+        <w:numPr>
+          <w:ilvl w:val="0"/>
+          <w:numId w:val="1"/>
+        </w:numPr>
+      </w:pPr>
+      <w:r>
+        <w:t>Total de location de vélo electriques par des membre :</w:t>
+      </w:r>
+      <w:r>
+        <w:t xml:space="preserve"> =NB.SI.ENS(F:F; "member"; A:A; "electric_bike")</w:t>
+      </w:r>
+    </w:p>
+    <w:p>
+      <w:pPr>
+        <w:ind w:left="405"/>
+      </w:pPr>
+      <w:r>
+        <w:t xml:space="preserve">Total de location de vélo electriques par des utilisateur occasionnel : </w:t>
+      </w:r>
+      <w:r>
+        <w:t>=NB.SI.ENS(F:F; "casual"; A:A; "electric_bike")</w:t>
+      </w:r>
+      <w:r>
+        <w:t> </w:t>
+      </w:r>
+    </w:p>
+    <w:p>
+      <w:pPr>
+        <w:ind w:left="405"/>
+      </w:pPr>
+      <w:r>
+        <w:t xml:space="preserve">Total de location de vélo classique par des utilisateurs occasioneels : </w:t>
+      </w:r>
+      <w:r>
+        <w:t>=NB.SI.ENS(F:F; "casual"; A:A; "</w:t>
+      </w:r>
+      <w:r>
+        <w:t>classic</w:t>
+      </w:r>
+      <w:r>
+        <w:t>_bike")</w:t>
+      </w:r>
+    </w:p>
+    <w:p>
+      <w:pPr>
+        <w:ind w:left="405"/>
+      </w:pPr>
+      <w:r>
+        <w:t xml:space="preserve">Total de location de vélo classique par des membre : </w:t>
+      </w:r>
+      <w:r>
+        <w:t>=NB.SI.ENS(F:F; "member"; A:A; "classic_bike")</w:t>
+      </w:r>
+      <w:r>
+        <w:t> </w:t>
+      </w:r>
+    </w:p>
+    <w:p>
+      <w:pPr>
+        <w:ind w:left="405"/>
+      </w:pPr>
+    </w:p>
+    <w:p>
+      <w:pPr>
+        <w:pStyle w:val="Paragraphedeliste"/>
+        <w:numPr>
+          <w:ilvl w:val="0"/>
+          <w:numId w:val="1"/>
+        </w:numPr>
+      </w:pPr>
+      <w:r>
+        <w:t xml:space="preserve">Calcul total des trajet mensuel en vélo </w:t>
+      </w:r>
+      <w:r>
+        <w:t>électrique</w:t>
+      </w:r>
+      <w:r>
+        <w:t xml:space="preserve"> : </w:t>
+      </w:r>
+      <w:r>
+        <w:t>=NB.SI(A:A; "electric_bike")</w:t>
+      </w:r>
+    </w:p>
+    <w:p>
+      <w:pPr>
+        <w:ind w:firstLine="405"/>
+      </w:pPr>
+      <w:r>
+        <w:t xml:space="preserve">Calcul total des trajet mensuel en vélo classique </w:t>
+      </w:r>
+      <w:r>
+        <w:t>=NB.SI(A:A; "classic_bike")</w:t>
       </w:r>
     </w:p>
     <w:p/>
     <w:p>
       <w:r>
-        <w:t xml:space="preserve">Mettre le format de </w:t>
-      </w:r>
-      <w:proofErr w:type="spellStart"/>
-      <w:r>
-        <w:t>scellule</w:t>
-      </w:r>
-      <w:proofErr w:type="spellEnd"/>
+        <w:t>Pour chaque mois c</w:t>
+      </w:r>
+      <w:r>
+        <w:t xml:space="preserve">alcul des jours de la semaine </w:t>
+      </w:r>
+      <w:r>
+        <w:t>préférés</w:t>
+      </w:r>
+      <w:r>
+        <w:t xml:space="preserve"> des </w:t>
+      </w:r>
+      <w:r>
+        <w:t xml:space="preserve">membre en vélo électrique : </w:t>
+      </w:r>
+      <w:r>
+        <w:t>=MODE(SI((A:A="electric_bike")*(G:G="member");D:D))</w:t>
+      </w:r>
+    </w:p>
+    <w:p>
+      <w:r>
+        <w:t xml:space="preserve">Pour chaque mois calcul des jours de la semaine </w:t>
+      </w:r>
+      <w:r>
+        <w:t>préférés</w:t>
+      </w:r>
       <w:r>
         <w:t xml:space="preserve"> </w:t>
       </w:r>
-      <w:proofErr w:type="gramStart"/>
-      <w:r>
-        <w:t>en  [</w:t>
-      </w:r>
-      <w:proofErr w:type="gramEnd"/>
-      <w:r>
-        <w:t>H] :mm</w:t>
+      <w:r>
+        <w:t>des membres</w:t>
+      </w:r>
+      <w:r>
+        <w:t xml:space="preserve"> en vélo</w:t>
+      </w:r>
+      <w:r>
+        <w:t xml:space="preserve"> </w:t>
+      </w:r>
+      <w:r>
+        <w:t>classique :</w:t>
+      </w:r>
+    </w:p>
+    <w:p>
+      <w:r>
+        <w:t>=MODE(SI((A:A="</w:t>
+      </w:r>
+      <w:r>
+        <w:t>classic</w:t>
+      </w:r>
+      <w:r>
+        <w:t>_bike")*(G:G="member");D:D))</w:t>
+      </w:r>
+    </w:p>
+    <w:p>
+      <w:r>
+        <w:lastRenderedPageBreak/>
+        <w:t xml:space="preserve">Pour chaque mois calcul des jours de la semaine </w:t>
+      </w:r>
+      <w:r>
+        <w:t>préférés</w:t>
+      </w:r>
+      <w:r>
+        <w:t xml:space="preserve"> des </w:t>
+      </w:r>
+      <w:r>
+        <w:t>non membre</w:t>
+      </w:r>
+      <w:r>
+        <w:t xml:space="preserve"> en vélo électrique</w:t>
+      </w:r>
+      <w:r>
+        <w:t> :</w:t>
+      </w:r>
+    </w:p>
+    <w:p>
+      <w:r>
+        <w:t>=MODE(SI((A:A="</w:t>
+      </w:r>
+      <w:r>
+        <w:t>electric</w:t>
+      </w:r>
+      <w:r>
+        <w:t>_bike")*(G:G="</w:t>
+      </w:r>
+      <w:r>
+        <w:t>casual</w:t>
+      </w:r>
+      <w:r>
+        <w:t>");D:D))</w:t>
+      </w:r>
+    </w:p>
+    <w:p>
+      <w:r>
+        <w:t xml:space="preserve">Pour chaque mois calcul des jours de la semaine </w:t>
+      </w:r>
+      <w:r>
+        <w:t>préférés</w:t>
+      </w:r>
+      <w:r>
+        <w:t xml:space="preserve"> des non membre en vélo </w:t>
+      </w:r>
+      <w:r>
+        <w:t>classique</w:t>
+      </w:r>
+      <w:r>
+        <w:t> :</w:t>
+      </w:r>
+    </w:p>
+    <w:p>
+      <w:r>
+        <w:t>=MODE(SI((A:A="</w:t>
+      </w:r>
+      <w:r>
+        <w:t>classic</w:t>
+      </w:r>
+      <w:r>
+        <w:t>_bike")*(G:G="</w:t>
+      </w:r>
+      <w:r>
+        <w:t>casual</w:t>
+      </w:r>
+      <w:r>
+        <w:t>");D:D))</w:t>
       </w:r>
     </w:p>
     <w:p/>
     <w:p>
-      <w:r>
-        <w:t>https://github.com/git-lfs/git-lfs#getting-started</w:t>
-      </w:r>
-    </w:p>
+      <w:pPr>
+        <w:pStyle w:val="Paragraphedeliste"/>
+        <w:ind w:left="405"/>
+        <w:rPr>
+          <w:b/>
+          <w:bCs/>
+          <w:u w:val="single"/>
+        </w:rPr>
+      </w:pPr>
+      <w:r>
+        <w:rPr>
+          <w:b/>
+          <w:bCs/>
+          <w:u w:val="single"/>
+        </w:rPr>
+        <w:t>2</w:t>
+      </w:r>
+      <w:r>
+        <w:rPr>
+          <w:b/>
+          <w:bCs/>
+          <w:u w:val="single"/>
+        </w:rPr>
+        <w:t xml:space="preserve"> : </w:t>
+      </w:r>
+      <w:r>
+        <w:rPr>
+          <w:b/>
+          <w:bCs/>
+          <w:u w:val="single"/>
+        </w:rPr>
+        <w:t>Création f</w:t>
+      </w:r>
+      <w:r>
+        <w:rPr>
+          <w:b/>
+          <w:bCs/>
+          <w:u w:val="single"/>
+        </w:rPr>
+        <w:t>euille de calcul TCD stations</w:t>
+      </w:r>
+    </w:p>
+    <w:p>
+      <w:pPr>
+        <w:pStyle w:val="Paragraphedeliste"/>
+        <w:ind w:left="405"/>
+        <w:rPr>
+          <w:b/>
+          <w:bCs/>
+          <w:u w:val="single"/>
+        </w:rPr>
+      </w:pPr>
+    </w:p>
+    <w:p>
+      <w:pPr>
+        <w:pStyle w:val="Paragraphedeliste"/>
+        <w:numPr>
+          <w:ilvl w:val="0"/>
+          <w:numId w:val="1"/>
+        </w:numPr>
+      </w:pPr>
+      <w:r>
+        <w:t>Création d’un TCD avec comme colonnes : name_stations ; somme_dépôt ; somme_retraits ; somme_différence_</w:t>
+      </w:r>
+      <w:r>
+        <w:t>d</w:t>
+      </w:r>
+      <w:r>
+        <w:t>/</w:t>
+      </w:r>
+      <w:r>
+        <w:t>r</w:t>
+      </w:r>
+    </w:p>
+    <w:p>
+      <w:pPr>
+        <w:pStyle w:val="Paragraphedeliste"/>
+        <w:numPr>
+          <w:ilvl w:val="0"/>
+          <w:numId w:val="1"/>
+        </w:numPr>
+      </w:pPr>
+      <w:r>
+        <w:t>Classement des station du chiffre « </w:t>
+      </w:r>
+      <w:r>
+        <w:t>somme_différence_e/s</w:t>
+      </w:r>
+      <w:r>
+        <w:t> » du plus petit au plus grand grâce au tri.</w:t>
+      </w:r>
+    </w:p>
+    <w:p/>
+    <w:p>
+      <w:pPr>
+        <w:pStyle w:val="Paragraphedeliste"/>
+        <w:ind w:left="405"/>
+        <w:rPr>
+          <w:b/>
+          <w:bCs/>
+          <w:u w:val="single"/>
+        </w:rPr>
+      </w:pPr>
+      <w:r>
+        <w:rPr>
+          <w:b/>
+          <w:bCs/>
+          <w:u w:val="single"/>
+        </w:rPr>
+        <w:t>2</w:t>
+      </w:r>
+      <w:r>
+        <w:rPr>
+          <w:b/>
+          <w:bCs/>
+          <w:u w:val="single"/>
+        </w:rPr>
+        <w:t xml:space="preserve"> : </w:t>
+      </w:r>
+      <w:r>
+        <w:rPr>
+          <w:b/>
+          <w:bCs/>
+          <w:u w:val="single"/>
+        </w:rPr>
+        <w:t>Création feuille de calcul « Station summary »</w:t>
+      </w:r>
+    </w:p>
+    <w:p>
+      <w:pPr>
+        <w:pStyle w:val="Paragraphedeliste"/>
+        <w:ind w:left="405"/>
+        <w:rPr>
+          <w:b/>
+          <w:bCs/>
+          <w:u w:val="single"/>
+        </w:rPr>
+      </w:pPr>
+    </w:p>
+    <w:p>
+      <w:pPr>
+        <w:pStyle w:val="Paragraphedeliste"/>
+        <w:numPr>
+          <w:ilvl w:val="0"/>
+          <w:numId w:val="1"/>
+        </w:numPr>
+        <w:rPr>
+          <w:b/>
+          <w:bCs/>
+          <w:u w:val="single"/>
+        </w:rPr>
+      </w:pPr>
+      <w:r>
+        <w:t xml:space="preserve">Récupération de tous les noms des stations de vélo (Une ligne = une station) </w:t>
+      </w:r>
+    </w:p>
+    <w:p>
+      <w:pPr>
+        <w:pStyle w:val="Paragraphedeliste"/>
+        <w:ind w:left="405"/>
+        <w:rPr>
+          <w:b/>
+          <w:bCs/>
+          <w:u w:val="single"/>
+        </w:rPr>
+      </w:pPr>
+      <w:r>
+        <w:t>=TRIER(UNIQUE(‘01-2025’!E2 :E9999999)</w:t>
+      </w:r>
+    </w:p>
+    <w:p>
+      <w:pPr>
+        <w:pStyle w:val="Paragraphedeliste"/>
+        <w:numPr>
+          <w:ilvl w:val="0"/>
+          <w:numId w:val="1"/>
+        </w:numPr>
+        <w:rPr>
+          <w:b/>
+          <w:bCs/>
+          <w:u w:val="single"/>
+        </w:rPr>
+      </w:pPr>
+      <w:r>
+        <w:t xml:space="preserve">Création de 3 colonnes par mois : Une qui ressence les retrait ; une qui ressence les dépôts, et une qui ressence la différence entre les dépôt et retraits. </w:t>
+      </w:r>
+    </w:p>
+    <w:p>
+      <w:pPr>
+        <w:pStyle w:val="Paragraphedeliste"/>
+        <w:ind w:left="405"/>
+      </w:pPr>
+      <w:r>
+        <w:t xml:space="preserve">Ex : </w:t>
+      </w:r>
+      <w:r>
+        <w:t>=NB.SI.ENS('01-2025'!E:E;'stations summary'!A2)</w:t>
+      </w:r>
+    </w:p>
+    <w:p>
+      <w:pPr>
+        <w:pStyle w:val="Paragraphedeliste"/>
+        <w:ind w:left="708"/>
+      </w:pPr>
+      <w:r>
+        <w:t xml:space="preserve">  </w:t>
+      </w:r>
+      <w:r>
+        <w:t>=NB.SI.ENS('01-2025'!F:F;'stations summary'!A2)</w:t>
+      </w:r>
+    </w:p>
+    <w:p>
+      <w:pPr>
+        <w:pStyle w:val="Paragraphedeliste"/>
+        <w:ind w:left="405"/>
+      </w:pPr>
+      <w:r>
+        <w:t xml:space="preserve">        </w:t>
+      </w:r>
+      <w:r>
+        <w:t>=B2-C2</w:t>
+      </w:r>
+    </w:p>
+    <w:p>
+      <w:pPr>
+        <w:pStyle w:val="Paragraphedeliste"/>
+        <w:numPr>
+          <w:ilvl w:val="0"/>
+          <w:numId w:val="1"/>
+        </w:numPr>
+        <w:rPr>
+          <w:b/>
+          <w:bCs/>
+          <w:u w:val="single"/>
+        </w:rPr>
+      </w:pPr>
+      <w:r>
+        <w:t>Création en bout de tableau, une colonne : total_retrait ; total_dépot, total diff_d/r.</w:t>
+      </w:r>
+    </w:p>
+    <w:p>
+      <w:pPr>
+        <w:pStyle w:val="Paragraphedeliste"/>
+        <w:ind w:left="405"/>
+      </w:pPr>
+      <w:r>
+        <w:t xml:space="preserve">ex : </w:t>
+      </w:r>
+      <w:r>
+        <w:t>=SOMME(B2;E2;H2;K2;N2;Q2;T2;W2;Z2;AC2;AF2;AI2)</w:t>
+      </w:r>
+    </w:p>
+    <w:p>
+      <w:pPr>
+        <w:pStyle w:val="Paragraphedeliste"/>
+        <w:ind w:left="708"/>
+      </w:pPr>
+      <w:r>
+        <w:t xml:space="preserve">  </w:t>
+      </w:r>
+      <w:r>
+        <w:t>=SOMME(C2;F2;I2;L2;O2;R2;U2;X2;AA2;AD2;AG2;AJ2)</w:t>
+      </w:r>
+    </w:p>
+    <w:p>
+      <w:pPr>
+        <w:pStyle w:val="Paragraphedeliste"/>
+        <w:ind w:left="708"/>
+      </w:pPr>
+      <w:r>
+        <w:t xml:space="preserve">  </w:t>
+      </w:r>
+      <w:r>
+        <w:t>=AM2-AL2</w:t>
+      </w:r>
+    </w:p>
+    <w:p>
+      <w:pPr>
+        <w:pStyle w:val="Paragraphedeliste"/>
+        <w:ind w:left="708"/>
+      </w:pPr>
+    </w:p>
+    <w:p/>
     <w:p/>
     <w:sectPr>
       <w:pgSz w:w="11906" w:h="16838"/>
@@ -666,6 +1607,126 @@
     </w:sectPr>
   </w:body>
 </w:document>
+</file>
+
+<file path=word/numbering.xml><?xml version="1.0" encoding="utf-8"?>
+<w:numbering xmlns:wpc="http://schemas.microsoft.com/office/word/2010/wordprocessingCanvas" xmlns:cx="http://schemas.microsoft.com/office/drawing/2014/chartex" xmlns:cx1="http://schemas.microsoft.com/office/drawing/2015/9/8/chartex" xmlns:cx2="http://schemas.microsoft.com/office/drawing/2015/10/21/chartex" xmlns:cx3="http://schemas.microsoft.com/office/drawing/2016/5/9/chartex" xmlns:cx4="http://schemas.microsoft.com/office/drawing/2016/5/10/chartex" xmlns:cx5="http://schemas.microsoft.com/office/drawing/2016/5/11/chartex" xmlns:cx6="http://schemas.microsoft.com/office/drawing/2016/5/12/chartex" xmlns:cx7="http://schemas.microsoft.com/office/drawing/2016/5/13/chartex" xmlns:cx8="http://schemas.microsoft.com/office/drawing/2016/5/14/chartex" xmlns:mc="http://schemas.openxmlformats.org/markup-compatibility/2006" xmlns:aink="http://schemas.microsoft.com/office/drawing/2016/ink" xmlns:am3d="http://schemas.microsoft.com/office/drawing/2017/model3d" xmlns:o="urn:schemas-microsoft-com:office:office" xmlns:oel="http://schemas.microsoft.com/office/2019/extlst" xmlns:r="http://schemas.openxmlformats.org/officeDocument/2006/relationships" xmlns:m="http://schemas.openxmlformats.org/officeDocument/2006/math" xmlns:v="urn:schemas-microsoft-com:vml" xmlns:wp14="http://schemas.microsoft.com/office/word/2010/wordprocessingDrawing" xmlns:wp="http://schemas.openxmlformats.org/drawingml/2006/wordprocessingDrawing" xmlns:w10="urn:schemas-microsoft-com:office:word" xmlns:w="http://schemas.openxmlformats.org/wordprocessingml/2006/main" xmlns:w14="http://schemas.microsoft.com/office/word/2010/wordml" xmlns:w15="http://schemas.microsoft.com/office/word/2012/wordml" xmlns:w16cex="http://schemas.microsoft.com/office/word/2018/wordml/cex" xmlns:w16cid="http://schemas.microsoft.com/office/word/2016/wordml/cid" xmlns:w16="http://schemas.microsoft.com/office/word/2018/wordml" xmlns:w16sdtdh="http://schemas.microsoft.com/office/word/2020/wordml/sdtdatahash" xmlns:w16se="http://schemas.microsoft.com/office/word/2015/wordml/symex" xmlns:wpg="http://schemas.microsoft.com/office/word/2010/wordprocessingGroup" xmlns:wpi="http://schemas.microsoft.com/office/word/2010/wordprocessingInk" xmlns:wne="http://schemas.microsoft.com/office/word/2006/wordml" xmlns:wps="http://schemas.microsoft.com/office/word/2010/wordprocessingShape" mc:Ignorable="w14 w15 w16se w16cid w16 w16cex w16sdtdh wp14">
+  <w:abstractNum w:abstractNumId="0" w15:restartNumberingAfterBreak="0">
+    <w:nsid w:val="41983045"/>
+    <w:multiLevelType w:val="hybridMultilevel"/>
+    <w:tmpl w:val="3E6E6F52"/>
+    <w:lvl w:ilvl="0" w:tplc="D2DE16E8">
+      <w:numFmt w:val="bullet"/>
+      <w:lvlText w:val=""/>
+      <w:lvlJc w:val="left"/>
+      <w:pPr>
+        <w:ind w:left="405" w:hanging="360"/>
+      </w:pPr>
+      <w:rPr>
+        <w:rFonts w:ascii="Symbol" w:eastAsiaTheme="minorHAnsi" w:hAnsi="Symbol" w:cstheme="minorBidi" w:hint="default"/>
+      </w:rPr>
+    </w:lvl>
+    <w:lvl w:ilvl="1" w:tplc="040C0003" w:tentative="1">
+      <w:start w:val="1"/>
+      <w:numFmt w:val="bullet"/>
+      <w:lvlText w:val="o"/>
+      <w:lvlJc w:val="left"/>
+      <w:pPr>
+        <w:ind w:left="1125" w:hanging="360"/>
+      </w:pPr>
+      <w:rPr>
+        <w:rFonts w:ascii="Courier New" w:hAnsi="Courier New" w:cs="Courier New" w:hint="default"/>
+      </w:rPr>
+    </w:lvl>
+    <w:lvl w:ilvl="2" w:tplc="040C0005" w:tentative="1">
+      <w:start w:val="1"/>
+      <w:numFmt w:val="bullet"/>
+      <w:lvlText w:val=""/>
+      <w:lvlJc w:val="left"/>
+      <w:pPr>
+        <w:ind w:left="1845" w:hanging="360"/>
+      </w:pPr>
+      <w:rPr>
+        <w:rFonts w:ascii="Wingdings" w:hAnsi="Wingdings" w:hint="default"/>
+      </w:rPr>
+    </w:lvl>
+    <w:lvl w:ilvl="3" w:tplc="040C0001" w:tentative="1">
+      <w:start w:val="1"/>
+      <w:numFmt w:val="bullet"/>
+      <w:lvlText w:val=""/>
+      <w:lvlJc w:val="left"/>
+      <w:pPr>
+        <w:ind w:left="2565" w:hanging="360"/>
+      </w:pPr>
+      <w:rPr>
+        <w:rFonts w:ascii="Symbol" w:hAnsi="Symbol" w:hint="default"/>
+      </w:rPr>
+    </w:lvl>
+    <w:lvl w:ilvl="4" w:tplc="040C0003" w:tentative="1">
+      <w:start w:val="1"/>
+      <w:numFmt w:val="bullet"/>
+      <w:lvlText w:val="o"/>
+      <w:lvlJc w:val="left"/>
+      <w:pPr>
+        <w:ind w:left="3285" w:hanging="360"/>
+      </w:pPr>
+      <w:rPr>
+        <w:rFonts w:ascii="Courier New" w:hAnsi="Courier New" w:cs="Courier New" w:hint="default"/>
+      </w:rPr>
+    </w:lvl>
+    <w:lvl w:ilvl="5" w:tplc="040C0005" w:tentative="1">
+      <w:start w:val="1"/>
+      <w:numFmt w:val="bullet"/>
+      <w:lvlText w:val=""/>
+      <w:lvlJc w:val="left"/>
+      <w:pPr>
+        <w:ind w:left="4005" w:hanging="360"/>
+      </w:pPr>
+      <w:rPr>
+        <w:rFonts w:ascii="Wingdings" w:hAnsi="Wingdings" w:hint="default"/>
+      </w:rPr>
+    </w:lvl>
+    <w:lvl w:ilvl="6" w:tplc="040C0001" w:tentative="1">
+      <w:start w:val="1"/>
+      <w:numFmt w:val="bullet"/>
+      <w:lvlText w:val=""/>
+      <w:lvlJc w:val="left"/>
+      <w:pPr>
+        <w:ind w:left="4725" w:hanging="360"/>
+      </w:pPr>
+      <w:rPr>
+        <w:rFonts w:ascii="Symbol" w:hAnsi="Symbol" w:hint="default"/>
+      </w:rPr>
+    </w:lvl>
+    <w:lvl w:ilvl="7" w:tplc="040C0003" w:tentative="1">
+      <w:start w:val="1"/>
+      <w:numFmt w:val="bullet"/>
+      <w:lvlText w:val="o"/>
+      <w:lvlJc w:val="left"/>
+      <w:pPr>
+        <w:ind w:left="5445" w:hanging="360"/>
+      </w:pPr>
+      <w:rPr>
+        <w:rFonts w:ascii="Courier New" w:hAnsi="Courier New" w:cs="Courier New" w:hint="default"/>
+      </w:rPr>
+    </w:lvl>
+    <w:lvl w:ilvl="8" w:tplc="040C0005" w:tentative="1">
+      <w:start w:val="1"/>
+      <w:numFmt w:val="bullet"/>
+      <w:lvlText w:val=""/>
+      <w:lvlJc w:val="left"/>
+      <w:pPr>
+        <w:ind w:left="6165" w:hanging="360"/>
+      </w:pPr>
+      <w:rPr>
+        <w:rFonts w:ascii="Wingdings" w:hAnsi="Wingdings" w:hint="default"/>
+      </w:rPr>
+    </w:lvl>
+  </w:abstractNum>
+  <w:num w:numId="1" w16cid:durableId="115294681">
+    <w:abstractNumId w:val="0"/>
+  </w:num>
+</w:numbering>
 </file>
 
 <file path=word/styles.xml><?xml version="1.0" encoding="utf-8"?>
@@ -1068,6 +2129,7 @@
   <w:style w:type="paragraph" w:default="1" w:styleId="Normal">
     <w:name w:val="Normal"/>
     <w:qFormat/>
+    <w:rsid w:val="001742AC"/>
   </w:style>
   <w:style w:type="paragraph" w:styleId="Titre1">
     <w:name w:val="heading 1"/>

</xml_diff>

<commit_message>
affinage resultats, creation TCD total entrées dans la bdd, et finalisation du fichier word détail étude de cas cyclistic
</commit_message>
<xml_diff>
--- a/Velo en libre service/Détails_étude_de_cas_Cyclistic.docx
+++ b/Velo en libre service/Détails_étude_de_cas_Cyclistic.docx
@@ -91,7 +91,23 @@
           <w:b/>
           <w:bCs/>
         </w:rPr>
-        <w:t xml:space="preserve">Pourquoi les clients occasionnels devaient [devraient] prendre un abo. </w:t>
+        <w:t xml:space="preserve">Pourquoi les clients occasionnels devaient [devraient] prendre un </w:t>
+      </w:r>
+      <w:proofErr w:type="spellStart"/>
+      <w:r>
+        <w:rPr>
+          <w:b/>
+          <w:bCs/>
+        </w:rPr>
+        <w:t>abo</w:t>
+      </w:r>
+      <w:proofErr w:type="spellEnd"/>
+      <w:r>
+        <w:rPr>
+          <w:b/>
+          <w:bCs/>
+        </w:rPr>
+        <w:t xml:space="preserve">. </w:t>
       </w:r>
       <w:r>
         <w:rPr>
@@ -301,7 +317,23 @@
           <w:b/>
           <w:bCs/>
         </w:rPr>
-        <w:t xml:space="preserve"> l'abo.</w:t>
+        <w:t xml:space="preserve"> </w:t>
+      </w:r>
+      <w:proofErr w:type="spellStart"/>
+      <w:r>
+        <w:rPr>
+          <w:b/>
+          <w:bCs/>
+        </w:rPr>
+        <w:t>l'abo</w:t>
+      </w:r>
+      <w:proofErr w:type="spellEnd"/>
+      <w:r>
+        <w:rPr>
+          <w:b/>
+          <w:bCs/>
+        </w:rPr>
+        <w:t>.</w:t>
       </w:r>
     </w:p>
     <w:p>
@@ -712,7 +744,7 @@
           <w:bCs/>
           <w:u w:val="single"/>
         </w:rPr>
-        <w:t xml:space="preserve">Feuilles de calcul </w:t>
+        <w:t xml:space="preserve">Feuilles de </w:t>
       </w:r>
       <w:r>
         <w:rPr>
@@ -720,7 +752,7 @@
           <w:bCs/>
           <w:u w:val="single"/>
         </w:rPr>
-        <w:t xml:space="preserve"> </w:t>
+        <w:t xml:space="preserve">calcul </w:t>
       </w:r>
       <w:r>
         <w:rPr>
@@ -728,7 +760,15 @@
           <w:bCs/>
           <w:u w:val="single"/>
         </w:rPr>
-        <w:t>« </w:t>
+        <w:t>«</w:t>
+      </w:r>
+      <w:r>
+        <w:rPr>
+          <w:b/>
+          <w:bCs/>
+          <w:u w:val="single"/>
+        </w:rPr>
+        <w:t> </w:t>
       </w:r>
       <w:r>
         <w:rPr>
@@ -762,46 +802,76 @@
         </w:numPr>
       </w:pPr>
       <w:r>
-        <w:t>Suppression des colone ID de la location (</w:t>
-      </w:r>
+        <w:t xml:space="preserve">Suppression des </w:t>
+      </w:r>
+      <w:proofErr w:type="spellStart"/>
+      <w:r>
+        <w:t>colone</w:t>
+      </w:r>
+      <w:proofErr w:type="spellEnd"/>
+      <w:r>
+        <w:t xml:space="preserve"> ID de la location (</w:t>
+      </w:r>
+      <w:proofErr w:type="spellStart"/>
       <w:r>
         <w:t>ride_id</w:t>
       </w:r>
+      <w:proofErr w:type="spellEnd"/>
       <w:r>
         <w:t>), coordonnée GPS de la station de départ</w:t>
       </w:r>
       <w:r>
         <w:t xml:space="preserve"> (</w:t>
       </w:r>
+      <w:proofErr w:type="spellStart"/>
       <w:r>
         <w:t>start_lat</w:t>
       </w:r>
+      <w:proofErr w:type="spellEnd"/>
       <w:r>
         <w:t xml:space="preserve"> ; </w:t>
       </w:r>
+      <w:proofErr w:type="spellStart"/>
       <w:r>
         <w:t>start_</w:t>
       </w:r>
       <w:r>
-        <w:t>lng)</w:t>
+        <w:t>lng</w:t>
+      </w:r>
+      <w:proofErr w:type="spellEnd"/>
+      <w:r>
+        <w:t>)</w:t>
       </w:r>
       <w:r>
         <w:t>, coordonnée GPS de la station d’arrivée</w:t>
       </w:r>
       <w:r>
-        <w:t xml:space="preserve"> (end</w:t>
+        <w:t xml:space="preserve"> (</w:t>
+      </w:r>
+      <w:proofErr w:type="spellStart"/>
+      <w:r>
+        <w:t>end</w:t>
       </w:r>
       <w:r>
         <w:t>_lat</w:t>
       </w:r>
-      <w:r>
-        <w:t> ; end</w:t>
+      <w:proofErr w:type="spellEnd"/>
+      <w:r>
+        <w:t xml:space="preserve"> ; </w:t>
+      </w:r>
+      <w:proofErr w:type="spellStart"/>
+      <w:r>
+        <w:t>end</w:t>
       </w:r>
       <w:r>
         <w:t>_l</w:t>
       </w:r>
       <w:r>
-        <w:t>ng)</w:t>
+        <w:t>ng</w:t>
+      </w:r>
+      <w:proofErr w:type="spellEnd"/>
+      <w:r>
+        <w:t>)</w:t>
       </w:r>
     </w:p>
     <w:p>
@@ -825,41 +895,61 @@
         <w:t>s</w:t>
       </w:r>
       <w:r>
-        <w:t xml:space="preserve"> ou toutes les données n’étaient pas présente : Filtrer les colone </w:t>
-      </w:r>
+        <w:t xml:space="preserve"> ou toutes les données n’étaient pas présente : Filtrer les </w:t>
+      </w:r>
+      <w:proofErr w:type="spellStart"/>
+      <w:r>
+        <w:t>colone</w:t>
+      </w:r>
+      <w:proofErr w:type="spellEnd"/>
+      <w:r>
+        <w:t xml:space="preserve"> </w:t>
+      </w:r>
+      <w:proofErr w:type="spellStart"/>
       <w:r>
         <w:t>rideable_type</w:t>
       </w:r>
+      <w:proofErr w:type="spellEnd"/>
       <w:r>
         <w:t xml:space="preserve">, </w:t>
       </w:r>
+      <w:proofErr w:type="spellStart"/>
       <w:r>
         <w:t>started_at</w:t>
       </w:r>
+      <w:proofErr w:type="spellEnd"/>
       <w:r>
         <w:t xml:space="preserve">, </w:t>
       </w:r>
+      <w:proofErr w:type="spellStart"/>
       <w:r>
         <w:t>ended_at</w:t>
       </w:r>
+      <w:proofErr w:type="spellEnd"/>
       <w:r>
         <w:t xml:space="preserve">, </w:t>
       </w:r>
+      <w:proofErr w:type="spellStart"/>
       <w:r>
         <w:t>start_station_name</w:t>
       </w:r>
+      <w:proofErr w:type="spellEnd"/>
       <w:r>
         <w:t xml:space="preserve">, </w:t>
       </w:r>
+      <w:proofErr w:type="spellStart"/>
       <w:r>
         <w:t>end_station_name</w:t>
       </w:r>
+      <w:proofErr w:type="spellEnd"/>
       <w:r>
         <w:t xml:space="preserve"> et </w:t>
       </w:r>
+      <w:proofErr w:type="spellStart"/>
       <w:r>
         <w:t>member_casual</w:t>
       </w:r>
+      <w:proofErr w:type="spellEnd"/>
       <w:r>
         <w:t>) et laisser n’apparaitre que les entrée</w:t>
       </w:r>
@@ -904,9 +994,11 @@
       <w:r>
         <w:t xml:space="preserve">Création d’une </w:t>
       </w:r>
+      <w:proofErr w:type="spellStart"/>
       <w:r>
         <w:t>ride_lenght</w:t>
       </w:r>
+      <w:proofErr w:type="spellEnd"/>
       <w:r>
         <w:t xml:space="preserve"> pour </w:t>
       </w:r>
@@ -925,8 +1017,21 @@
       <w:r>
         <w:t xml:space="preserve"> </w:t>
       </w:r>
-      <w:r>
-        <w:t xml:space="preserve">started_at – ended_at </w:t>
+      <w:proofErr w:type="spellStart"/>
+      <w:r>
+        <w:t>started_at</w:t>
+      </w:r>
+      <w:proofErr w:type="spellEnd"/>
+      <w:r>
+        <w:t xml:space="preserve"> – </w:t>
+      </w:r>
+      <w:proofErr w:type="spellStart"/>
+      <w:r>
+        <w:t>ended_at</w:t>
+      </w:r>
+      <w:proofErr w:type="spellEnd"/>
+      <w:r>
+        <w:t xml:space="preserve"> </w:t>
       </w:r>
     </w:p>
     <w:p/>
@@ -952,13 +1057,29 @@
         <w:t>colonne</w:t>
       </w:r>
       <w:r>
-        <w:t xml:space="preserve"> « day_of_week » qui déduira le jour de la semaine « lundi = 1, dimanche =7) par rapport à la </w:t>
+        <w:t xml:space="preserve"> « </w:t>
+      </w:r>
+      <w:proofErr w:type="spellStart"/>
+      <w:r>
+        <w:t>day_of_week</w:t>
+      </w:r>
+      <w:proofErr w:type="spellEnd"/>
+      <w:r>
+        <w:t xml:space="preserve"> » qui déduira le jour de la semaine « lundi = 1, dimanche =7) par rapport à la </w:t>
       </w:r>
       <w:r>
         <w:t xml:space="preserve">colonne </w:t>
       </w:r>
       <w:r>
-        <w:t>« started_at »</w:t>
+        <w:t>« </w:t>
+      </w:r>
+      <w:proofErr w:type="spellStart"/>
+      <w:r>
+        <w:t>started_at</w:t>
+      </w:r>
+      <w:proofErr w:type="spellEnd"/>
+      <w:r>
+        <w:t> »</w:t>
       </w:r>
     </w:p>
     <w:p>
@@ -996,7 +1117,23 @@
         <w:t xml:space="preserve"> pour les utilisateurs occasionnels électriques : </w:t>
       </w:r>
       <w:r>
-        <w:t>=MOYENNE.SI.ENS(G:G; A:A; "electric_bike"; F:F; "casual")</w:t>
+        <w:t>=</w:t>
+      </w:r>
+      <w:proofErr w:type="gramStart"/>
+      <w:r>
+        <w:t>MOYENNE.SI.ENS(</w:t>
+      </w:r>
+      <w:proofErr w:type="gramEnd"/>
+      <w:r>
+        <w:t>G:G; A:A; "</w:t>
+      </w:r>
+      <w:proofErr w:type="spellStart"/>
+      <w:r>
+        <w:t>electric_bike</w:t>
+      </w:r>
+      <w:proofErr w:type="spellEnd"/>
+      <w:r>
+        <w:t>"; F:F; "casual")</w:t>
       </w:r>
     </w:p>
     <w:p>
@@ -1016,7 +1153,23 @@
         <w:t xml:space="preserve"> de trajets en vélo classiques pour les utilisateurs occasionnels classiques : </w:t>
       </w:r>
       <w:r>
-        <w:t>=MOYENNE.SI.ENS(G:G; A:A; "classic_bike"; F:F; "casual")</w:t>
+        <w:t>=</w:t>
+      </w:r>
+      <w:proofErr w:type="gramStart"/>
+      <w:r>
+        <w:t>MOYENNE.SI.ENS(</w:t>
+      </w:r>
+      <w:proofErr w:type="gramEnd"/>
+      <w:r>
+        <w:t>G:G; A:A; "</w:t>
+      </w:r>
+      <w:proofErr w:type="spellStart"/>
+      <w:r>
+        <w:t>classic_bike</w:t>
+      </w:r>
+      <w:proofErr w:type="spellEnd"/>
+      <w:r>
+        <w:t>"; F:F; "casual")</w:t>
       </w:r>
     </w:p>
     <w:p>
@@ -1036,11 +1189,29 @@
         <w:t xml:space="preserve"> : </w:t>
       </w:r>
       <w:r>
-        <w:t>=MOYENNE.SI.ENS(G:G; A:A; "electric_bike"; F:F; "</w:t>
-      </w:r>
+        <w:t>=</w:t>
+      </w:r>
+      <w:proofErr w:type="gramStart"/>
+      <w:r>
+        <w:t>MOYENNE.SI.ENS(</w:t>
+      </w:r>
+      <w:proofErr w:type="gramEnd"/>
+      <w:r>
+        <w:t>G:G; A:A; "</w:t>
+      </w:r>
+      <w:proofErr w:type="spellStart"/>
+      <w:r>
+        <w:t>electric_bike</w:t>
+      </w:r>
+      <w:proofErr w:type="spellEnd"/>
+      <w:r>
+        <w:t>"; F:F; "</w:t>
+      </w:r>
+      <w:proofErr w:type="spellStart"/>
       <w:r>
         <w:t>member</w:t>
       </w:r>
+      <w:proofErr w:type="spellEnd"/>
       <w:r>
         <w:t>")</w:t>
       </w:r>
@@ -1071,13 +1242,26 @@
         <w:t xml:space="preserve"> : </w:t>
       </w:r>
       <w:r>
-        <w:t>=MOYENNE.SI.ENS(G:G; A:A; "</w:t>
-      </w:r>
+        <w:t>=</w:t>
+      </w:r>
+      <w:proofErr w:type="gramStart"/>
+      <w:r>
+        <w:t>MOYENNE.SI.ENS(</w:t>
+      </w:r>
+      <w:proofErr w:type="gramEnd"/>
+      <w:r>
+        <w:t>G:G; A:A; "</w:t>
+      </w:r>
+      <w:proofErr w:type="spellStart"/>
       <w:r>
         <w:t>classic</w:t>
       </w:r>
       <w:r>
-        <w:t>_bike"; F:F; "casual")</w:t>
+        <w:t>_bike</w:t>
+      </w:r>
+      <w:proofErr w:type="spellEnd"/>
+      <w:r>
+        <w:t>"; F:F; "casual")</w:t>
       </w:r>
       <w:r>
         <w:t xml:space="preserve"> </w:t>
@@ -1098,10 +1282,42 @@
         </w:numPr>
       </w:pPr>
       <w:r>
-        <w:t>Total de location de vélo electriques par des membre :</w:t>
-      </w:r>
-      <w:r>
-        <w:t xml:space="preserve"> =NB.SI.ENS(F:F; "member"; A:A; "electric_bike")</w:t>
+        <w:t xml:space="preserve">Total de location de vélo </w:t>
+      </w:r>
+      <w:proofErr w:type="spellStart"/>
+      <w:r>
+        <w:t>electriques</w:t>
+      </w:r>
+      <w:proofErr w:type="spellEnd"/>
+      <w:r>
+        <w:t xml:space="preserve"> par des membre :</w:t>
+      </w:r>
+      <w:r>
+        <w:t xml:space="preserve"> =</w:t>
+      </w:r>
+      <w:proofErr w:type="gramStart"/>
+      <w:r>
+        <w:t>NB.SI.ENS(</w:t>
+      </w:r>
+      <w:proofErr w:type="gramEnd"/>
+      <w:r>
+        <w:t>F:F; "</w:t>
+      </w:r>
+      <w:proofErr w:type="spellStart"/>
+      <w:r>
+        <w:t>member</w:t>
+      </w:r>
+      <w:proofErr w:type="spellEnd"/>
+      <w:r>
+        <w:t>"; A:A; "</w:t>
+      </w:r>
+      <w:proofErr w:type="spellStart"/>
+      <w:r>
+        <w:t>electric_bike</w:t>
+      </w:r>
+      <w:proofErr w:type="spellEnd"/>
+      <w:r>
+        <w:t>")</w:t>
       </w:r>
     </w:p>
     <w:p>
@@ -1109,10 +1325,34 @@
         <w:ind w:left="405"/>
       </w:pPr>
       <w:r>
-        <w:t xml:space="preserve">Total de location de vélo electriques par des utilisateur occasionnel : </w:t>
-      </w:r>
-      <w:r>
-        <w:t>=NB.SI.ENS(F:F; "casual"; A:A; "electric_bike")</w:t>
+        <w:t xml:space="preserve">Total de location de vélo </w:t>
+      </w:r>
+      <w:proofErr w:type="spellStart"/>
+      <w:r>
+        <w:t>electriques</w:t>
+      </w:r>
+      <w:proofErr w:type="spellEnd"/>
+      <w:r>
+        <w:t xml:space="preserve"> par des utilisateur occasionnel : </w:t>
+      </w:r>
+      <w:r>
+        <w:t>=</w:t>
+      </w:r>
+      <w:proofErr w:type="gramStart"/>
+      <w:r>
+        <w:t>NB.SI.ENS(</w:t>
+      </w:r>
+      <w:proofErr w:type="gramEnd"/>
+      <w:r>
+        <w:t>F:F; "casual"; A:A; "</w:t>
+      </w:r>
+      <w:proofErr w:type="spellStart"/>
+      <w:r>
+        <w:t>electric_bike</w:t>
+      </w:r>
+      <w:proofErr w:type="spellEnd"/>
+      <w:r>
+        <w:t>")</w:t>
       </w:r>
       <w:r>
         <w:t> </w:t>
@@ -1123,16 +1363,37 @@
         <w:ind w:left="405"/>
       </w:pPr>
       <w:r>
-        <w:t xml:space="preserve">Total de location de vélo classique par des utilisateurs occasioneels : </w:t>
-      </w:r>
-      <w:r>
-        <w:t>=NB.SI.ENS(F:F; "casual"; A:A; "</w:t>
-      </w:r>
+        <w:t xml:space="preserve">Total de location de vélo classique par des utilisateurs </w:t>
+      </w:r>
+      <w:proofErr w:type="spellStart"/>
+      <w:r>
+        <w:t>occasioneels</w:t>
+      </w:r>
+      <w:proofErr w:type="spellEnd"/>
+      <w:r>
+        <w:t xml:space="preserve"> : </w:t>
+      </w:r>
+      <w:r>
+        <w:t>=</w:t>
+      </w:r>
+      <w:proofErr w:type="gramStart"/>
+      <w:r>
+        <w:t>NB.SI.ENS(</w:t>
+      </w:r>
+      <w:proofErr w:type="gramEnd"/>
+      <w:r>
+        <w:t>F:F; "casual"; A:A; "</w:t>
+      </w:r>
+      <w:proofErr w:type="spellStart"/>
       <w:r>
         <w:t>classic</w:t>
       </w:r>
       <w:r>
-        <w:t>_bike")</w:t>
+        <w:t>_bike</w:t>
+      </w:r>
+      <w:proofErr w:type="spellEnd"/>
+      <w:r>
+        <w:t>")</w:t>
       </w:r>
     </w:p>
     <w:p>
@@ -1143,7 +1404,31 @@
         <w:t xml:space="preserve">Total de location de vélo classique par des membre : </w:t>
       </w:r>
       <w:r>
-        <w:t>=NB.SI.ENS(F:F; "member"; A:A; "classic_bike")</w:t>
+        <w:t>=</w:t>
+      </w:r>
+      <w:proofErr w:type="gramStart"/>
+      <w:r>
+        <w:t>NB.SI.ENS(</w:t>
+      </w:r>
+      <w:proofErr w:type="gramEnd"/>
+      <w:r>
+        <w:t>F:F; "</w:t>
+      </w:r>
+      <w:proofErr w:type="spellStart"/>
+      <w:r>
+        <w:t>member</w:t>
+      </w:r>
+      <w:proofErr w:type="spellEnd"/>
+      <w:r>
+        <w:t>"; A:A; "</w:t>
+      </w:r>
+      <w:proofErr w:type="spellStart"/>
+      <w:r>
+        <w:t>classic_bike</w:t>
+      </w:r>
+      <w:proofErr w:type="spellEnd"/>
+      <w:r>
+        <w:t>")</w:t>
       </w:r>
       <w:r>
         <w:t> </w:t>
@@ -1163,7 +1448,13 @@
         </w:numPr>
       </w:pPr>
       <w:r>
-        <w:t xml:space="preserve">Calcul total des trajet mensuel en vélo </w:t>
+        <w:t>Calcul total des traje</w:t>
+      </w:r>
+      <w:r>
+        <w:t>ts</w:t>
+      </w:r>
+      <w:r>
+        <w:t xml:space="preserve"> mensuel en vélo </w:t>
       </w:r>
       <w:r>
         <w:t>électrique</w:t>
@@ -1172,7 +1463,23 @@
         <w:t xml:space="preserve"> : </w:t>
       </w:r>
       <w:r>
-        <w:t>=NB.SI(A:A; "electric_bike")</w:t>
+        <w:t>=</w:t>
+      </w:r>
+      <w:proofErr w:type="gramStart"/>
+      <w:r>
+        <w:t>NB.SI(</w:t>
+      </w:r>
+      <w:proofErr w:type="gramEnd"/>
+      <w:r>
+        <w:t>A:A; "</w:t>
+      </w:r>
+      <w:proofErr w:type="spellStart"/>
+      <w:r>
+        <w:t>electric_bike</w:t>
+      </w:r>
+      <w:proofErr w:type="spellEnd"/>
+      <w:r>
+        <w:t>")</w:t>
       </w:r>
     </w:p>
     <w:p>
@@ -1180,10 +1487,32 @@
         <w:ind w:firstLine="405"/>
       </w:pPr>
       <w:r>
-        <w:t xml:space="preserve">Calcul total des trajet mensuel en vélo classique </w:t>
-      </w:r>
-      <w:r>
-        <w:t>=NB.SI(A:A; "classic_bike")</w:t>
+        <w:t>Calcul total des trajet</w:t>
+      </w:r>
+      <w:r>
+        <w:t>s</w:t>
+      </w:r>
+      <w:r>
+        <w:t xml:space="preserve"> mensuel en vélo classique </w:t>
+      </w:r>
+      <w:r>
+        <w:t>=</w:t>
+      </w:r>
+      <w:proofErr w:type="gramStart"/>
+      <w:r>
+        <w:t>NB.SI(</w:t>
+      </w:r>
+      <w:proofErr w:type="gramEnd"/>
+      <w:r>
+        <w:t>A:A; "</w:t>
+      </w:r>
+      <w:proofErr w:type="spellStart"/>
+      <w:r>
+        <w:t>classic_bike</w:t>
+      </w:r>
+      <w:proofErr w:type="spellEnd"/>
+      <w:r>
+        <w:t>")</w:t>
       </w:r>
     </w:p>
     <w:p/>
@@ -1204,27 +1533,42 @@
         <w:t xml:space="preserve">membre en vélo électrique : </w:t>
       </w:r>
       <w:r>
-        <w:t>=MODE(SI((A:A="electric_bike")*(G:G="member");D:D))</w:t>
-      </w:r>
-    </w:p>
-    <w:p>
-      <w:r>
-        <w:t xml:space="preserve">Pour chaque mois calcul des jours de la semaine </w:t>
-      </w:r>
-      <w:r>
-        <w:t>préférés</w:t>
-      </w:r>
-      <w:r>
-        <w:t xml:space="preserve"> </w:t>
+        <w:t>=MODE(SI((</w:t>
+      </w:r>
+      <w:proofErr w:type="gramStart"/>
+      <w:r>
+        <w:t>A:A</w:t>
+      </w:r>
+      <w:proofErr w:type="gramEnd"/>
+      <w:r>
+        <w:t>="</w:t>
+      </w:r>
+      <w:proofErr w:type="spellStart"/>
+      <w:r>
+        <w:t>electric_bike</w:t>
+      </w:r>
+      <w:proofErr w:type="spellEnd"/>
+      <w:r>
+        <w:t>")*(G:G="</w:t>
+      </w:r>
+      <w:proofErr w:type="spellStart"/>
+      <w:r>
+        <w:t>member</w:t>
+      </w:r>
+      <w:proofErr w:type="spellEnd"/>
+      <w:r>
+        <w:t>");D:D))</w:t>
+      </w:r>
+    </w:p>
+    <w:p>
+      <w:r>
+        <w:t xml:space="preserve">Pour chaque mois calcul des jours de la semaine préférés </w:t>
       </w:r>
       <w:r>
         <w:t>des membres</w:t>
       </w:r>
       <w:r>
-        <w:t xml:space="preserve"> en vélo</w:t>
-      </w:r>
-      <w:r>
-        <w:t xml:space="preserve"> </w:t>
+        <w:t xml:space="preserve"> en vélo </w:t>
       </w:r>
       <w:r>
         <w:t>classique :</w:t>
@@ -1232,45 +1576,64 @@
     </w:p>
     <w:p>
       <w:r>
-        <w:t>=MODE(SI((A:A="</w:t>
-      </w:r>
+        <w:t>=MODE(SI((</w:t>
+      </w:r>
+      <w:proofErr w:type="gramStart"/>
+      <w:r>
+        <w:t>A:A</w:t>
+      </w:r>
+      <w:proofErr w:type="gramEnd"/>
+      <w:r>
+        <w:t>="</w:t>
+      </w:r>
+      <w:proofErr w:type="spellStart"/>
       <w:r>
         <w:t>classic</w:t>
       </w:r>
       <w:r>
-        <w:t>_bike")*(G:G="member");D:D))</w:t>
+        <w:t>_bike</w:t>
+      </w:r>
+      <w:proofErr w:type="spellEnd"/>
+      <w:r>
+        <w:t>")*(G:G="</w:t>
+      </w:r>
+      <w:proofErr w:type="spellStart"/>
+      <w:r>
+        <w:t>member</w:t>
+      </w:r>
+      <w:proofErr w:type="spellEnd"/>
+      <w:r>
+        <w:t>");D:D))</w:t>
       </w:r>
     </w:p>
     <w:p>
       <w:r>
         <w:lastRenderedPageBreak/>
-        <w:t xml:space="preserve">Pour chaque mois calcul des jours de la semaine </w:t>
-      </w:r>
-      <w:r>
-        <w:t>préférés</w:t>
-      </w:r>
-      <w:r>
-        <w:t xml:space="preserve"> des </w:t>
-      </w:r>
-      <w:r>
-        <w:t>non membre</w:t>
-      </w:r>
-      <w:r>
-        <w:t xml:space="preserve"> en vélo électrique</w:t>
-      </w:r>
-      <w:r>
-        <w:t> :</w:t>
-      </w:r>
-    </w:p>
-    <w:p>
-      <w:r>
-        <w:t>=MODE(SI((A:A="</w:t>
-      </w:r>
+        <w:t>Pour chaque mois calcul des jours de la semaine préférés des non membre en vélo électrique :</w:t>
+      </w:r>
+    </w:p>
+    <w:p>
+      <w:r>
+        <w:t>=MODE(SI((</w:t>
+      </w:r>
+      <w:proofErr w:type="gramStart"/>
+      <w:r>
+        <w:t>A:A</w:t>
+      </w:r>
+      <w:proofErr w:type="gramEnd"/>
+      <w:r>
+        <w:t>="</w:t>
+      </w:r>
+      <w:proofErr w:type="spellStart"/>
       <w:r>
         <w:t>electric</w:t>
       </w:r>
       <w:r>
-        <w:t>_bike")*(G:G="</w:t>
+        <w:t>_bike</w:t>
+      </w:r>
+      <w:proofErr w:type="spellEnd"/>
+      <w:r>
+        <w:t>")*(G:G="</w:t>
       </w:r>
       <w:r>
         <w:t>casual</w:t>
@@ -1281,30 +1644,31 @@
     </w:p>
     <w:p>
       <w:r>
-        <w:t xml:space="preserve">Pour chaque mois calcul des jours de la semaine </w:t>
-      </w:r>
-      <w:r>
-        <w:t>préférés</w:t>
-      </w:r>
-      <w:r>
-        <w:t xml:space="preserve"> des non membre en vélo </w:t>
-      </w:r>
-      <w:r>
-        <w:t>classique</w:t>
-      </w:r>
-      <w:r>
-        <w:t> :</w:t>
-      </w:r>
-    </w:p>
-    <w:p>
-      <w:r>
-        <w:t>=MODE(SI((A:A="</w:t>
-      </w:r>
+        <w:t>Pour chaque mois calcul des jours de la semaine préférés des non membre en vélo classique :</w:t>
+      </w:r>
+    </w:p>
+    <w:p>
+      <w:r>
+        <w:t>=MODE(SI((</w:t>
+      </w:r>
+      <w:proofErr w:type="gramStart"/>
+      <w:r>
+        <w:t>A:A</w:t>
+      </w:r>
+      <w:proofErr w:type="gramEnd"/>
+      <w:r>
+        <w:t>="</w:t>
+      </w:r>
+      <w:proofErr w:type="spellStart"/>
       <w:r>
         <w:t>classic</w:t>
       </w:r>
       <w:r>
-        <w:t>_bike")*(G:G="</w:t>
+        <w:t>_bike</w:t>
+      </w:r>
+      <w:proofErr w:type="spellEnd"/>
+      <w:r>
+        <w:t>")*(G:G="</w:t>
       </w:r>
       <w:r>
         <w:t>casual</w:t>
@@ -1377,11 +1741,40 @@
         </w:numPr>
       </w:pPr>
       <w:r>
-        <w:t>Création d’un TCD avec comme colonnes : name_stations ; somme_dépôt ; somme_retraits ; somme_différence_</w:t>
+        <w:t xml:space="preserve">Création d’un TCD avec comme colonnes : </w:t>
+      </w:r>
+      <w:proofErr w:type="spellStart"/>
+      <w:r>
+        <w:t>name_stations</w:t>
+      </w:r>
+      <w:proofErr w:type="spellEnd"/>
+      <w:r>
+        <w:t xml:space="preserve"> ; </w:t>
+      </w:r>
+      <w:proofErr w:type="spellStart"/>
+      <w:r>
+        <w:t>somme_dépôt</w:t>
+      </w:r>
+      <w:proofErr w:type="spellEnd"/>
+      <w:r>
+        <w:t xml:space="preserve"> ; </w:t>
+      </w:r>
+      <w:proofErr w:type="spellStart"/>
+      <w:r>
+        <w:t>somme_retraits</w:t>
+      </w:r>
+      <w:proofErr w:type="spellEnd"/>
+      <w:r>
+        <w:t xml:space="preserve"> ; </w:t>
+      </w:r>
+      <w:proofErr w:type="spellStart"/>
+      <w:r>
+        <w:t>somme_différence_</w:t>
       </w:r>
       <w:r>
         <w:t>d</w:t>
       </w:r>
+      <w:proofErr w:type="spellEnd"/>
       <w:r>
         <w:t>/</w:t>
       </w:r>
@@ -1398,13 +1791,21 @@
         </w:numPr>
       </w:pPr>
       <w:r>
-        <w:t>Classement des station du chiffre « </w:t>
-      </w:r>
-      <w:r>
-        <w:t>somme_différence_e/s</w:t>
-      </w:r>
-      <w:r>
-        <w:t> » du plus petit au plus grand grâce au tri.</w:t>
+        <w:t>Classement des station</w:t>
+      </w:r>
+      <w:r>
+        <w:t>s</w:t>
+      </w:r>
+      <w:r>
+        <w:t xml:space="preserve"> du chiffre « </w:t>
+      </w:r>
+      <w:proofErr w:type="spellStart"/>
+      <w:r>
+        <w:t>somme_différence_e</w:t>
+      </w:r>
+      <w:proofErr w:type="spellEnd"/>
+      <w:r>
+        <w:t>/s » du plus petit au plus grand grâce au tri.</w:t>
       </w:r>
     </w:p>
     <w:p/>
@@ -1440,8 +1841,36 @@
           <w:bCs/>
           <w:u w:val="single"/>
         </w:rPr>
-        <w:t>Création feuille de calcul « Station summary »</w:t>
-      </w:r>
+        <w:t>Création feuille de calcul « </w:t>
+      </w:r>
+      <w:proofErr w:type="spellStart"/>
+      <w:r>
+        <w:rPr>
+          <w:b/>
+          <w:bCs/>
+          <w:u w:val="single"/>
+        </w:rPr>
+        <w:t>TCD_total_</w:t>
+      </w:r>
+      <w:proofErr w:type="gramStart"/>
+      <w:r>
+        <w:rPr>
+          <w:b/>
+          <w:bCs/>
+          <w:u w:val="single"/>
+        </w:rPr>
+        <w:t>entrées</w:t>
+      </w:r>
+      <w:proofErr w:type="spellEnd"/>
+      <w:r>
+        <w:rPr>
+          <w:b/>
+          <w:bCs/>
+          <w:u w:val="single"/>
+        </w:rPr>
+        <w:t>»</w:t>
+      </w:r>
+      <w:proofErr w:type="gramEnd"/>
     </w:p>
     <w:p>
       <w:pPr>
@@ -1453,6 +1882,433 @@
           <w:u w:val="single"/>
         </w:rPr>
       </w:pPr>
+    </w:p>
+    <w:p>
+      <w:pPr>
+        <w:pStyle w:val="Paragraphedeliste"/>
+        <w:ind w:left="405"/>
+        <w:rPr>
+          <w:b/>
+          <w:bCs/>
+          <w:u w:val="single"/>
+        </w:rPr>
+      </w:pPr>
+      <w:r>
+        <w:rPr>
+          <w:b/>
+          <w:bCs/>
+          <w:u w:val="single"/>
+        </w:rPr>
+        <w:t>3 :</w:t>
+      </w:r>
+      <w:r>
+        <w:rPr>
+          <w:b/>
+          <w:bCs/>
+          <w:u w:val="single"/>
+        </w:rPr>
+        <w:t xml:space="preserve"> </w:t>
+      </w:r>
+      <w:r>
+        <w:rPr>
+          <w:b/>
+          <w:bCs/>
+          <w:u w:val="single"/>
+        </w:rPr>
+        <w:t>Création feuille de calcul « </w:t>
+      </w:r>
+      <w:proofErr w:type="spellStart"/>
+      <w:r>
+        <w:rPr>
+          <w:b/>
+          <w:bCs/>
+          <w:u w:val="single"/>
+        </w:rPr>
+        <w:t>classement_</w:t>
+      </w:r>
+      <w:proofErr w:type="gramStart"/>
+      <w:r>
+        <w:rPr>
+          <w:b/>
+          <w:bCs/>
+          <w:u w:val="single"/>
+        </w:rPr>
+        <w:t>stations</w:t>
+      </w:r>
+      <w:proofErr w:type="spellEnd"/>
+      <w:r>
+        <w:rPr>
+          <w:b/>
+          <w:bCs/>
+          <w:u w:val="single"/>
+        </w:rPr>
+        <w:t>»</w:t>
+      </w:r>
+      <w:proofErr w:type="gramEnd"/>
+    </w:p>
+    <w:p>
+      <w:pPr>
+        <w:pStyle w:val="Paragraphedeliste"/>
+        <w:ind w:left="405"/>
+        <w:rPr>
+          <w:b/>
+          <w:bCs/>
+          <w:u w:val="single"/>
+        </w:rPr>
+      </w:pPr>
+    </w:p>
+    <w:p>
+      <w:pPr>
+        <w:pStyle w:val="Paragraphedeliste"/>
+        <w:ind w:left="405"/>
+      </w:pPr>
+      <w:r>
+        <w:t xml:space="preserve">Grace aux filtres appliqués sur le TCD de la feuille de calcul </w:t>
+      </w:r>
+      <w:proofErr w:type="spellStart"/>
+      <w:r>
+        <w:t>TCD_total_entrées</w:t>
+      </w:r>
+      <w:proofErr w:type="spellEnd"/>
+      <w:r>
+        <w:t xml:space="preserve"> j’en ai déduit les :</w:t>
+      </w:r>
+    </w:p>
+    <w:p>
+      <w:pPr>
+        <w:pStyle w:val="Paragraphedeliste"/>
+        <w:numPr>
+          <w:ilvl w:val="0"/>
+          <w:numId w:val="3"/>
+        </w:numPr>
+        <w:spacing w:after="0" w:line="240" w:lineRule="auto"/>
+        <w:rPr>
+          <w:rFonts w:ascii="Aptos Narrow" w:eastAsia="Times New Roman" w:hAnsi="Aptos Narrow" w:cs="Times New Roman"/>
+          <w:color w:val="000000"/>
+          <w:kern w:val="0"/>
+          <w:sz w:val="22"/>
+          <w:szCs w:val="22"/>
+          <w:lang w:eastAsia="fr-FR"/>
+          <w14:ligatures w14:val="none"/>
+        </w:rPr>
+      </w:pPr>
+      <w:r>
+        <w:rPr>
+          <w:rFonts w:ascii="Aptos Narrow" w:eastAsia="Times New Roman" w:hAnsi="Aptos Narrow" w:cs="Times New Roman"/>
+          <w:color w:val="000000"/>
+          <w:kern w:val="0"/>
+          <w:sz w:val="22"/>
+          <w:szCs w:val="22"/>
+          <w:lang w:eastAsia="fr-FR"/>
+          <w14:ligatures w14:val="none"/>
+        </w:rPr>
+        <w:t>5 Station</w:t>
+      </w:r>
+      <w:r>
+        <w:rPr>
+          <w:rFonts w:ascii="Aptos Narrow" w:eastAsia="Times New Roman" w:hAnsi="Aptos Narrow" w:cs="Times New Roman"/>
+          <w:color w:val="000000"/>
+          <w:kern w:val="0"/>
+          <w:sz w:val="22"/>
+          <w:szCs w:val="22"/>
+          <w:lang w:eastAsia="fr-FR"/>
+          <w14:ligatures w14:val="none"/>
+        </w:rPr>
+        <w:t>s</w:t>
+      </w:r>
+      <w:r>
+        <w:rPr>
+          <w:rFonts w:ascii="Aptos Narrow" w:eastAsia="Times New Roman" w:hAnsi="Aptos Narrow" w:cs="Times New Roman"/>
+          <w:color w:val="000000"/>
+          <w:kern w:val="0"/>
+          <w:sz w:val="22"/>
+          <w:szCs w:val="22"/>
+          <w:lang w:eastAsia="fr-FR"/>
+          <w14:ligatures w14:val="none"/>
+        </w:rPr>
+        <w:t xml:space="preserve"> plus fréquentées retrait</w:t>
+      </w:r>
+    </w:p>
+    <w:p>
+      <w:pPr>
+        <w:pStyle w:val="Paragraphedeliste"/>
+        <w:numPr>
+          <w:ilvl w:val="0"/>
+          <w:numId w:val="3"/>
+        </w:numPr>
+        <w:spacing w:after="0" w:line="240" w:lineRule="auto"/>
+        <w:rPr>
+          <w:rFonts w:ascii="Aptos Narrow" w:eastAsia="Times New Roman" w:hAnsi="Aptos Narrow" w:cs="Times New Roman"/>
+          <w:color w:val="000000"/>
+          <w:kern w:val="0"/>
+          <w:sz w:val="22"/>
+          <w:szCs w:val="22"/>
+          <w:lang w:eastAsia="fr-FR"/>
+          <w14:ligatures w14:val="none"/>
+        </w:rPr>
+      </w:pPr>
+      <w:r>
+        <w:t xml:space="preserve">5 </w:t>
+      </w:r>
+      <w:r>
+        <w:t>Station</w:t>
+      </w:r>
+      <w:r>
+        <w:t>s</w:t>
+      </w:r>
+      <w:r>
+        <w:t xml:space="preserve"> moins fréquentées retrait</w:t>
+      </w:r>
+    </w:p>
+    <w:p>
+      <w:pPr>
+        <w:pStyle w:val="Paragraphedeliste"/>
+        <w:numPr>
+          <w:ilvl w:val="0"/>
+          <w:numId w:val="3"/>
+        </w:numPr>
+        <w:spacing w:after="0" w:line="240" w:lineRule="auto"/>
+        <w:rPr>
+          <w:rFonts w:ascii="Aptos Narrow" w:eastAsia="Times New Roman" w:hAnsi="Aptos Narrow" w:cs="Times New Roman"/>
+          <w:color w:val="000000"/>
+          <w:kern w:val="0"/>
+          <w:sz w:val="22"/>
+          <w:szCs w:val="22"/>
+          <w:lang w:eastAsia="fr-FR"/>
+          <w14:ligatures w14:val="none"/>
+        </w:rPr>
+      </w:pPr>
+      <w:r>
+        <w:rPr>
+          <w:rFonts w:ascii="Aptos Narrow" w:eastAsia="Times New Roman" w:hAnsi="Aptos Narrow" w:cs="Times New Roman"/>
+          <w:color w:val="000000"/>
+          <w:kern w:val="0"/>
+          <w:sz w:val="22"/>
+          <w:szCs w:val="22"/>
+          <w:lang w:eastAsia="fr-FR"/>
+          <w14:ligatures w14:val="none"/>
+        </w:rPr>
+        <w:t xml:space="preserve">5 </w:t>
+      </w:r>
+      <w:r>
+        <w:rPr>
+          <w:rFonts w:ascii="Aptos Narrow" w:eastAsia="Times New Roman" w:hAnsi="Aptos Narrow" w:cs="Times New Roman"/>
+          <w:color w:val="000000"/>
+          <w:kern w:val="0"/>
+          <w:sz w:val="22"/>
+          <w:szCs w:val="22"/>
+          <w:lang w:eastAsia="fr-FR"/>
+          <w14:ligatures w14:val="none"/>
+        </w:rPr>
+        <w:t>Station</w:t>
+      </w:r>
+      <w:r>
+        <w:rPr>
+          <w:rFonts w:ascii="Aptos Narrow" w:eastAsia="Times New Roman" w:hAnsi="Aptos Narrow" w:cs="Times New Roman"/>
+          <w:color w:val="000000"/>
+          <w:kern w:val="0"/>
+          <w:sz w:val="22"/>
+          <w:szCs w:val="22"/>
+          <w:lang w:eastAsia="fr-FR"/>
+          <w14:ligatures w14:val="none"/>
+        </w:rPr>
+        <w:t>s</w:t>
+      </w:r>
+      <w:r>
+        <w:rPr>
+          <w:rFonts w:ascii="Aptos Narrow" w:eastAsia="Times New Roman" w:hAnsi="Aptos Narrow" w:cs="Times New Roman"/>
+          <w:color w:val="000000"/>
+          <w:kern w:val="0"/>
+          <w:sz w:val="22"/>
+          <w:szCs w:val="22"/>
+          <w:lang w:eastAsia="fr-FR"/>
+          <w14:ligatures w14:val="none"/>
+        </w:rPr>
+        <w:t xml:space="preserve"> plus fréquentées dépôt</w:t>
+      </w:r>
+    </w:p>
+    <w:p>
+      <w:pPr>
+        <w:pStyle w:val="Paragraphedeliste"/>
+        <w:numPr>
+          <w:ilvl w:val="0"/>
+          <w:numId w:val="3"/>
+        </w:numPr>
+        <w:spacing w:after="0" w:line="240" w:lineRule="auto"/>
+        <w:rPr>
+          <w:rFonts w:ascii="Aptos Narrow" w:eastAsia="Times New Roman" w:hAnsi="Aptos Narrow" w:cs="Times New Roman"/>
+          <w:color w:val="000000"/>
+          <w:kern w:val="0"/>
+          <w:sz w:val="22"/>
+          <w:szCs w:val="22"/>
+          <w:lang w:eastAsia="fr-FR"/>
+          <w14:ligatures w14:val="none"/>
+        </w:rPr>
+      </w:pPr>
+      <w:r>
+        <w:rPr>
+          <w:rFonts w:ascii="Aptos Narrow" w:eastAsia="Times New Roman" w:hAnsi="Aptos Narrow" w:cs="Times New Roman"/>
+          <w:color w:val="000000"/>
+          <w:kern w:val="0"/>
+          <w:sz w:val="22"/>
+          <w:szCs w:val="22"/>
+          <w:lang w:eastAsia="fr-FR"/>
+          <w14:ligatures w14:val="none"/>
+        </w:rPr>
+        <w:t>5 Station</w:t>
+      </w:r>
+      <w:r>
+        <w:rPr>
+          <w:rFonts w:ascii="Aptos Narrow" w:eastAsia="Times New Roman" w:hAnsi="Aptos Narrow" w:cs="Times New Roman"/>
+          <w:color w:val="000000"/>
+          <w:kern w:val="0"/>
+          <w:sz w:val="22"/>
+          <w:szCs w:val="22"/>
+          <w:lang w:eastAsia="fr-FR"/>
+          <w14:ligatures w14:val="none"/>
+        </w:rPr>
+        <w:t>s</w:t>
+      </w:r>
+      <w:r>
+        <w:rPr>
+          <w:rFonts w:ascii="Aptos Narrow" w:eastAsia="Times New Roman" w:hAnsi="Aptos Narrow" w:cs="Times New Roman"/>
+          <w:color w:val="000000"/>
+          <w:kern w:val="0"/>
+          <w:sz w:val="22"/>
+          <w:szCs w:val="22"/>
+          <w:lang w:eastAsia="fr-FR"/>
+          <w14:ligatures w14:val="none"/>
+        </w:rPr>
+        <w:t xml:space="preserve"> moins fréquentées dépôt</w:t>
+      </w:r>
+    </w:p>
+    <w:p>
+      <w:pPr>
+        <w:pStyle w:val="Paragraphedeliste"/>
+        <w:numPr>
+          <w:ilvl w:val="0"/>
+          <w:numId w:val="3"/>
+        </w:numPr>
+        <w:spacing w:after="0" w:line="240" w:lineRule="auto"/>
+        <w:rPr>
+          <w:rFonts w:ascii="Aptos Narrow" w:eastAsia="Times New Roman" w:hAnsi="Aptos Narrow" w:cs="Times New Roman"/>
+          <w:color w:val="000000"/>
+          <w:kern w:val="0"/>
+          <w:sz w:val="22"/>
+          <w:szCs w:val="22"/>
+          <w:lang w:eastAsia="fr-FR"/>
+          <w14:ligatures w14:val="none"/>
+        </w:rPr>
+      </w:pPr>
+      <w:r>
+        <w:rPr>
+          <w:rFonts w:ascii="Aptos Narrow" w:eastAsia="Times New Roman" w:hAnsi="Aptos Narrow" w:cs="Times New Roman"/>
+          <w:color w:val="000000"/>
+          <w:kern w:val="0"/>
+          <w:sz w:val="22"/>
+          <w:szCs w:val="22"/>
+          <w:lang w:eastAsia="fr-FR"/>
+          <w14:ligatures w14:val="none"/>
+        </w:rPr>
+        <w:t>5 Stations + Diff e/s</w:t>
+      </w:r>
+    </w:p>
+    <w:p>
+      <w:pPr>
+        <w:pStyle w:val="Paragraphedeliste"/>
+        <w:numPr>
+          <w:ilvl w:val="0"/>
+          <w:numId w:val="3"/>
+        </w:numPr>
+        <w:spacing w:after="0" w:line="240" w:lineRule="auto"/>
+        <w:rPr>
+          <w:rFonts w:ascii="Aptos Narrow" w:eastAsia="Times New Roman" w:hAnsi="Aptos Narrow" w:cs="Times New Roman"/>
+          <w:color w:val="000000"/>
+          <w:kern w:val="0"/>
+          <w:sz w:val="22"/>
+          <w:szCs w:val="22"/>
+          <w:lang w:eastAsia="fr-FR"/>
+          <w14:ligatures w14:val="none"/>
+        </w:rPr>
+      </w:pPr>
+      <w:r>
+        <w:rPr>
+          <w:rFonts w:ascii="Aptos Narrow" w:eastAsia="Times New Roman" w:hAnsi="Aptos Narrow" w:cs="Times New Roman"/>
+          <w:color w:val="000000"/>
+          <w:kern w:val="0"/>
+          <w:sz w:val="22"/>
+          <w:szCs w:val="22"/>
+          <w:lang w:eastAsia="fr-FR"/>
+          <w14:ligatures w14:val="none"/>
+        </w:rPr>
+        <w:t>5 Stations - Diff e/s</w:t>
+      </w:r>
+    </w:p>
+    <w:p>
+      <w:pPr>
+        <w:pStyle w:val="Paragraphedeliste"/>
+        <w:ind w:left="405"/>
+        <w:rPr>
+          <w:b/>
+          <w:bCs/>
+          <w:u w:val="single"/>
+        </w:rPr>
+      </w:pPr>
+    </w:p>
+    <w:p>
+      <w:pPr>
+        <w:pStyle w:val="Paragraphedeliste"/>
+        <w:ind w:left="405"/>
+        <w:rPr>
+          <w:b/>
+          <w:bCs/>
+          <w:u w:val="single"/>
+        </w:rPr>
+      </w:pPr>
+      <w:r>
+        <w:rPr>
+          <w:b/>
+          <w:bCs/>
+          <w:u w:val="single"/>
+        </w:rPr>
+        <w:t>4 : Création de la table « </w:t>
+      </w:r>
+      <w:proofErr w:type="spellStart"/>
+      <w:r>
+        <w:rPr>
+          <w:b/>
+          <w:bCs/>
+          <w:u w:val="single"/>
+        </w:rPr>
+        <w:t>monthly</w:t>
+      </w:r>
+      <w:proofErr w:type="spellEnd"/>
+      <w:r>
+        <w:rPr>
+          <w:b/>
+          <w:bCs/>
+          <w:u w:val="single"/>
+        </w:rPr>
+        <w:t xml:space="preserve"> </w:t>
+      </w:r>
+      <w:proofErr w:type="spellStart"/>
+      <w:r>
+        <w:rPr>
+          <w:b/>
+          <w:bCs/>
+          <w:u w:val="single"/>
+        </w:rPr>
+        <w:t>summary</w:t>
+      </w:r>
+      <w:proofErr w:type="spellEnd"/>
+      <w:r>
+        <w:rPr>
+          <w:b/>
+          <w:bCs/>
+          <w:u w:val="single"/>
+        </w:rPr>
+        <w:t> »</w:t>
+      </w:r>
     </w:p>
     <w:p>
       <w:pPr>
@@ -1461,28 +2317,48 @@
           <w:ilvl w:val="0"/>
           <w:numId w:val="1"/>
         </w:numPr>
-        <w:rPr>
-          <w:b/>
-          <w:bCs/>
-          <w:u w:val="single"/>
-        </w:rPr>
-      </w:pPr>
-      <w:r>
-        <w:t xml:space="preserve">Récupération de tous les noms des stations de vélo (Une ligne = une station) </w:t>
-      </w:r>
-    </w:p>
-    <w:p>
-      <w:pPr>
-        <w:pStyle w:val="Paragraphedeliste"/>
-        <w:ind w:left="405"/>
-        <w:rPr>
-          <w:b/>
-          <w:bCs/>
-          <w:u w:val="single"/>
-        </w:rPr>
-      </w:pPr>
-      <w:r>
-        <w:t>=TRIER(UNIQUE(‘01-2025’!E2 :E9999999)</w:t>
+      </w:pPr>
+      <w:r>
+        <w:t>Grace à des formules j’en ai déduit ! la moyenne de location de vélo électrique « </w:t>
+      </w:r>
+      <w:proofErr w:type="spellStart"/>
+      <w:r>
+        <w:t>avg_elec_bike</w:t>
+      </w:r>
+      <w:proofErr w:type="spellEnd"/>
+      <w:r>
+        <w:t xml:space="preserve"> » </w:t>
+      </w:r>
+      <w:r>
+        <w:t>=MOYENNE('01-</w:t>
+      </w:r>
+      <w:proofErr w:type="gramStart"/>
+      <w:r>
+        <w:t>2025:</w:t>
+      </w:r>
+      <w:proofErr w:type="gramEnd"/>
+      <w:r>
+        <w:t>12-2025'!L5)</w:t>
+      </w:r>
+      <w:r>
+        <w:t xml:space="preserve">, et, </w:t>
+      </w:r>
+      <w:r>
+        <w:t xml:space="preserve">la moyenne de location de vélo </w:t>
+      </w:r>
+      <w:r>
+        <w:t>classique « </w:t>
+      </w:r>
+      <w:proofErr w:type="spellStart"/>
+      <w:r>
+        <w:t>avg_classic_bike</w:t>
+      </w:r>
+      <w:proofErr w:type="spellEnd"/>
+      <w:r>
+        <w:t xml:space="preserve"> » </w:t>
+      </w:r>
+      <w:r>
+        <w:t>=MOYENNE('01-2025:12-2025'!M5)</w:t>
       </w:r>
     </w:p>
     <w:p>
@@ -1492,50 +2368,62 @@
           <w:ilvl w:val="0"/>
           <w:numId w:val="1"/>
         </w:numPr>
-        <w:rPr>
-          <w:b/>
-          <w:bCs/>
-          <w:u w:val="single"/>
-        </w:rPr>
-      </w:pPr>
-      <w:r>
-        <w:t xml:space="preserve">Création de 3 colonnes par mois : Une qui ressence les retrait ; une qui ressence les dépôts, et une qui ressence la différence entre les dépôt et retraits. </w:t>
-      </w:r>
-    </w:p>
-    <w:p>
-      <w:pPr>
-        <w:pStyle w:val="Paragraphedeliste"/>
-        <w:ind w:left="405"/>
-      </w:pPr>
-      <w:r>
-        <w:t xml:space="preserve">Ex : </w:t>
-      </w:r>
-      <w:r>
-        <w:t>=NB.SI.ENS('01-2025'!E:E;'stations summary'!A2)</w:t>
-      </w:r>
-    </w:p>
-    <w:p>
-      <w:pPr>
-        <w:pStyle w:val="Paragraphedeliste"/>
-        <w:ind w:left="708"/>
-      </w:pPr>
-      <w:r>
-        <w:t xml:space="preserve">  </w:t>
-      </w:r>
-      <w:r>
-        <w:t>=NB.SI.ENS('01-2025'!F:F;'stations summary'!A2)</w:t>
-      </w:r>
-    </w:p>
-    <w:p>
-      <w:pPr>
-        <w:pStyle w:val="Paragraphedeliste"/>
-        <w:ind w:left="405"/>
-      </w:pPr>
-      <w:r>
-        <w:t xml:space="preserve">        </w:t>
-      </w:r>
-      <w:r>
-        <w:t>=B2-C2</w:t>
+      </w:pPr>
+      <w:r>
+        <w:t>Le % de location des vélo classique « </w:t>
+      </w:r>
+      <w:r>
+        <w:t xml:space="preserve">% </w:t>
+      </w:r>
+      <w:proofErr w:type="spellStart"/>
+      <w:r>
+        <w:t>classic</w:t>
+      </w:r>
+      <w:proofErr w:type="spellEnd"/>
+      <w:r>
+        <w:t xml:space="preserve"> » </w:t>
+      </w:r>
+      <w:r>
+        <w:t>=(J2+I</w:t>
+      </w:r>
+      <w:proofErr w:type="gramStart"/>
+      <w:r>
+        <w:t>2)/</w:t>
+      </w:r>
+      <w:proofErr w:type="gramEnd"/>
+      <w:r>
+        <w:t>K2</w:t>
+      </w:r>
+      <w:r>
+        <w:t xml:space="preserve">, </w:t>
+      </w:r>
+      <w:r>
+        <w:t xml:space="preserve">Le % de location des vélo </w:t>
+      </w:r>
+      <w:proofErr w:type="spellStart"/>
+      <w:r>
+        <w:t>electrique</w:t>
+      </w:r>
+      <w:proofErr w:type="spellEnd"/>
+      <w:r>
+        <w:t xml:space="preserve"> </w:t>
+      </w:r>
+      <w:r>
+        <w:t>« </w:t>
+      </w:r>
+      <w:r>
+        <w:t xml:space="preserve">% </w:t>
+      </w:r>
+      <w:proofErr w:type="spellStart"/>
+      <w:r>
+        <w:t>electrique</w:t>
+      </w:r>
+      <w:proofErr w:type="spellEnd"/>
+      <w:r>
+        <w:t xml:space="preserve"> » </w:t>
+      </w:r>
+      <w:r>
+        <w:t>=(G2+H2)/K2</w:t>
       </w:r>
     </w:p>
     <w:p>
@@ -1545,56 +2433,371 @@
           <w:ilvl w:val="0"/>
           <w:numId w:val="1"/>
         </w:numPr>
+      </w:pPr>
+      <w:r>
+        <w:t>-  Le total de location vélo électrique non membre et le % « </w:t>
+      </w:r>
+      <w:proofErr w:type="spellStart"/>
+      <w:r>
+        <w:t>Casual_elec</w:t>
+      </w:r>
+      <w:proofErr w:type="spellEnd"/>
+      <w:r>
+        <w:t xml:space="preserve"> » </w:t>
+      </w:r>
+      <w:r>
+        <w:t>=SOMME('01-</w:t>
+      </w:r>
+      <w:proofErr w:type="gramStart"/>
+      <w:r>
+        <w:t>2025:</w:t>
+      </w:r>
+      <w:proofErr w:type="gramEnd"/>
+      <w:r>
+        <w:t>12-2025'!L6)</w:t>
+      </w:r>
+      <w:r>
+        <w:t xml:space="preserve">, </w:t>
+      </w:r>
+      <w:r>
+        <w:t>=G2/K2</w:t>
+      </w:r>
+    </w:p>
+    <w:p>
+      <w:pPr>
+        <w:pStyle w:val="Paragraphedeliste"/>
+        <w:numPr>
+          <w:ilvl w:val="0"/>
+          <w:numId w:val="3"/>
+        </w:numPr>
+      </w:pPr>
+      <w:r>
+        <w:t>Le total de location vélo électrique membre et le %</w:t>
+      </w:r>
+      <w:r>
+        <w:t xml:space="preserve"> « </w:t>
+      </w:r>
+      <w:proofErr w:type="spellStart"/>
+      <w:r>
+        <w:t>member_elec</w:t>
+      </w:r>
+      <w:proofErr w:type="spellEnd"/>
+      <w:r>
+        <w:t xml:space="preserve"> » </w:t>
+      </w:r>
+      <w:r>
+        <w:t>=SOMME('01-</w:t>
+      </w:r>
+      <w:proofErr w:type="gramStart"/>
+      <w:r>
+        <w:t>2025:</w:t>
+      </w:r>
+      <w:proofErr w:type="gramEnd"/>
+      <w:r>
+        <w:t>12-2025'!L7)</w:t>
+      </w:r>
+      <w:r>
+        <w:t xml:space="preserve">, </w:t>
+      </w:r>
+      <w:r>
+        <w:t>=H2/K2</w:t>
+      </w:r>
+    </w:p>
+    <w:p>
+      <w:pPr>
+        <w:pStyle w:val="Paragraphedeliste"/>
+        <w:numPr>
+          <w:ilvl w:val="0"/>
+          <w:numId w:val="3"/>
+        </w:numPr>
+      </w:pPr>
+      <w:r>
+        <w:t xml:space="preserve">Le total de location vélo </w:t>
+      </w:r>
+      <w:r>
+        <w:t>classique</w:t>
+      </w:r>
+      <w:r>
+        <w:t xml:space="preserve"> membre et le %</w:t>
+      </w:r>
+      <w:r>
+        <w:t xml:space="preserve"> « </w:t>
+      </w:r>
+      <w:proofErr w:type="spellStart"/>
+      <w:r>
+        <w:t>member_clessic</w:t>
+      </w:r>
+      <w:proofErr w:type="spellEnd"/>
+      <w:r>
+        <w:t xml:space="preserve"> » </w:t>
+      </w:r>
+      <w:r>
+        <w:t>=SOMME('01-</w:t>
+      </w:r>
+      <w:proofErr w:type="gramStart"/>
+      <w:r>
+        <w:t>2025:</w:t>
+      </w:r>
+      <w:proofErr w:type="gramEnd"/>
+      <w:r>
+        <w:t>12-2025'!M7)</w:t>
+      </w:r>
+      <w:r>
+        <w:t xml:space="preserve">, </w:t>
+      </w:r>
+      <w:r>
+        <w:t>=J2/K2</w:t>
+      </w:r>
+    </w:p>
+    <w:p>
+      <w:pPr>
+        <w:pStyle w:val="Paragraphedeliste"/>
+        <w:numPr>
+          <w:ilvl w:val="0"/>
+          <w:numId w:val="3"/>
+        </w:numPr>
+      </w:pPr>
+      <w:r>
+        <w:lastRenderedPageBreak/>
+        <w:t xml:space="preserve">Le total de location vélo classique </w:t>
+      </w:r>
+      <w:r>
+        <w:t xml:space="preserve">non </w:t>
+      </w:r>
+      <w:r>
+        <w:t>membre et le %</w:t>
+      </w:r>
+      <w:r>
+        <w:t xml:space="preserve"> « </w:t>
+      </w:r>
+      <w:proofErr w:type="spellStart"/>
+      <w:r>
+        <w:t>casual_classic</w:t>
+      </w:r>
+      <w:proofErr w:type="spellEnd"/>
+      <w:r>
+        <w:t xml:space="preserve"> » </w:t>
+      </w:r>
+      <w:r>
+        <w:t>=SOMME('01-</w:t>
+      </w:r>
+      <w:proofErr w:type="gramStart"/>
+      <w:r>
+        <w:t>2025:</w:t>
+      </w:r>
+      <w:proofErr w:type="gramEnd"/>
+      <w:r>
+        <w:t>12-2025'!M6)</w:t>
+      </w:r>
+      <w:r>
+        <w:t xml:space="preserve">, </w:t>
+      </w:r>
+      <w:r>
+        <w:t>=J2/K2</w:t>
+      </w:r>
+    </w:p>
+    <w:p>
+      <w:pPr>
+        <w:pStyle w:val="Paragraphedeliste"/>
+        <w:ind w:left="405"/>
+      </w:pPr>
+      <w:r>
+        <w:t xml:space="preserve">Ainsi que le total des location sur l’année 2025 : </w:t>
+      </w:r>
+      <w:r>
+        <w:t>=SOMME(G</w:t>
+      </w:r>
+      <w:proofErr w:type="gramStart"/>
+      <w:r>
+        <w:t>2;H</w:t>
+      </w:r>
+      <w:proofErr w:type="gramEnd"/>
+      <w:r>
+        <w:t>2;I2;J2)</w:t>
+      </w:r>
+    </w:p>
+    <w:p>
+      <w:pPr>
+        <w:pStyle w:val="Paragraphedeliste"/>
+        <w:ind w:left="405"/>
+      </w:pPr>
+    </w:p>
+    <w:p>
+      <w:pPr>
+        <w:pStyle w:val="Paragraphedeliste"/>
+        <w:numPr>
+          <w:ilvl w:val="0"/>
+          <w:numId w:val="1"/>
+        </w:numPr>
+      </w:pPr>
+      <w:r>
+        <w:t>Création d’un tableau récapitulatif des locations de vélo.</w:t>
+      </w:r>
+    </w:p>
+    <w:p>
+      <w:pPr>
+        <w:pStyle w:val="Paragraphedeliste"/>
+        <w:numPr>
+          <w:ilvl w:val="0"/>
+          <w:numId w:val="3"/>
+        </w:numPr>
+      </w:pPr>
+      <w:r>
+        <w:t xml:space="preserve">En ligne : </w:t>
+      </w:r>
+      <w:proofErr w:type="spellStart"/>
+      <w:r>
+        <w:t>Casual_elec</w:t>
+      </w:r>
+      <w:proofErr w:type="spellEnd"/>
+      <w:r>
+        <w:t xml:space="preserve">, </w:t>
+      </w:r>
+      <w:proofErr w:type="spellStart"/>
+      <w:r>
+        <w:t>casual_classic</w:t>
+      </w:r>
+      <w:proofErr w:type="spellEnd"/>
+      <w:r>
+        <w:t>,</w:t>
+      </w:r>
+      <w:r>
+        <w:t xml:space="preserve"> </w:t>
+      </w:r>
+      <w:proofErr w:type="spellStart"/>
+      <w:r>
+        <w:t>member_elec</w:t>
+      </w:r>
+      <w:proofErr w:type="spellEnd"/>
+      <w:r>
+        <w:t xml:space="preserve">, </w:t>
+      </w:r>
+      <w:proofErr w:type="spellStart"/>
+      <w:r>
+        <w:t>member_clessic</w:t>
+      </w:r>
+      <w:proofErr w:type="spellEnd"/>
+      <w:r>
+        <w:t xml:space="preserve">, et pour chaque : </w:t>
+      </w:r>
+      <w:r>
+        <w:t xml:space="preserve">nombre </w:t>
+      </w:r>
+      <w:r>
+        <w:t xml:space="preserve">total, </w:t>
+      </w:r>
+      <w:r>
+        <w:t xml:space="preserve">% </w:t>
+      </w:r>
+      <w:r>
+        <w:t>total</w:t>
+      </w:r>
+    </w:p>
+    <w:p>
+      <w:pPr>
+        <w:pStyle w:val="Paragraphedeliste"/>
+      </w:pPr>
+      <w:r>
+        <w:t>Ex :</w:t>
+      </w:r>
+      <w:r>
+        <w:t xml:space="preserve"> </w:t>
+      </w:r>
+      <w:r>
+        <w:t>=</w:t>
+      </w:r>
+      <w:proofErr w:type="gramStart"/>
+      <w:r>
+        <w:t>NB.SI.ENS(</w:t>
+      </w:r>
+      <w:proofErr w:type="gramEnd"/>
+      <w:r>
+        <w:t>'01-2025'!G:G; "casual"; '01-2025'!A:A; "</w:t>
+      </w:r>
+      <w:proofErr w:type="spellStart"/>
+      <w:r>
+        <w:t>electric_bike</w:t>
+      </w:r>
+      <w:proofErr w:type="spellEnd"/>
+      <w:r>
+        <w:t>")</w:t>
+      </w:r>
+      <w:r>
+        <w:t xml:space="preserve">, </w:t>
+      </w:r>
+      <w:r>
+        <w:t>=B7/K2</w:t>
+      </w:r>
+    </w:p>
+    <w:p>
+      <w:pPr>
+        <w:pStyle w:val="Paragraphedeliste"/>
+        <w:numPr>
+          <w:ilvl w:val="0"/>
+          <w:numId w:val="3"/>
+        </w:numPr>
+      </w:pPr>
+      <w:r>
+        <w:t xml:space="preserve">En colonne chaque mois de l’année de Janvier à décembre, et, le jour préféré des utilisateurs membre ou non membre, de location vélo </w:t>
+      </w:r>
+      <w:r>
+        <w:t>électrique</w:t>
+      </w:r>
+      <w:r>
+        <w:t xml:space="preserve">/ classique en récupérant le chiffre du jour le plus </w:t>
+      </w:r>
+      <w:r>
+        <w:t>fréquemment</w:t>
+      </w:r>
+      <w:r>
+        <w:t xml:space="preserve"> apparu dans la colonne « </w:t>
+      </w:r>
+      <w:proofErr w:type="spellStart"/>
+      <w:r>
+        <w:t>day_of_week</w:t>
+      </w:r>
+      <w:proofErr w:type="spellEnd"/>
+      <w:r>
+        <w:t xml:space="preserve"> » de chaque mois, et en le convertissant en nom du jour : </w:t>
+      </w:r>
+      <w:r>
+        <w:t>=MODE('01-2025</w:t>
+      </w:r>
+      <w:proofErr w:type="gramStart"/>
+      <w:r>
+        <w:t>'!L</w:t>
+      </w:r>
+      <w:proofErr w:type="gramEnd"/>
+      <w:r>
+        <w:t>10;'02-2025'!L10;'03-2025'!L10;'04-2025'!L10;'05-2025'!L10;'06-2025'!L10;'07-2025'!L10;'08-2025'!L10;'09-2025'!L10;'10-2025'!L10;'11-2025'!L10;'12-2025'!L10)</w:t>
+      </w:r>
+    </w:p>
+    <w:p>
+      <w:pPr>
+        <w:pStyle w:val="Paragraphedeliste"/>
+        <w:ind w:left="405"/>
+      </w:pPr>
+    </w:p>
+    <w:p>
+      <w:pPr>
+        <w:pStyle w:val="Paragraphedeliste"/>
+        <w:ind w:left="405"/>
         <w:rPr>
           <w:b/>
           <w:bCs/>
           <w:u w:val="single"/>
         </w:rPr>
       </w:pPr>
-      <w:r>
-        <w:t>Création en bout de tableau, une colonne : total_retrait ; total_dépot, total diff_d/r.</w:t>
-      </w:r>
     </w:p>
     <w:p>
       <w:pPr>
         <w:pStyle w:val="Paragraphedeliste"/>
         <w:ind w:left="405"/>
-      </w:pPr>
-      <w:r>
-        <w:t xml:space="preserve">ex : </w:t>
-      </w:r>
-      <w:r>
-        <w:t>=SOMME(B2;E2;H2;K2;N2;Q2;T2;W2;Z2;AC2;AF2;AI2)</w:t>
-      </w:r>
-    </w:p>
-    <w:p>
-      <w:pPr>
-        <w:pStyle w:val="Paragraphedeliste"/>
-        <w:ind w:left="708"/>
-      </w:pPr>
-      <w:r>
-        <w:t xml:space="preserve">  </w:t>
-      </w:r>
-      <w:r>
-        <w:t>=SOMME(C2;F2;I2;L2;O2;R2;U2;X2;AA2;AD2;AG2;AJ2)</w:t>
-      </w:r>
-    </w:p>
-    <w:p>
-      <w:pPr>
-        <w:pStyle w:val="Paragraphedeliste"/>
-        <w:ind w:left="708"/>
-      </w:pPr>
-      <w:r>
-        <w:t xml:space="preserve">  </w:t>
-      </w:r>
-      <w:r>
-        <w:t>=AM2-AL2</w:t>
-      </w:r>
-    </w:p>
-    <w:p>
-      <w:pPr>
-        <w:pStyle w:val="Paragraphedeliste"/>
-        <w:ind w:left="708"/>
+        <w:rPr>
+          <w:b/>
+          <w:bCs/>
+          <w:u w:val="single"/>
+        </w:rPr>
       </w:pPr>
     </w:p>
     <w:p/>
@@ -1612,6 +2815,119 @@
 <file path=word/numbering.xml><?xml version="1.0" encoding="utf-8"?>
 <w:numbering xmlns:wpc="http://schemas.microsoft.com/office/word/2010/wordprocessingCanvas" xmlns:cx="http://schemas.microsoft.com/office/drawing/2014/chartex" xmlns:cx1="http://schemas.microsoft.com/office/drawing/2015/9/8/chartex" xmlns:cx2="http://schemas.microsoft.com/office/drawing/2015/10/21/chartex" xmlns:cx3="http://schemas.microsoft.com/office/drawing/2016/5/9/chartex" xmlns:cx4="http://schemas.microsoft.com/office/drawing/2016/5/10/chartex" xmlns:cx5="http://schemas.microsoft.com/office/drawing/2016/5/11/chartex" xmlns:cx6="http://schemas.microsoft.com/office/drawing/2016/5/12/chartex" xmlns:cx7="http://schemas.microsoft.com/office/drawing/2016/5/13/chartex" xmlns:cx8="http://schemas.microsoft.com/office/drawing/2016/5/14/chartex" xmlns:mc="http://schemas.openxmlformats.org/markup-compatibility/2006" xmlns:aink="http://schemas.microsoft.com/office/drawing/2016/ink" xmlns:am3d="http://schemas.microsoft.com/office/drawing/2017/model3d" xmlns:o="urn:schemas-microsoft-com:office:office" xmlns:oel="http://schemas.microsoft.com/office/2019/extlst" xmlns:r="http://schemas.openxmlformats.org/officeDocument/2006/relationships" xmlns:m="http://schemas.openxmlformats.org/officeDocument/2006/math" xmlns:v="urn:schemas-microsoft-com:vml" xmlns:wp14="http://schemas.microsoft.com/office/word/2010/wordprocessingDrawing" xmlns:wp="http://schemas.openxmlformats.org/drawingml/2006/wordprocessingDrawing" xmlns:w10="urn:schemas-microsoft-com:office:word" xmlns:w="http://schemas.openxmlformats.org/wordprocessingml/2006/main" xmlns:w14="http://schemas.microsoft.com/office/word/2010/wordml" xmlns:w15="http://schemas.microsoft.com/office/word/2012/wordml" xmlns:w16cex="http://schemas.microsoft.com/office/word/2018/wordml/cex" xmlns:w16cid="http://schemas.microsoft.com/office/word/2016/wordml/cid" xmlns:w16="http://schemas.microsoft.com/office/word/2018/wordml" xmlns:w16sdtdh="http://schemas.microsoft.com/office/word/2020/wordml/sdtdatahash" xmlns:w16se="http://schemas.microsoft.com/office/word/2015/wordml/symex" xmlns:wpg="http://schemas.microsoft.com/office/word/2010/wordprocessingGroup" xmlns:wpi="http://schemas.microsoft.com/office/word/2010/wordprocessingInk" xmlns:wne="http://schemas.microsoft.com/office/word/2006/wordml" xmlns:wps="http://schemas.microsoft.com/office/word/2010/wordprocessingShape" mc:Ignorable="w14 w15 w16se w16cid w16 w16cex w16sdtdh wp14">
   <w:abstractNum w:abstractNumId="0" w15:restartNumberingAfterBreak="0">
+    <w:nsid w:val="0FD224E5"/>
+    <w:multiLevelType w:val="hybridMultilevel"/>
+    <w:tmpl w:val="91C24050"/>
+    <w:lvl w:ilvl="0" w:tplc="BC942F64">
+      <w:start w:val="5"/>
+      <w:numFmt w:val="bullet"/>
+      <w:lvlText w:val="-"/>
+      <w:lvlJc w:val="left"/>
+      <w:pPr>
+        <w:ind w:left="720" w:hanging="360"/>
+      </w:pPr>
+      <w:rPr>
+        <w:rFonts w:ascii="Aptos Narrow" w:eastAsia="Times New Roman" w:hAnsi="Aptos Narrow" w:cs="Times New Roman" w:hint="default"/>
+      </w:rPr>
+    </w:lvl>
+    <w:lvl w:ilvl="1" w:tplc="040C0003" w:tentative="1">
+      <w:start w:val="1"/>
+      <w:numFmt w:val="bullet"/>
+      <w:lvlText w:val="o"/>
+      <w:lvlJc w:val="left"/>
+      <w:pPr>
+        <w:ind w:left="1440" w:hanging="360"/>
+      </w:pPr>
+      <w:rPr>
+        <w:rFonts w:ascii="Courier New" w:hAnsi="Courier New" w:cs="Courier New" w:hint="default"/>
+      </w:rPr>
+    </w:lvl>
+    <w:lvl w:ilvl="2" w:tplc="040C0005" w:tentative="1">
+      <w:start w:val="1"/>
+      <w:numFmt w:val="bullet"/>
+      <w:lvlText w:val=""/>
+      <w:lvlJc w:val="left"/>
+      <w:pPr>
+        <w:ind w:left="2160" w:hanging="360"/>
+      </w:pPr>
+      <w:rPr>
+        <w:rFonts w:ascii="Wingdings" w:hAnsi="Wingdings" w:hint="default"/>
+      </w:rPr>
+    </w:lvl>
+    <w:lvl w:ilvl="3" w:tplc="040C0001" w:tentative="1">
+      <w:start w:val="1"/>
+      <w:numFmt w:val="bullet"/>
+      <w:lvlText w:val=""/>
+      <w:lvlJc w:val="left"/>
+      <w:pPr>
+        <w:ind w:left="2880" w:hanging="360"/>
+      </w:pPr>
+      <w:rPr>
+        <w:rFonts w:ascii="Symbol" w:hAnsi="Symbol" w:hint="default"/>
+      </w:rPr>
+    </w:lvl>
+    <w:lvl w:ilvl="4" w:tplc="040C0003" w:tentative="1">
+      <w:start w:val="1"/>
+      <w:numFmt w:val="bullet"/>
+      <w:lvlText w:val="o"/>
+      <w:lvlJc w:val="left"/>
+      <w:pPr>
+        <w:ind w:left="3600" w:hanging="360"/>
+      </w:pPr>
+      <w:rPr>
+        <w:rFonts w:ascii="Courier New" w:hAnsi="Courier New" w:cs="Courier New" w:hint="default"/>
+      </w:rPr>
+    </w:lvl>
+    <w:lvl w:ilvl="5" w:tplc="040C0005" w:tentative="1">
+      <w:start w:val="1"/>
+      <w:numFmt w:val="bullet"/>
+      <w:lvlText w:val=""/>
+      <w:lvlJc w:val="left"/>
+      <w:pPr>
+        <w:ind w:left="4320" w:hanging="360"/>
+      </w:pPr>
+      <w:rPr>
+        <w:rFonts w:ascii="Wingdings" w:hAnsi="Wingdings" w:hint="default"/>
+      </w:rPr>
+    </w:lvl>
+    <w:lvl w:ilvl="6" w:tplc="040C0001" w:tentative="1">
+      <w:start w:val="1"/>
+      <w:numFmt w:val="bullet"/>
+      <w:lvlText w:val=""/>
+      <w:lvlJc w:val="left"/>
+      <w:pPr>
+        <w:ind w:left="5040" w:hanging="360"/>
+      </w:pPr>
+      <w:rPr>
+        <w:rFonts w:ascii="Symbol" w:hAnsi="Symbol" w:hint="default"/>
+      </w:rPr>
+    </w:lvl>
+    <w:lvl w:ilvl="7" w:tplc="040C0003" w:tentative="1">
+      <w:start w:val="1"/>
+      <w:numFmt w:val="bullet"/>
+      <w:lvlText w:val="o"/>
+      <w:lvlJc w:val="left"/>
+      <w:pPr>
+        <w:ind w:left="5760" w:hanging="360"/>
+      </w:pPr>
+      <w:rPr>
+        <w:rFonts w:ascii="Courier New" w:hAnsi="Courier New" w:cs="Courier New" w:hint="default"/>
+      </w:rPr>
+    </w:lvl>
+    <w:lvl w:ilvl="8" w:tplc="040C0005" w:tentative="1">
+      <w:start w:val="1"/>
+      <w:numFmt w:val="bullet"/>
+      <w:lvlText w:val=""/>
+      <w:lvlJc w:val="left"/>
+      <w:pPr>
+        <w:ind w:left="6480" w:hanging="360"/>
+      </w:pPr>
+      <w:rPr>
+        <w:rFonts w:ascii="Wingdings" w:hAnsi="Wingdings" w:hint="default"/>
+      </w:rPr>
+    </w:lvl>
+  </w:abstractNum>
+  <w:abstractNum w:abstractNumId="1" w15:restartNumberingAfterBreak="0">
     <w:nsid w:val="41983045"/>
     <w:multiLevelType w:val="hybridMultilevel"/>
     <w:tmpl w:val="3E6E6F52"/>
@@ -1723,7 +3039,126 @@
       </w:rPr>
     </w:lvl>
   </w:abstractNum>
+  <w:abstractNum w:abstractNumId="2" w15:restartNumberingAfterBreak="0">
+    <w:nsid w:val="7C81345C"/>
+    <w:multiLevelType w:val="hybridMultilevel"/>
+    <w:tmpl w:val="5C361746"/>
+    <w:lvl w:ilvl="0" w:tplc="A41AEF56">
+      <w:start w:val="3"/>
+      <w:numFmt w:val="bullet"/>
+      <w:lvlText w:val="-"/>
+      <w:lvlJc w:val="left"/>
+      <w:pPr>
+        <w:ind w:left="765" w:hanging="360"/>
+      </w:pPr>
+      <w:rPr>
+        <w:rFonts w:ascii="Aptos" w:eastAsiaTheme="minorHAnsi" w:hAnsi="Aptos" w:cstheme="minorBidi" w:hint="default"/>
+      </w:rPr>
+    </w:lvl>
+    <w:lvl w:ilvl="1" w:tplc="040C0003" w:tentative="1">
+      <w:start w:val="1"/>
+      <w:numFmt w:val="bullet"/>
+      <w:lvlText w:val="o"/>
+      <w:lvlJc w:val="left"/>
+      <w:pPr>
+        <w:ind w:left="1485" w:hanging="360"/>
+      </w:pPr>
+      <w:rPr>
+        <w:rFonts w:ascii="Courier New" w:hAnsi="Courier New" w:cs="Courier New" w:hint="default"/>
+      </w:rPr>
+    </w:lvl>
+    <w:lvl w:ilvl="2" w:tplc="040C0005" w:tentative="1">
+      <w:start w:val="1"/>
+      <w:numFmt w:val="bullet"/>
+      <w:lvlText w:val=""/>
+      <w:lvlJc w:val="left"/>
+      <w:pPr>
+        <w:ind w:left="2205" w:hanging="360"/>
+      </w:pPr>
+      <w:rPr>
+        <w:rFonts w:ascii="Wingdings" w:hAnsi="Wingdings" w:hint="default"/>
+      </w:rPr>
+    </w:lvl>
+    <w:lvl w:ilvl="3" w:tplc="040C0001" w:tentative="1">
+      <w:start w:val="1"/>
+      <w:numFmt w:val="bullet"/>
+      <w:lvlText w:val=""/>
+      <w:lvlJc w:val="left"/>
+      <w:pPr>
+        <w:ind w:left="2925" w:hanging="360"/>
+      </w:pPr>
+      <w:rPr>
+        <w:rFonts w:ascii="Symbol" w:hAnsi="Symbol" w:hint="default"/>
+      </w:rPr>
+    </w:lvl>
+    <w:lvl w:ilvl="4" w:tplc="040C0003" w:tentative="1">
+      <w:start w:val="1"/>
+      <w:numFmt w:val="bullet"/>
+      <w:lvlText w:val="o"/>
+      <w:lvlJc w:val="left"/>
+      <w:pPr>
+        <w:ind w:left="3645" w:hanging="360"/>
+      </w:pPr>
+      <w:rPr>
+        <w:rFonts w:ascii="Courier New" w:hAnsi="Courier New" w:cs="Courier New" w:hint="default"/>
+      </w:rPr>
+    </w:lvl>
+    <w:lvl w:ilvl="5" w:tplc="040C0005" w:tentative="1">
+      <w:start w:val="1"/>
+      <w:numFmt w:val="bullet"/>
+      <w:lvlText w:val=""/>
+      <w:lvlJc w:val="left"/>
+      <w:pPr>
+        <w:ind w:left="4365" w:hanging="360"/>
+      </w:pPr>
+      <w:rPr>
+        <w:rFonts w:ascii="Wingdings" w:hAnsi="Wingdings" w:hint="default"/>
+      </w:rPr>
+    </w:lvl>
+    <w:lvl w:ilvl="6" w:tplc="040C0001" w:tentative="1">
+      <w:start w:val="1"/>
+      <w:numFmt w:val="bullet"/>
+      <w:lvlText w:val=""/>
+      <w:lvlJc w:val="left"/>
+      <w:pPr>
+        <w:ind w:left="5085" w:hanging="360"/>
+      </w:pPr>
+      <w:rPr>
+        <w:rFonts w:ascii="Symbol" w:hAnsi="Symbol" w:hint="default"/>
+      </w:rPr>
+    </w:lvl>
+    <w:lvl w:ilvl="7" w:tplc="040C0003" w:tentative="1">
+      <w:start w:val="1"/>
+      <w:numFmt w:val="bullet"/>
+      <w:lvlText w:val="o"/>
+      <w:lvlJc w:val="left"/>
+      <w:pPr>
+        <w:ind w:left="5805" w:hanging="360"/>
+      </w:pPr>
+      <w:rPr>
+        <w:rFonts w:ascii="Courier New" w:hAnsi="Courier New" w:cs="Courier New" w:hint="default"/>
+      </w:rPr>
+    </w:lvl>
+    <w:lvl w:ilvl="8" w:tplc="040C0005" w:tentative="1">
+      <w:start w:val="1"/>
+      <w:numFmt w:val="bullet"/>
+      <w:lvlText w:val=""/>
+      <w:lvlJc w:val="left"/>
+      <w:pPr>
+        <w:ind w:left="6525" w:hanging="360"/>
+      </w:pPr>
+      <w:rPr>
+        <w:rFonts w:ascii="Wingdings" w:hAnsi="Wingdings" w:hint="default"/>
+      </w:rPr>
+    </w:lvl>
+  </w:abstractNum>
   <w:num w:numId="1" w16cid:durableId="115294681">
+    <w:abstractNumId w:val="1"/>
+  </w:num>
+  <w:num w:numId="2" w16cid:durableId="1362633648">
+    <w:abstractNumId w:val="2"/>
+  </w:num>
+  <w:num w:numId="3" w16cid:durableId="765613467">
     <w:abstractNumId w:val="0"/>
   </w:num>
 </w:numbering>
@@ -2333,7 +3768,6 @@
   <w:style w:type="character" w:default="1" w:styleId="Policepardfaut">
     <w:name w:val="Default Paragraph Font"/>
     <w:uiPriority w:val="1"/>
-    <w:semiHidden/>
     <w:unhideWhenUsed/>
   </w:style>
   <w:style w:type="table" w:default="1" w:styleId="TableauNormal">

</xml_diff>

<commit_message>
finalisation de la présentation. premières représentations graphiques
</commit_message>
<xml_diff>
--- a/Velo en libre service/Détails_étude_de_cas_Cyclistic.docx
+++ b/Velo en libre service/Détails_étude_de_cas_Cyclistic.docx
@@ -31,7 +31,7 @@
           <w:szCs w:val="36"/>
           <w:u w:val="single"/>
         </w:rPr>
-        <w:t xml:space="preserve"> ENONCE</w:t>
+        <w:t xml:space="preserve"> en libre service CYCLISTIC</w:t>
       </w:r>
     </w:p>
     <w:p>
@@ -91,23 +91,7 @@
           <w:b/>
           <w:bCs/>
         </w:rPr>
-        <w:t xml:space="preserve">Pourquoi les clients occasionnels devaient [devraient] prendre un </w:t>
-      </w:r>
-      <w:proofErr w:type="spellStart"/>
-      <w:r>
-        <w:rPr>
-          <w:b/>
-          <w:bCs/>
-        </w:rPr>
-        <w:t>abo</w:t>
-      </w:r>
-      <w:proofErr w:type="spellEnd"/>
-      <w:r>
-        <w:rPr>
-          <w:b/>
-          <w:bCs/>
-        </w:rPr>
-        <w:t xml:space="preserve">. </w:t>
+        <w:t xml:space="preserve">Pourquoi les clients occasionnels devaient [devraient] prendre un abo. </w:t>
       </w:r>
       <w:r>
         <w:rPr>
@@ -317,23 +301,7 @@
           <w:b/>
           <w:bCs/>
         </w:rPr>
-        <w:t xml:space="preserve"> </w:t>
-      </w:r>
-      <w:proofErr w:type="spellStart"/>
-      <w:r>
-        <w:rPr>
-          <w:b/>
-          <w:bCs/>
-        </w:rPr>
-        <w:t>l'abo</w:t>
-      </w:r>
-      <w:proofErr w:type="spellEnd"/>
-      <w:r>
-        <w:rPr>
-          <w:b/>
-          <w:bCs/>
-        </w:rPr>
-        <w:t>.</w:t>
+        <w:t xml:space="preserve"> l'abo.</w:t>
       </w:r>
     </w:p>
     <w:p>
@@ -802,76 +770,46 @@
         </w:numPr>
       </w:pPr>
       <w:r>
-        <w:t xml:space="preserve">Suppression des </w:t>
-      </w:r>
-      <w:proofErr w:type="spellStart"/>
-      <w:r>
-        <w:t>colone</w:t>
-      </w:r>
-      <w:proofErr w:type="spellEnd"/>
-      <w:r>
-        <w:t xml:space="preserve"> ID de la location (</w:t>
-      </w:r>
-      <w:proofErr w:type="spellStart"/>
+        <w:t>Suppression des colone ID de la location (</w:t>
+      </w:r>
       <w:r>
         <w:t>ride_id</w:t>
       </w:r>
-      <w:proofErr w:type="spellEnd"/>
       <w:r>
         <w:t>), coordonnée GPS de la station de départ</w:t>
       </w:r>
       <w:r>
         <w:t xml:space="preserve"> (</w:t>
       </w:r>
-      <w:proofErr w:type="spellStart"/>
       <w:r>
         <w:t>start_lat</w:t>
       </w:r>
-      <w:proofErr w:type="spellEnd"/>
       <w:r>
         <w:t xml:space="preserve"> ; </w:t>
       </w:r>
-      <w:proofErr w:type="spellStart"/>
       <w:r>
         <w:t>start_</w:t>
       </w:r>
       <w:r>
-        <w:t>lng</w:t>
-      </w:r>
-      <w:proofErr w:type="spellEnd"/>
-      <w:r>
-        <w:t>)</w:t>
+        <w:t>lng)</w:t>
       </w:r>
       <w:r>
         <w:t>, coordonnée GPS de la station d’arrivée</w:t>
       </w:r>
       <w:r>
-        <w:t xml:space="preserve"> (</w:t>
-      </w:r>
-      <w:proofErr w:type="spellStart"/>
-      <w:r>
-        <w:t>end</w:t>
+        <w:t xml:space="preserve"> (end</w:t>
       </w:r>
       <w:r>
         <w:t>_lat</w:t>
       </w:r>
-      <w:proofErr w:type="spellEnd"/>
-      <w:r>
-        <w:t xml:space="preserve"> ; </w:t>
-      </w:r>
-      <w:proofErr w:type="spellStart"/>
-      <w:r>
-        <w:t>end</w:t>
+      <w:r>
+        <w:t> ; end</w:t>
       </w:r>
       <w:r>
         <w:t>_l</w:t>
       </w:r>
       <w:r>
-        <w:t>ng</w:t>
-      </w:r>
-      <w:proofErr w:type="spellEnd"/>
-      <w:r>
-        <w:t>)</w:t>
+        <w:t>ng)</w:t>
       </w:r>
     </w:p>
     <w:p>
@@ -895,61 +833,41 @@
         <w:t>s</w:t>
       </w:r>
       <w:r>
-        <w:t xml:space="preserve"> ou toutes les données n’étaient pas présente : Filtrer les </w:t>
-      </w:r>
-      <w:proofErr w:type="spellStart"/>
-      <w:r>
-        <w:t>colone</w:t>
-      </w:r>
-      <w:proofErr w:type="spellEnd"/>
-      <w:r>
-        <w:t xml:space="preserve"> </w:t>
-      </w:r>
-      <w:proofErr w:type="spellStart"/>
+        <w:t xml:space="preserve"> ou toutes les données n’étaient pas présente : Filtrer les colone </w:t>
+      </w:r>
       <w:r>
         <w:t>rideable_type</w:t>
       </w:r>
-      <w:proofErr w:type="spellEnd"/>
       <w:r>
         <w:t xml:space="preserve">, </w:t>
       </w:r>
-      <w:proofErr w:type="spellStart"/>
       <w:r>
         <w:t>started_at</w:t>
       </w:r>
-      <w:proofErr w:type="spellEnd"/>
       <w:r>
         <w:t xml:space="preserve">, </w:t>
       </w:r>
-      <w:proofErr w:type="spellStart"/>
       <w:r>
         <w:t>ended_at</w:t>
       </w:r>
-      <w:proofErr w:type="spellEnd"/>
       <w:r>
         <w:t xml:space="preserve">, </w:t>
       </w:r>
-      <w:proofErr w:type="spellStart"/>
       <w:r>
         <w:t>start_station_name</w:t>
       </w:r>
-      <w:proofErr w:type="spellEnd"/>
       <w:r>
         <w:t xml:space="preserve">, </w:t>
       </w:r>
-      <w:proofErr w:type="spellStart"/>
       <w:r>
         <w:t>end_station_name</w:t>
       </w:r>
-      <w:proofErr w:type="spellEnd"/>
       <w:r>
         <w:t xml:space="preserve"> et </w:t>
       </w:r>
-      <w:proofErr w:type="spellStart"/>
       <w:r>
         <w:t>member_casual</w:t>
       </w:r>
-      <w:proofErr w:type="spellEnd"/>
       <w:r>
         <w:t>) et laisser n’apparaitre que les entrée</w:t>
       </w:r>
@@ -994,11 +912,9 @@
       <w:r>
         <w:t xml:space="preserve">Création d’une </w:t>
       </w:r>
-      <w:proofErr w:type="spellStart"/>
       <w:r>
         <w:t>ride_lenght</w:t>
       </w:r>
-      <w:proofErr w:type="spellEnd"/>
       <w:r>
         <w:t xml:space="preserve"> pour </w:t>
       </w:r>
@@ -1017,21 +933,8 @@
       <w:r>
         <w:t xml:space="preserve"> </w:t>
       </w:r>
-      <w:proofErr w:type="spellStart"/>
-      <w:r>
-        <w:t>started_at</w:t>
-      </w:r>
-      <w:proofErr w:type="spellEnd"/>
-      <w:r>
-        <w:t xml:space="preserve"> – </w:t>
-      </w:r>
-      <w:proofErr w:type="spellStart"/>
-      <w:r>
-        <w:t>ended_at</w:t>
-      </w:r>
-      <w:proofErr w:type="spellEnd"/>
-      <w:r>
-        <w:t xml:space="preserve"> </w:t>
+      <w:r>
+        <w:t xml:space="preserve">started_at – ended_at </w:t>
       </w:r>
     </w:p>
     <w:p/>
@@ -1057,29 +960,13 @@
         <w:t>colonne</w:t>
       </w:r>
       <w:r>
-        <w:t xml:space="preserve"> « </w:t>
-      </w:r>
-      <w:proofErr w:type="spellStart"/>
-      <w:r>
-        <w:t>day_of_week</w:t>
-      </w:r>
-      <w:proofErr w:type="spellEnd"/>
-      <w:r>
-        <w:t xml:space="preserve"> » qui déduira le jour de la semaine « lundi = 1, dimanche =7) par rapport à la </w:t>
+        <w:t xml:space="preserve"> « day_of_week » qui déduira le jour de la semaine « lundi = 1, dimanche =7) par rapport à la </w:t>
       </w:r>
       <w:r>
         <w:t xml:space="preserve">colonne </w:t>
       </w:r>
       <w:r>
-        <w:t>« </w:t>
-      </w:r>
-      <w:proofErr w:type="spellStart"/>
-      <w:r>
-        <w:t>started_at</w:t>
-      </w:r>
-      <w:proofErr w:type="spellEnd"/>
-      <w:r>
-        <w:t> »</w:t>
+        <w:t>« started_at »</w:t>
       </w:r>
     </w:p>
     <w:p>
@@ -1125,15 +1012,7 @@
       </w:r>
       <w:proofErr w:type="gramEnd"/>
       <w:r>
-        <w:t>G:G; A:A; "</w:t>
-      </w:r>
-      <w:proofErr w:type="spellStart"/>
-      <w:r>
-        <w:t>electric_bike</w:t>
-      </w:r>
-      <w:proofErr w:type="spellEnd"/>
-      <w:r>
-        <w:t>"; F:F; "casual")</w:t>
+        <w:t>G:G; A:A; "electric_bike"; F:F; "casual")</w:t>
       </w:r>
     </w:p>
     <w:p>
@@ -1161,15 +1040,7 @@
       </w:r>
       <w:proofErr w:type="gramEnd"/>
       <w:r>
-        <w:t>G:G; A:A; "</w:t>
-      </w:r>
-      <w:proofErr w:type="spellStart"/>
-      <w:r>
-        <w:t>classic_bike</w:t>
-      </w:r>
-      <w:proofErr w:type="spellEnd"/>
-      <w:r>
-        <w:t>"; F:F; "casual")</w:t>
+        <w:t>G:G; A:A; "classic_bike"; F:F; "casual")</w:t>
       </w:r>
     </w:p>
     <w:p>
@@ -1197,21 +1068,11 @@
       </w:r>
       <w:proofErr w:type="gramEnd"/>
       <w:r>
-        <w:t>G:G; A:A; "</w:t>
-      </w:r>
-      <w:proofErr w:type="spellStart"/>
-      <w:r>
-        <w:t>electric_bike</w:t>
-      </w:r>
-      <w:proofErr w:type="spellEnd"/>
-      <w:r>
-        <w:t>"; F:F; "</w:t>
-      </w:r>
-      <w:proofErr w:type="spellStart"/>
+        <w:t>G:G; A:A; "electric_bike"; F:F; "</w:t>
+      </w:r>
       <w:r>
         <w:t>member</w:t>
       </w:r>
-      <w:proofErr w:type="spellEnd"/>
       <w:r>
         <w:t>")</w:t>
       </w:r>
@@ -1252,16 +1113,11 @@
       <w:r>
         <w:t>G:G; A:A; "</w:t>
       </w:r>
-      <w:proofErr w:type="spellStart"/>
       <w:r>
         <w:t>classic</w:t>
       </w:r>
       <w:r>
-        <w:t>_bike</w:t>
-      </w:r>
-      <w:proofErr w:type="spellEnd"/>
-      <w:r>
-        <w:t>"; F:F; "casual")</w:t>
+        <w:t>_bike"; F:F; "casual")</w:t>
       </w:r>
       <w:r>
         <w:t xml:space="preserve"> </w:t>
@@ -1282,15 +1138,7 @@
         </w:numPr>
       </w:pPr>
       <w:r>
-        <w:t xml:space="preserve">Total de location de vélo </w:t>
-      </w:r>
-      <w:proofErr w:type="spellStart"/>
-      <w:r>
-        <w:t>electriques</w:t>
-      </w:r>
-      <w:proofErr w:type="spellEnd"/>
-      <w:r>
-        <w:t xml:space="preserve"> par des membre :</w:t>
+        <w:t>Total de location de vélo electriques par des membre :</w:t>
       </w:r>
       <w:r>
         <w:t xml:space="preserve"> =</w:t>
@@ -1301,23 +1149,7 @@
       </w:r>
       <w:proofErr w:type="gramEnd"/>
       <w:r>
-        <w:t>F:F; "</w:t>
-      </w:r>
-      <w:proofErr w:type="spellStart"/>
-      <w:r>
-        <w:t>member</w:t>
-      </w:r>
-      <w:proofErr w:type="spellEnd"/>
-      <w:r>
-        <w:t>"; A:A; "</w:t>
-      </w:r>
-      <w:proofErr w:type="spellStart"/>
-      <w:r>
-        <w:t>electric_bike</w:t>
-      </w:r>
-      <w:proofErr w:type="spellEnd"/>
-      <w:r>
-        <w:t>")</w:t>
+        <w:t>F:F; "member"; A:A; "electric_bike")</w:t>
       </w:r>
     </w:p>
     <w:p>
@@ -1325,15 +1157,7 @@
         <w:ind w:left="405"/>
       </w:pPr>
       <w:r>
-        <w:t xml:space="preserve">Total de location de vélo </w:t>
-      </w:r>
-      <w:proofErr w:type="spellStart"/>
-      <w:r>
-        <w:t>electriques</w:t>
-      </w:r>
-      <w:proofErr w:type="spellEnd"/>
-      <w:r>
-        <w:t xml:space="preserve"> par des utilisateur occasionnel : </w:t>
+        <w:t xml:space="preserve">Total de location de vélo electriques par des utilisateur occasionnel : </w:t>
       </w:r>
       <w:r>
         <w:t>=</w:t>
@@ -1344,18 +1168,35 @@
       </w:r>
       <w:proofErr w:type="gramEnd"/>
       <w:r>
+        <w:t>F:F; "casual"; A:A; "electric_bike")</w:t>
+      </w:r>
+      <w:r>
+        <w:t> </w:t>
+      </w:r>
+    </w:p>
+    <w:p>
+      <w:pPr>
+        <w:ind w:left="405"/>
+      </w:pPr>
+      <w:r>
+        <w:t xml:space="preserve">Total de location de vélo classique par des utilisateurs occasioneels : </w:t>
+      </w:r>
+      <w:r>
+        <w:t>=</w:t>
+      </w:r>
+      <w:proofErr w:type="gramStart"/>
+      <w:r>
+        <w:t>NB.SI.ENS(</w:t>
+      </w:r>
+      <w:proofErr w:type="gramEnd"/>
+      <w:r>
         <w:t>F:F; "casual"; A:A; "</w:t>
       </w:r>
-      <w:proofErr w:type="spellStart"/>
-      <w:r>
-        <w:t>electric_bike</w:t>
-      </w:r>
-      <w:proofErr w:type="spellEnd"/>
-      <w:r>
-        <w:t>")</w:t>
-      </w:r>
-      <w:r>
-        <w:t> </w:t>
+      <w:r>
+        <w:t>classic</w:t>
+      </w:r>
+      <w:r>
+        <w:t>_bike")</w:t>
       </w:r>
     </w:p>
     <w:p>
@@ -1363,15 +1204,7 @@
         <w:ind w:left="405"/>
       </w:pPr>
       <w:r>
-        <w:t xml:space="preserve">Total de location de vélo classique par des utilisateurs </w:t>
-      </w:r>
-      <w:proofErr w:type="spellStart"/>
-      <w:r>
-        <w:t>occasioneels</w:t>
-      </w:r>
-      <w:proofErr w:type="spellEnd"/>
-      <w:r>
-        <w:t xml:space="preserve"> : </w:t>
+        <w:t xml:space="preserve">Total de location de vélo classique par des membre : </w:t>
       </w:r>
       <w:r>
         <w:t>=</w:t>
@@ -1382,53 +1215,7 @@
       </w:r>
       <w:proofErr w:type="gramEnd"/>
       <w:r>
-        <w:t>F:F; "casual"; A:A; "</w:t>
-      </w:r>
-      <w:proofErr w:type="spellStart"/>
-      <w:r>
-        <w:t>classic</w:t>
-      </w:r>
-      <w:r>
-        <w:t>_bike</w:t>
-      </w:r>
-      <w:proofErr w:type="spellEnd"/>
-      <w:r>
-        <w:t>")</w:t>
-      </w:r>
-    </w:p>
-    <w:p>
-      <w:pPr>
-        <w:ind w:left="405"/>
-      </w:pPr>
-      <w:r>
-        <w:t xml:space="preserve">Total de location de vélo classique par des membre : </w:t>
-      </w:r>
-      <w:r>
-        <w:t>=</w:t>
-      </w:r>
-      <w:proofErr w:type="gramStart"/>
-      <w:r>
-        <w:t>NB.SI.ENS(</w:t>
-      </w:r>
-      <w:proofErr w:type="gramEnd"/>
-      <w:r>
-        <w:t>F:F; "</w:t>
-      </w:r>
-      <w:proofErr w:type="spellStart"/>
-      <w:r>
-        <w:t>member</w:t>
-      </w:r>
-      <w:proofErr w:type="spellEnd"/>
-      <w:r>
-        <w:t>"; A:A; "</w:t>
-      </w:r>
-      <w:proofErr w:type="spellStart"/>
-      <w:r>
-        <w:t>classic_bike</w:t>
-      </w:r>
-      <w:proofErr w:type="spellEnd"/>
-      <w:r>
-        <w:t>")</w:t>
+        <w:t>F:F; "member"; A:A; "classic_bike")</w:t>
       </w:r>
       <w:r>
         <w:t> </w:t>
@@ -1471,15 +1258,7 @@
       </w:r>
       <w:proofErr w:type="gramEnd"/>
       <w:r>
-        <w:t>A:A; "</w:t>
-      </w:r>
-      <w:proofErr w:type="spellStart"/>
-      <w:r>
-        <w:t>electric_bike</w:t>
-      </w:r>
-      <w:proofErr w:type="spellEnd"/>
-      <w:r>
-        <w:t>")</w:t>
+        <w:t>A:A; "electric_bike")</w:t>
       </w:r>
     </w:p>
     <w:p>
@@ -1504,15 +1283,7 @@
       </w:r>
       <w:proofErr w:type="gramEnd"/>
       <w:r>
-        <w:t>A:A; "</w:t>
-      </w:r>
-      <w:proofErr w:type="spellStart"/>
-      <w:r>
-        <w:t>classic_bike</w:t>
-      </w:r>
-      <w:proofErr w:type="spellEnd"/>
-      <w:r>
-        <w:t>")</w:t>
+        <w:t>A:A; "classic_bike")</w:t>
       </w:r>
     </w:p>
     <w:p/>
@@ -1541,69 +1312,40 @@
       </w:r>
       <w:proofErr w:type="gramEnd"/>
       <w:r>
+        <w:t>="electric_bike")*(G:G="member");D:D))</w:t>
+      </w:r>
+    </w:p>
+    <w:p>
+      <w:r>
+        <w:t xml:space="preserve">Pour chaque mois calcul des jours de la semaine préférés </w:t>
+      </w:r>
+      <w:r>
+        <w:t>des membres</w:t>
+      </w:r>
+      <w:r>
+        <w:t xml:space="preserve"> en vélo </w:t>
+      </w:r>
+      <w:r>
+        <w:t>classique :</w:t>
+      </w:r>
+    </w:p>
+    <w:p>
+      <w:r>
+        <w:t>=MODE(SI((</w:t>
+      </w:r>
+      <w:proofErr w:type="gramStart"/>
+      <w:r>
+        <w:t>A:A</w:t>
+      </w:r>
+      <w:proofErr w:type="gramEnd"/>
+      <w:r>
         <w:t>="</w:t>
       </w:r>
-      <w:proofErr w:type="spellStart"/>
-      <w:r>
-        <w:t>electric_bike</w:t>
-      </w:r>
-      <w:proofErr w:type="spellEnd"/>
-      <w:r>
-        <w:t>")*(G:G="</w:t>
-      </w:r>
-      <w:proofErr w:type="spellStart"/>
-      <w:r>
-        <w:t>member</w:t>
-      </w:r>
-      <w:proofErr w:type="spellEnd"/>
-      <w:r>
-        <w:t>");D:D))</w:t>
-      </w:r>
-    </w:p>
-    <w:p>
-      <w:r>
-        <w:t xml:space="preserve">Pour chaque mois calcul des jours de la semaine préférés </w:t>
-      </w:r>
-      <w:r>
-        <w:t>des membres</w:t>
-      </w:r>
-      <w:r>
-        <w:t xml:space="preserve"> en vélo </w:t>
-      </w:r>
-      <w:r>
-        <w:t>classique :</w:t>
-      </w:r>
-    </w:p>
-    <w:p>
-      <w:r>
-        <w:t>=MODE(SI((</w:t>
-      </w:r>
-      <w:proofErr w:type="gramStart"/>
-      <w:r>
-        <w:t>A:A</w:t>
-      </w:r>
-      <w:proofErr w:type="gramEnd"/>
-      <w:r>
-        <w:t>="</w:t>
-      </w:r>
-      <w:proofErr w:type="spellStart"/>
       <w:r>
         <w:t>classic</w:t>
       </w:r>
       <w:r>
-        <w:t>_bike</w:t>
-      </w:r>
-      <w:proofErr w:type="spellEnd"/>
-      <w:r>
-        <w:t>")*(G:G="</w:t>
-      </w:r>
-      <w:proofErr w:type="spellStart"/>
-      <w:r>
-        <w:t>member</w:t>
-      </w:r>
-      <w:proofErr w:type="spellEnd"/>
-      <w:r>
-        <w:t>");D:D))</w:t>
+        <w:t>_bike")*(G:G="member");D:D))</w:t>
       </w:r>
     </w:p>
     <w:p>
@@ -1624,16 +1366,11 @@
       <w:r>
         <w:t>="</w:t>
       </w:r>
-      <w:proofErr w:type="spellStart"/>
       <w:r>
         <w:t>electric</w:t>
       </w:r>
       <w:r>
-        <w:t>_bike</w:t>
-      </w:r>
-      <w:proofErr w:type="spellEnd"/>
-      <w:r>
-        <w:t>")*(G:G="</w:t>
+        <w:t>_bike")*(G:G="</w:t>
       </w:r>
       <w:r>
         <w:t>casual</w:t>
@@ -1659,16 +1396,11 @@
       <w:r>
         <w:t>="</w:t>
       </w:r>
-      <w:proofErr w:type="spellStart"/>
       <w:r>
         <w:t>classic</w:t>
       </w:r>
       <w:r>
-        <w:t>_bike</w:t>
-      </w:r>
-      <w:proofErr w:type="spellEnd"/>
-      <w:r>
-        <w:t>")*(G:G="</w:t>
+        <w:t>_bike")*(G:G="</w:t>
       </w:r>
       <w:r>
         <w:t>casual</w:t>
@@ -1741,40 +1473,11 @@
         </w:numPr>
       </w:pPr>
       <w:r>
-        <w:t xml:space="preserve">Création d’un TCD avec comme colonnes : </w:t>
-      </w:r>
-      <w:proofErr w:type="spellStart"/>
-      <w:r>
-        <w:t>name_stations</w:t>
-      </w:r>
-      <w:proofErr w:type="spellEnd"/>
-      <w:r>
-        <w:t xml:space="preserve"> ; </w:t>
-      </w:r>
-      <w:proofErr w:type="spellStart"/>
-      <w:r>
-        <w:t>somme_dépôt</w:t>
-      </w:r>
-      <w:proofErr w:type="spellEnd"/>
-      <w:r>
-        <w:t xml:space="preserve"> ; </w:t>
-      </w:r>
-      <w:proofErr w:type="spellStart"/>
-      <w:r>
-        <w:t>somme_retraits</w:t>
-      </w:r>
-      <w:proofErr w:type="spellEnd"/>
-      <w:r>
-        <w:t xml:space="preserve"> ; </w:t>
-      </w:r>
-      <w:proofErr w:type="spellStart"/>
-      <w:r>
-        <w:t>somme_différence_</w:t>
+        <w:t>Création d’un TCD avec comme colonnes : name_stations ; somme_dépôt ; somme_retraits ; somme_différence_</w:t>
       </w:r>
       <w:r>
         <w:t>d</w:t>
       </w:r>
-      <w:proofErr w:type="spellEnd"/>
       <w:r>
         <w:t>/</w:t>
       </w:r>
@@ -1797,15 +1500,7 @@
         <w:t>s</w:t>
       </w:r>
       <w:r>
-        <w:t xml:space="preserve"> du chiffre « </w:t>
-      </w:r>
-      <w:proofErr w:type="spellStart"/>
-      <w:r>
-        <w:t>somme_différence_e</w:t>
-      </w:r>
-      <w:proofErr w:type="spellEnd"/>
-      <w:r>
-        <w:t>/s » du plus petit au plus grand grâce au tri.</w:t>
+        <w:t xml:space="preserve"> du chiffre « somme_différence_e/s » du plus petit au plus grand grâce au tri.</w:t>
       </w:r>
     </w:p>
     <w:p/>
@@ -1843,7 +1538,6 @@
         </w:rPr>
         <w:t>Création feuille de calcul « </w:t>
       </w:r>
-      <w:proofErr w:type="spellStart"/>
       <w:r>
         <w:rPr>
           <w:b/>
@@ -1861,7 +1555,6 @@
         </w:rPr>
         <w:t>entrées</w:t>
       </w:r>
-      <w:proofErr w:type="spellEnd"/>
       <w:r>
         <w:rPr>
           <w:b/>
@@ -1917,7 +1610,6 @@
         </w:rPr>
         <w:t>Création feuille de calcul « </w:t>
       </w:r>
-      <w:proofErr w:type="spellStart"/>
       <w:r>
         <w:rPr>
           <w:b/>
@@ -1935,7 +1627,6 @@
         </w:rPr>
         <w:t>stations</w:t>
       </w:r>
-      <w:proofErr w:type="spellEnd"/>
       <w:r>
         <w:rPr>
           <w:b/>
@@ -1963,15 +1654,7 @@
         <w:ind w:left="405"/>
       </w:pPr>
       <w:r>
-        <w:t xml:space="preserve">Grace aux filtres appliqués sur le TCD de la feuille de calcul </w:t>
-      </w:r>
-      <w:proofErr w:type="spellStart"/>
-      <w:r>
-        <w:t>TCD_total_entrées</w:t>
-      </w:r>
-      <w:proofErr w:type="spellEnd"/>
-      <w:r>
-        <w:t xml:space="preserve"> j’en ai déduit les :</w:t>
+        <w:t>Grace aux filtres appliqués sur le TCD de la feuille de calcul TCD_total_entrées j’en ai déduit les :</w:t>
       </w:r>
     </w:p>
     <w:p>
@@ -2273,34 +1956,14 @@
         </w:rPr>
         <w:t>4 : Création de la table « </w:t>
       </w:r>
-      <w:proofErr w:type="spellStart"/>
       <w:r>
         <w:rPr>
           <w:b/>
           <w:bCs/>
           <w:u w:val="single"/>
         </w:rPr>
-        <w:t>monthly</w:t>
-      </w:r>
-      <w:proofErr w:type="spellEnd"/>
-      <w:r>
-        <w:rPr>
-          <w:b/>
-          <w:bCs/>
-          <w:u w:val="single"/>
-        </w:rPr>
-        <w:t xml:space="preserve"> </w:t>
-      </w:r>
-      <w:proofErr w:type="spellStart"/>
-      <w:r>
-        <w:rPr>
-          <w:b/>
-          <w:bCs/>
-          <w:u w:val="single"/>
-        </w:rPr>
-        <w:t>summary</w:t>
-      </w:r>
-      <w:proofErr w:type="spellEnd"/>
+        <w:t>monthly summary</w:t>
+      </w:r>
       <w:r>
         <w:rPr>
           <w:b/>
@@ -2321,11 +1984,9 @@
       <w:r>
         <w:t>Grace à des formules j’en ai déduit ! la moyenne de location de vélo électrique « </w:t>
       </w:r>
-      <w:proofErr w:type="spellStart"/>
       <w:r>
         <w:t>avg_elec_bike</w:t>
       </w:r>
-      <w:proofErr w:type="spellEnd"/>
       <w:r>
         <w:t xml:space="preserve"> » </w:t>
       </w:r>
@@ -2349,11 +2010,9 @@
       <w:r>
         <w:t>classique « </w:t>
       </w:r>
-      <w:proofErr w:type="spellStart"/>
       <w:r>
         <w:t>avg_classic_bike</w:t>
       </w:r>
-      <w:proofErr w:type="spellEnd"/>
       <w:r>
         <w:t xml:space="preserve"> » </w:t>
       </w:r>
@@ -2373,52 +2032,40 @@
         <w:t>Le % de location des vélo classique « </w:t>
       </w:r>
       <w:r>
+        <w:t>% classic</w:t>
+      </w:r>
+      <w:r>
+        <w:t xml:space="preserve"> » </w:t>
+      </w:r>
+      <w:r>
+        <w:t>=(J2+I</w:t>
+      </w:r>
+      <w:proofErr w:type="gramStart"/>
+      <w:r>
+        <w:t>2)/</w:t>
+      </w:r>
+      <w:proofErr w:type="gramEnd"/>
+      <w:r>
+        <w:t>K2</w:t>
+      </w:r>
+      <w:r>
+        <w:t xml:space="preserve">, </w:t>
+      </w:r>
+      <w:r>
+        <w:t xml:space="preserve">Le % de location des vélo </w:t>
+      </w:r>
+      <w:r>
+        <w:t xml:space="preserve">electrique </w:t>
+      </w:r>
+      <w:r>
+        <w:t>« </w:t>
+      </w:r>
+      <w:r>
         <w:t xml:space="preserve">% </w:t>
       </w:r>
-      <w:proofErr w:type="spellStart"/>
-      <w:r>
-        <w:t>classic</w:t>
-      </w:r>
-      <w:proofErr w:type="spellEnd"/>
-      <w:r>
-        <w:t xml:space="preserve"> » </w:t>
-      </w:r>
-      <w:r>
-        <w:t>=(J2+I</w:t>
-      </w:r>
-      <w:proofErr w:type="gramStart"/>
-      <w:r>
-        <w:t>2)/</w:t>
-      </w:r>
-      <w:proofErr w:type="gramEnd"/>
-      <w:r>
-        <w:t>K2</w:t>
-      </w:r>
-      <w:r>
-        <w:t xml:space="preserve">, </w:t>
-      </w:r>
-      <w:r>
-        <w:t xml:space="preserve">Le % de location des vélo </w:t>
-      </w:r>
-      <w:proofErr w:type="spellStart"/>
       <w:r>
         <w:t>electrique</w:t>
       </w:r>
-      <w:proofErr w:type="spellEnd"/>
-      <w:r>
-        <w:t xml:space="preserve"> </w:t>
-      </w:r>
-      <w:r>
-        <w:t>« </w:t>
-      </w:r>
-      <w:r>
-        <w:t xml:space="preserve">% </w:t>
-      </w:r>
-      <w:proofErr w:type="spellStart"/>
-      <w:r>
-        <w:t>electrique</w:t>
-      </w:r>
-      <w:proofErr w:type="spellEnd"/>
       <w:r>
         <w:t xml:space="preserve"> » </w:t>
       </w:r>
@@ -2437,11 +2084,9 @@
       <w:r>
         <w:t>-  Le total de location vélo électrique non membre et le % « </w:t>
       </w:r>
-      <w:proofErr w:type="spellStart"/>
       <w:r>
         <w:t>Casual_elec</w:t>
       </w:r>
-      <w:proofErr w:type="spellEnd"/>
       <w:r>
         <w:t xml:space="preserve"> » </w:t>
       </w:r>
@@ -2475,15 +2120,7 @@
         <w:t>Le total de location vélo électrique membre et le %</w:t>
       </w:r>
       <w:r>
-        <w:t xml:space="preserve"> « </w:t>
-      </w:r>
-      <w:proofErr w:type="spellStart"/>
-      <w:r>
-        <w:t>member_elec</w:t>
-      </w:r>
-      <w:proofErr w:type="spellEnd"/>
-      <w:r>
-        <w:t xml:space="preserve"> » </w:t>
+        <w:t xml:space="preserve"> « member_elec » </w:t>
       </w:r>
       <w:r>
         <w:t>=SOMME('01-</w:t>
@@ -2523,11 +2160,9 @@
       <w:r>
         <w:t xml:space="preserve"> « </w:t>
       </w:r>
-      <w:proofErr w:type="spellStart"/>
       <w:r>
         <w:t>member_clessic</w:t>
       </w:r>
-      <w:proofErr w:type="spellEnd"/>
       <w:r>
         <w:t xml:space="preserve"> » </w:t>
       </w:r>
@@ -2570,11 +2205,9 @@
       <w:r>
         <w:t xml:space="preserve"> « </w:t>
       </w:r>
-      <w:proofErr w:type="spellStart"/>
       <w:r>
         <w:t>casual_classic</w:t>
       </w:r>
-      <w:proofErr w:type="spellEnd"/>
       <w:r>
         <w:t xml:space="preserve"> » </w:t>
       </w:r>
@@ -2645,38 +2278,30 @@
       <w:r>
         <w:t xml:space="preserve">En ligne : </w:t>
       </w:r>
-      <w:proofErr w:type="spellStart"/>
       <w:r>
         <w:t>Casual_elec</w:t>
       </w:r>
-      <w:proofErr w:type="spellEnd"/>
       <w:r>
         <w:t xml:space="preserve">, </w:t>
       </w:r>
-      <w:proofErr w:type="spellStart"/>
       <w:r>
         <w:t>casual_classic</w:t>
       </w:r>
-      <w:proofErr w:type="spellEnd"/>
       <w:r>
         <w:t>,</w:t>
       </w:r>
       <w:r>
         <w:t xml:space="preserve"> </w:t>
       </w:r>
-      <w:proofErr w:type="spellStart"/>
       <w:r>
         <w:t>member_elec</w:t>
       </w:r>
-      <w:proofErr w:type="spellEnd"/>
       <w:r>
         <w:t xml:space="preserve">, </w:t>
       </w:r>
-      <w:proofErr w:type="spellStart"/>
       <w:r>
         <w:t>member_clessic</w:t>
       </w:r>
-      <w:proofErr w:type="spellEnd"/>
       <w:r>
         <w:t xml:space="preserve">, et pour chaque : </w:t>
       </w:r>
@@ -2712,15 +2337,7 @@
       </w:r>
       <w:proofErr w:type="gramEnd"/>
       <w:r>
-        <w:t>'01-2025'!G:G; "casual"; '01-2025'!A:A; "</w:t>
-      </w:r>
-      <w:proofErr w:type="spellStart"/>
-      <w:r>
-        <w:t>electric_bike</w:t>
-      </w:r>
-      <w:proofErr w:type="spellEnd"/>
-      <w:r>
-        <w:t>")</w:t>
+        <w:t>'01-2025'!G:G; "casual"; '01-2025'!A:A; "electric_bike")</w:t>
       </w:r>
       <w:r>
         <w:t xml:space="preserve">, </w:t>
@@ -2750,15 +2367,7 @@
         <w:t>fréquemment</w:t>
       </w:r>
       <w:r>
-        <w:t xml:space="preserve"> apparu dans la colonne « </w:t>
-      </w:r>
-      <w:proofErr w:type="spellStart"/>
-      <w:r>
-        <w:t>day_of_week</w:t>
-      </w:r>
-      <w:proofErr w:type="spellEnd"/>
-      <w:r>
-        <w:t xml:space="preserve"> » de chaque mois, et en le convertissant en nom du jour : </w:t>
+        <w:t xml:space="preserve"> apparu dans la colonne « day_of_week » de chaque mois, et en le convertissant en nom du jour : </w:t>
       </w:r>
       <w:r>
         <w:t>=MODE('01-2025</w:t>

</xml_diff>

<commit_message>
creation du diagramme de la bdd, rectification du script MySQL en y inculant les PK et les FK, modification du fichier détails etude de cas
</commit_message>
<xml_diff>
--- a/Velo en libre service/Détails_étude_de_cas_Cyclistic.docx
+++ b/Velo en libre service/Détails_étude_de_cas_Cyclistic.docx
@@ -66,300 +66,222 @@
           <w:b/>
           <w:bCs/>
         </w:rPr>
-        <w:t xml:space="preserve"> </w:t>
-      </w:r>
-      <w:r>
-        <w:rPr>
-          <w:rFonts w:ascii="Arial" w:hAnsi="Arial" w:cs="Arial"/>
-          <w:b/>
-          <w:bCs/>
-        </w:rPr>
-        <w:t>​</w:t>
-      </w:r>
-      <w:r>
+        <w:t>Contexte &amp; Objectif</w:t>
+      </w:r>
+    </w:p>
+    <w:p>
+      <w:pPr>
         <w:rPr>
           <w:b/>
           <w:bCs/>
         </w:rPr>
-        <w:t>Comment les clients r</w:t>
-      </w:r>
-      <w:r>
-        <w:rPr>
-          <w:rFonts w:ascii="Aptos" w:hAnsi="Aptos" w:cs="Aptos"/>
-          <w:b/>
-          <w:bCs/>
-        </w:rPr>
-        <w:t>é</w:t>
-      </w:r>
+      </w:pPr>
       <w:r>
         <w:rPr>
           <w:b/>
           <w:bCs/>
         </w:rPr>
-        <w:t xml:space="preserve">guliers et clients occasionnels roulent. </w:t>
-      </w:r>
-      <w:r>
-        <w:rPr>
-          <w:rFonts w:ascii="Arial" w:hAnsi="Arial" w:cs="Arial"/>
-          <w:b/>
-          <w:bCs/>
-        </w:rPr>
-        <w:t>​</w:t>
-      </w:r>
-      <w:r>
+        <w:t>L'analyse porte sur les comportements de déplacement des clients d'un service de vélo en libre-service, en distinguant les clients réguliers (abonnés) des clients occasionnels. L'objectif est de comprendre leurs habitudes pour convertir les occasionnels en abonnés, optimiser la répartition des stations et adapter la flotte (vélos classiques ou électriques) selon la demande réelle.</w:t>
+      </w:r>
+    </w:p>
+    <w:p>
+      <w:pPr>
         <w:rPr>
           <w:b/>
           <w:bCs/>
         </w:rPr>
-        <w:t xml:space="preserve">Pourquoi les clients occasionnels devaient [devraient] prendre un </w:t>
-      </w:r>
-      <w:proofErr w:type="spellStart"/>
+      </w:pPr>
       <w:r>
         <w:rPr>
           <w:b/>
           <w:bCs/>
         </w:rPr>
-        <w:t>abo</w:t>
-      </w:r>
-      <w:proofErr w:type="spellEnd"/>
-      <w:r>
+        <w:t>Source de données</w:t>
+      </w:r>
+    </w:p>
+    <w:p>
+      <w:pPr>
         <w:rPr>
           <w:b/>
           <w:bCs/>
         </w:rPr>
-        <w:t xml:space="preserve">. </w:t>
-      </w:r>
-      <w:r>
-        <w:rPr>
-          <w:rFonts w:ascii="Arial" w:hAnsi="Arial" w:cs="Arial"/>
-          <w:b/>
-          <w:bCs/>
-        </w:rPr>
-        <w:t>​</w:t>
-      </w:r>
+      </w:pPr>
       <w:r>
         <w:rPr>
           <w:b/>
           <w:bCs/>
         </w:rPr>
-        <w:t>donn</w:t>
-      </w:r>
-      <w:r>
-        <w:rPr>
-          <w:rFonts w:ascii="Aptos" w:hAnsi="Aptos" w:cs="Aptos"/>
-          <w:b/>
-          <w:bCs/>
-        </w:rPr>
-        <w:t>é</w:t>
-      </w:r>
-      <w:r>
+        <w:t>Un fichier CSV structuré en 12 feuilles mensuelles (janvier à décembre 2025), contenant pour chaque trajet :</w:t>
+      </w:r>
+    </w:p>
+    <w:p>
+      <w:pPr>
+        <w:numPr>
+          <w:ilvl w:val="0"/>
+          <w:numId w:val="4"/>
+        </w:numPr>
         <w:rPr>
           <w:b/>
           <w:bCs/>
         </w:rPr>
-        <w:t>es utilis</w:t>
-      </w:r>
-      <w:r>
-        <w:rPr>
-          <w:rFonts w:ascii="Aptos" w:hAnsi="Aptos" w:cs="Aptos"/>
-          <w:b/>
-          <w:bCs/>
-        </w:rPr>
-        <w:t>é</w:t>
-      </w:r>
+      </w:pPr>
       <w:r>
         <w:rPr>
           <w:b/>
           <w:bCs/>
         </w:rPr>
-        <w:t>es : Fichier CSV des trajets comprenant ID du trajet, id et nom des stations de d</w:t>
-      </w:r>
-      <w:r>
-        <w:rPr>
-          <w:rFonts w:ascii="Aptos" w:hAnsi="Aptos" w:cs="Aptos"/>
-          <w:b/>
-          <w:bCs/>
-        </w:rPr>
-        <w:t>é</w:t>
-      </w:r>
-      <w:r>
+        <w:t>ID du trajet</w:t>
+      </w:r>
+    </w:p>
+    <w:p>
+      <w:pPr>
+        <w:numPr>
+          <w:ilvl w:val="0"/>
+          <w:numId w:val="4"/>
+        </w:numPr>
         <w:rPr>
           <w:b/>
           <w:bCs/>
         </w:rPr>
-        <w:t>part et d'arriv</w:t>
-      </w:r>
-      <w:r>
-        <w:rPr>
-          <w:rFonts w:ascii="Aptos" w:hAnsi="Aptos" w:cs="Aptos"/>
-          <w:b/>
-          <w:bCs/>
-        </w:rPr>
-        <w:t>é</w:t>
-      </w:r>
+      </w:pPr>
       <w:r>
         <w:rPr>
           <w:b/>
           <w:bCs/>
         </w:rPr>
-        <w:t>e, date et heure de d</w:t>
-      </w:r>
-      <w:r>
-        <w:rPr>
-          <w:rFonts w:ascii="Aptos" w:hAnsi="Aptos" w:cs="Aptos"/>
-          <w:b/>
-          <w:bCs/>
-        </w:rPr>
-        <w:t>é</w:t>
-      </w:r>
-      <w:r>
+        <w:t>ID et nom des stations de départ et d'arrivée</w:t>
+      </w:r>
+    </w:p>
+    <w:p>
+      <w:pPr>
+        <w:numPr>
+          <w:ilvl w:val="0"/>
+          <w:numId w:val="4"/>
+        </w:numPr>
         <w:rPr>
           <w:b/>
           <w:bCs/>
         </w:rPr>
-        <w:t>part et d'arriv</w:t>
-      </w:r>
-      <w:r>
-        <w:rPr>
-          <w:rFonts w:ascii="Aptos" w:hAnsi="Aptos" w:cs="Aptos"/>
-          <w:b/>
-          <w:bCs/>
-        </w:rPr>
-        <w:t>é</w:t>
-      </w:r>
+      </w:pPr>
       <w:r>
         <w:rPr>
           <w:b/>
           <w:bCs/>
         </w:rPr>
-        <w:t>e, client R</w:t>
-      </w:r>
-      <w:r>
-        <w:rPr>
-          <w:rFonts w:ascii="Aptos" w:hAnsi="Aptos" w:cs="Aptos"/>
-          <w:b/>
-          <w:bCs/>
-        </w:rPr>
-        <w:t>é</w:t>
-      </w:r>
-      <w:r>
+        <w:t>Date et heure de départ et d'arrivée</w:t>
+      </w:r>
+    </w:p>
+    <w:p>
+      <w:pPr>
+        <w:numPr>
+          <w:ilvl w:val="0"/>
+          <w:numId w:val="4"/>
+        </w:numPr>
         <w:rPr>
           <w:b/>
           <w:bCs/>
         </w:rPr>
-        <w:t xml:space="preserve">gulier ou non. </w:t>
-      </w:r>
-      <w:r>
-        <w:rPr>
-          <w:rFonts w:ascii="Arial" w:hAnsi="Arial" w:cs="Arial"/>
-          <w:b/>
-          <w:bCs/>
-        </w:rPr>
-        <w:t>​</w:t>
-      </w:r>
+      </w:pPr>
       <w:r>
         <w:rPr>
           <w:b/>
           <w:bCs/>
         </w:rPr>
-        <w:t>Probl</w:t>
-      </w:r>
-      <w:r>
-        <w:rPr>
-          <w:rFonts w:ascii="Aptos" w:hAnsi="Aptos" w:cs="Aptos"/>
-          <w:b/>
-          <w:bCs/>
-        </w:rPr>
-        <w:t>è</w:t>
-      </w:r>
-      <w:r>
+        <w:t>Statut du client : régulier (abonné) ou occasionnel</w:t>
+      </w:r>
+    </w:p>
+    <w:p>
+      <w:pPr>
         <w:rPr>
           <w:b/>
           <w:bCs/>
         </w:rPr>
-        <w:t xml:space="preserve">mes </w:t>
-      </w:r>
+      </w:pPr>
       <w:r>
         <w:rPr>
-          <w:rFonts w:ascii="Aptos" w:hAnsi="Aptos" w:cs="Aptos"/>
           <w:b/>
           <w:bCs/>
+          <w:i/>
+          <w:iCs/>
         </w:rPr>
-        <w:t>à</w:t>
-      </w:r>
-      <w:r>
+        <w:t>Note : Les données 2023 et 2024 ont été exclues de l'analyse en raison de limitations techniques (lenteurs et instabilité d'Excel lors de l'ajout de nouvelles formules).</w:t>
+      </w:r>
+    </w:p>
+    <w:p>
+      <w:pPr>
         <w:rPr>
           <w:b/>
           <w:bCs/>
         </w:rPr>
-        <w:t xml:space="preserve"> r</w:t>
-      </w:r>
-      <w:r>
-        <w:rPr>
-          <w:rFonts w:ascii="Aptos" w:hAnsi="Aptos" w:cs="Aptos"/>
-          <w:b/>
-          <w:bCs/>
-        </w:rPr>
-        <w:t>é</w:t>
-      </w:r>
+      </w:pPr>
       <w:r>
         <w:rPr>
           <w:b/>
           <w:bCs/>
         </w:rPr>
-        <w:t xml:space="preserve">soudre : </w:t>
-      </w:r>
-      <w:r>
-        <w:rPr>
-          <w:rFonts w:ascii="Arial" w:hAnsi="Arial" w:cs="Arial"/>
-          <w:b/>
-          <w:bCs/>
-        </w:rPr>
-        <w:t>​</w:t>
-      </w:r>
-      <w:r>
+        <w:t>Problématiques traitées</w:t>
+      </w:r>
+    </w:p>
+    <w:p>
+      <w:pPr>
+        <w:numPr>
+          <w:ilvl w:val="0"/>
+          <w:numId w:val="5"/>
+        </w:numPr>
         <w:rPr>
           <w:b/>
           <w:bCs/>
         </w:rPr>
-        <w:t xml:space="preserve">Faire passer de l'occasionnel </w:t>
-      </w:r>
-      <w:r>
-        <w:rPr>
-          <w:rFonts w:ascii="Aptos" w:hAnsi="Aptos" w:cs="Aptos"/>
-          <w:b/>
-          <w:bCs/>
-        </w:rPr>
-        <w:t>à</w:t>
-      </w:r>
+      </w:pPr>
       <w:r>
         <w:rPr>
           <w:b/>
           <w:bCs/>
         </w:rPr>
-        <w:t xml:space="preserve"> </w:t>
-      </w:r>
-      <w:proofErr w:type="spellStart"/>
-      <w:r>
+        <w:t>Conversion des clients occasionnels — Identifier les profils et trajets types qui justifient la souscription à un abonnement</w:t>
+      </w:r>
+    </w:p>
+    <w:p>
+      <w:pPr>
+        <w:numPr>
+          <w:ilvl w:val="0"/>
+          <w:numId w:val="5"/>
+        </w:numPr>
         <w:rPr>
           <w:b/>
           <w:bCs/>
         </w:rPr>
-        <w:t>l'abo</w:t>
-      </w:r>
-      <w:proofErr w:type="spellEnd"/>
+      </w:pPr>
       <w:r>
         <w:rPr>
           <w:b/>
           <w:bCs/>
         </w:rPr>
-        <w:t>.</w:t>
+        <w:t>Optimisation des stations — Repérer les stations les plus fréquentées pour y concentrer les ressources</w:t>
+      </w:r>
+    </w:p>
+    <w:p>
+      <w:pPr>
+        <w:numPr>
+          <w:ilvl w:val="0"/>
+          <w:numId w:val="5"/>
+        </w:numPr>
+        <w:rPr>
+          <w:b/>
+          <w:bCs/>
+        </w:rPr>
+      </w:pPr>
+      <w:r>
+        <w:rPr>
+          <w:b/>
+          <w:bCs/>
+        </w:rPr>
+        <w:t>Adaptation de la flotte — Orienter les investissements vers des vélos classiques ou électriques selon les usages observés</w:t>
       </w:r>
     </w:p>
     <w:p>
       <w:pPr>
         <w:rPr>
-          <w:rFonts w:ascii="Arial" w:hAnsi="Arial" w:cs="Arial"/>
           <w:b/>
           <w:bCs/>
         </w:rPr>
@@ -369,377 +291,48 @@
           <w:b/>
           <w:bCs/>
         </w:rPr>
-        <w:t xml:space="preserve"> </w:t>
-      </w:r>
-      <w:r>
-        <w:rPr>
-          <w:rFonts w:ascii="Arial" w:hAnsi="Arial" w:cs="Arial"/>
-          <w:b/>
-          <w:bCs/>
-        </w:rPr>
-        <w:t>​</w:t>
-      </w:r>
-      <w:r>
+        <w:t>Qualité des données</w:t>
+      </w:r>
+    </w:p>
+    <w:p>
+      <w:pPr>
         <w:rPr>
           <w:b/>
           <w:bCs/>
         </w:rPr>
-        <w:t>Miser sur les endroits les plus demand</w:t>
-      </w:r>
-      <w:r>
-        <w:rPr>
-          <w:rFonts w:ascii="Aptos" w:hAnsi="Aptos" w:cs="Aptos"/>
-          <w:b/>
-          <w:bCs/>
-        </w:rPr>
-        <w:t>é</w:t>
-      </w:r>
+      </w:pPr>
       <w:r>
         <w:rPr>
           <w:b/>
           <w:bCs/>
         </w:rPr>
-        <w:t>s en v</w:t>
-      </w:r>
-      <w:r>
-        <w:rPr>
-          <w:rFonts w:ascii="Aptos" w:hAnsi="Aptos" w:cs="Aptos"/>
-          <w:b/>
-          <w:bCs/>
-        </w:rPr>
-        <w:t>é</w:t>
-      </w:r>
-      <w:r>
-        <w:rPr>
-          <w:b/>
-          <w:bCs/>
-        </w:rPr>
-        <w:t xml:space="preserve">lo. </w:t>
-      </w:r>
-      <w:r>
-        <w:rPr>
-          <w:rFonts w:ascii="Arial" w:hAnsi="Arial" w:cs="Arial"/>
-          <w:b/>
-          <w:bCs/>
-        </w:rPr>
-        <w:t>​</w:t>
-      </w:r>
-      <w:r>
-        <w:rPr>
-          <w:b/>
-          <w:bCs/>
-        </w:rPr>
-        <w:t>Investir dans de v</w:t>
-      </w:r>
-      <w:r>
-        <w:rPr>
-          <w:rFonts w:ascii="Aptos" w:hAnsi="Aptos" w:cs="Aptos"/>
-          <w:b/>
-          <w:bCs/>
-        </w:rPr>
-        <w:t>é</w:t>
-      </w:r>
-      <w:r>
-        <w:rPr>
-          <w:b/>
-          <w:bCs/>
-        </w:rPr>
-        <w:t>lo classique/</w:t>
-      </w:r>
-      <w:r>
-        <w:rPr>
-          <w:rFonts w:ascii="Aptos" w:hAnsi="Aptos" w:cs="Aptos"/>
-          <w:b/>
-          <w:bCs/>
-        </w:rPr>
-        <w:t>é</w:t>
-      </w:r>
-      <w:r>
-        <w:rPr>
-          <w:b/>
-          <w:bCs/>
-        </w:rPr>
-        <w:t xml:space="preserve">lectrique selon la demande. </w:t>
-      </w:r>
-      <w:r>
-        <w:rPr>
-          <w:rFonts w:ascii="Arial" w:hAnsi="Arial" w:cs="Arial"/>
-          <w:b/>
-          <w:bCs/>
-        </w:rPr>
-        <w:t>​</w:t>
-      </w:r>
-      <w:r>
-        <w:rPr>
-          <w:rFonts w:ascii="Aptos" w:hAnsi="Aptos" w:cs="Aptos"/>
-          <w:b/>
-          <w:bCs/>
-        </w:rPr>
-        <w:t>É</w:t>
-      </w:r>
-      <w:r>
-        <w:rPr>
-          <w:b/>
-          <w:bCs/>
-        </w:rPr>
-        <w:t>nonc</w:t>
-      </w:r>
-      <w:r>
-        <w:rPr>
-          <w:rFonts w:ascii="Aptos" w:hAnsi="Aptos" w:cs="Aptos"/>
-          <w:b/>
-          <w:bCs/>
-        </w:rPr>
-        <w:t>é</w:t>
-      </w:r>
-      <w:r>
-        <w:rPr>
-          <w:b/>
-          <w:bCs/>
-        </w:rPr>
-        <w:t xml:space="preserve"> clair : Comprendre les habitudes des clients et la fr</w:t>
-      </w:r>
-      <w:r>
-        <w:rPr>
-          <w:rFonts w:ascii="Aptos" w:hAnsi="Aptos" w:cs="Aptos"/>
-          <w:b/>
-          <w:bCs/>
-        </w:rPr>
-        <w:t>é</w:t>
-      </w:r>
-      <w:r>
-        <w:rPr>
-          <w:b/>
-          <w:bCs/>
-        </w:rPr>
-        <w:t>quentation des stations, pour offrir la meilleure gamme de service (V</w:t>
-      </w:r>
-      <w:r>
-        <w:rPr>
-          <w:rFonts w:ascii="Aptos" w:hAnsi="Aptos" w:cs="Aptos"/>
-          <w:b/>
-          <w:bCs/>
-        </w:rPr>
-        <w:t>é</w:t>
-      </w:r>
-      <w:r>
-        <w:rPr>
-          <w:b/>
-          <w:bCs/>
-        </w:rPr>
-        <w:t xml:space="preserve">lo </w:t>
-      </w:r>
-      <w:r>
-        <w:rPr>
-          <w:rFonts w:ascii="Aptos" w:hAnsi="Aptos" w:cs="Aptos"/>
-          <w:b/>
-          <w:bCs/>
-        </w:rPr>
-        <w:t>é</w:t>
-      </w:r>
-      <w:r>
-        <w:rPr>
-          <w:b/>
-          <w:bCs/>
-        </w:rPr>
-        <w:t xml:space="preserve">lectrique ou classique). </w:t>
-      </w:r>
-      <w:r>
-        <w:rPr>
-          <w:rFonts w:ascii="Arial" w:hAnsi="Arial" w:cs="Arial"/>
-          <w:b/>
-          <w:bCs/>
-        </w:rPr>
-        <w:t>​</w:t>
+        <w:t>Des problèmes de données ont été identifiés et traités en amont : entrées incomplètes, valeurs manquantes ou erronées, supprimées par filtrage des colonnes concernées.</w:t>
       </w:r>
     </w:p>
     <w:p>
       <w:pPr>
         <w:rPr>
-          <w:rFonts w:ascii="Arial" w:hAnsi="Arial" w:cs="Arial"/>
+          <w:b/>
+          <w:bCs/>
         </w:rPr>
       </w:pPr>
     </w:p>
     <w:p>
       <w:pPr>
         <w:rPr>
-          <w:rFonts w:ascii="Arial" w:hAnsi="Arial" w:cs="Arial"/>
+          <w:b/>
+          <w:bCs/>
         </w:rPr>
       </w:pPr>
     </w:p>
     <w:p>
-      <w:r>
-        <w:t>BDD CSV organis</w:t>
-      </w:r>
-      <w:r>
+      <w:pPr>
         <w:rPr>
-          <w:rFonts w:ascii="Aptos" w:hAnsi="Aptos" w:cs="Aptos"/>
+          <w:b/>
+          <w:bCs/>
         </w:rPr>
-        <w:t>é</w:t>
-      </w:r>
-      <w:r>
-        <w:t>e en 12 feuilles repr</w:t>
-      </w:r>
-      <w:r>
-        <w:rPr>
-          <w:rFonts w:ascii="Aptos" w:hAnsi="Aptos" w:cs="Aptos"/>
-        </w:rPr>
-        <w:t>é</w:t>
-      </w:r>
-      <w:r>
-        <w:t xml:space="preserve">sentant 12 mois </w:t>
-      </w:r>
-      <w:r>
-        <w:t xml:space="preserve">(de 01-2025 à 12-2025) </w:t>
-      </w:r>
-      <w:r>
-        <w:rPr>
-          <w:rFonts w:ascii="Arial" w:hAnsi="Arial" w:cs="Arial"/>
-        </w:rPr>
-        <w:t>​</w:t>
-      </w:r>
-      <w:r>
-        <w:t xml:space="preserve"> Je pars du principe que la base de </w:t>
-      </w:r>
-      <w:r>
-        <w:t>donn</w:t>
-      </w:r>
-      <w:r>
-        <w:rPr>
-          <w:rFonts w:ascii="Aptos" w:hAnsi="Aptos" w:cs="Aptos"/>
-        </w:rPr>
-        <w:t>é</w:t>
-      </w:r>
-      <w:r>
-        <w:t>es</w:t>
-      </w:r>
-      <w:r>
-        <w:t xml:space="preserve"> est bien stock</w:t>
-      </w:r>
-      <w:r>
-        <w:rPr>
-          <w:rFonts w:ascii="Aptos" w:hAnsi="Aptos" w:cs="Aptos"/>
-        </w:rPr>
-        <w:t>é</w:t>
-      </w:r>
-      <w:r>
-        <w:t>e et s</w:t>
-      </w:r>
-      <w:r>
-        <w:rPr>
-          <w:rFonts w:ascii="Aptos" w:hAnsi="Aptos" w:cs="Aptos"/>
-        </w:rPr>
-        <w:t>é</w:t>
-      </w:r>
-      <w:r>
-        <w:t>curis</w:t>
-      </w:r>
-      <w:r>
-        <w:rPr>
-          <w:rFonts w:ascii="Aptos" w:hAnsi="Aptos" w:cs="Aptos"/>
-        </w:rPr>
-        <w:t>é</w:t>
-      </w:r>
-      <w:r>
-        <w:t xml:space="preserve">e et accessible. </w:t>
-      </w:r>
-      <w:r>
-        <w:rPr>
-          <w:rFonts w:ascii="Arial" w:hAnsi="Arial" w:cs="Arial"/>
-        </w:rPr>
-        <w:t>​</w:t>
-      </w:r>
-      <w:r>
-        <w:t>Les donnes vont me donner des r</w:t>
-      </w:r>
-      <w:r>
-        <w:rPr>
-          <w:rFonts w:ascii="Aptos" w:hAnsi="Aptos" w:cs="Aptos"/>
-        </w:rPr>
-        <w:t>é</w:t>
-      </w:r>
-      <w:r>
-        <w:t>ponses sur la</w:t>
-      </w:r>
-      <w:r>
-        <w:t xml:space="preserve"> </w:t>
-      </w:r>
-      <w:r>
-        <w:t>fr</w:t>
-      </w:r>
-      <w:r>
-        <w:rPr>
-          <w:rFonts w:ascii="Aptos" w:hAnsi="Aptos" w:cs="Aptos"/>
-        </w:rPr>
-        <w:t>é</w:t>
-      </w:r>
-      <w:r>
-        <w:t xml:space="preserve">quentation et les habitudes des clients. </w:t>
-      </w:r>
-      <w:r>
-        <w:rPr>
-          <w:rFonts w:ascii="Arial" w:hAnsi="Arial" w:cs="Arial"/>
-        </w:rPr>
-        <w:t>​</w:t>
-      </w:r>
-      <w:r>
-        <w:t xml:space="preserve">PB avec Data : Data manquantes, erronées ou absentes. </w:t>
-      </w:r>
-      <w:r>
-        <w:rPr>
-          <w:rFonts w:ascii="Arial" w:hAnsi="Arial" w:cs="Arial"/>
-        </w:rPr>
-        <w:t>​</w:t>
-      </w:r>
-      <w:r>
-        <w:t xml:space="preserve">Supprimer </w:t>
-      </w:r>
-      <w:r>
-        <w:t>les entr</w:t>
-      </w:r>
-      <w:r>
-        <w:rPr>
-          <w:rFonts w:ascii="Aptos" w:hAnsi="Aptos" w:cs="Aptos"/>
-        </w:rPr>
-        <w:t>é</w:t>
-      </w:r>
-      <w:r>
-        <w:t>es incompl</w:t>
-      </w:r>
-      <w:r>
-        <w:rPr>
-          <w:rFonts w:ascii="Aptos" w:hAnsi="Aptos" w:cs="Aptos"/>
-        </w:rPr>
-        <w:t>è</w:t>
-      </w:r>
-      <w:r>
-        <w:t>tes</w:t>
-      </w:r>
-      <w:r>
-        <w:t xml:space="preserve"> en filtrant les colonnes</w:t>
-      </w:r>
-      <w:r>
-        <w:t>, erreur de ma part</w:t>
-      </w:r>
-      <w:r>
-        <w:t>.</w:t>
-      </w:r>
+      </w:pPr>
     </w:p>
-    <w:p>
-      <w:r>
-        <w:t>Suppression</w:t>
-      </w:r>
-      <w:r>
-        <w:t xml:space="preserve"> des feuilles de calcul représentant les année 2023 et 2024 par soucis de vitesse de lenteur (voir de plantage) de l’application </w:t>
-      </w:r>
-      <w:r>
-        <w:t>Excel</w:t>
-      </w:r>
-      <w:r>
-        <w:t xml:space="preserve"> sur mon ordinateur à chaque nouvelle formules insérées.</w:t>
-      </w:r>
-    </w:p>
-    <w:p/>
     <w:p>
       <w:pPr>
         <w:pStyle w:val="Paragraphedeliste"/>
@@ -756,6 +349,7 @@
           <w:bCs/>
           <w:u w:val="single"/>
         </w:rPr>
+        <w:lastRenderedPageBreak/>
         <w:t xml:space="preserve">1 : </w:t>
       </w:r>
       <w:r>
@@ -1088,7 +682,6 @@
         </w:numPr>
       </w:pPr>
       <w:r>
-        <w:lastRenderedPageBreak/>
         <w:t>Ajou</w:t>
       </w:r>
       <w:r>
@@ -1262,28 +855,7 @@
         </w:numPr>
       </w:pPr>
       <w:r>
-        <w:t>Calcul de</w:t>
-      </w:r>
-      <w:r>
-        <w:t>s</w:t>
-      </w:r>
-      <w:r>
-        <w:t xml:space="preserve"> </w:t>
-      </w:r>
-      <w:r>
-        <w:t>durées</w:t>
-      </w:r>
-      <w:r>
-        <w:t xml:space="preserve"> d</w:t>
-      </w:r>
-      <w:r>
-        <w:t>e</w:t>
-      </w:r>
-      <w:r>
-        <w:t xml:space="preserve"> trajet moyen et mensuel</w:t>
-      </w:r>
-      <w:r>
-        <w:t xml:space="preserve"> </w:t>
+        <w:t xml:space="preserve">Calcul des durées de trajet moyen et mensuel </w:t>
       </w:r>
       <w:r>
         <w:t>en vélo électriques des utilisateur membres</w:t>
@@ -1451,6 +1023,7 @@
         <w:ind w:left="405"/>
       </w:pPr>
       <w:r>
+        <w:lastRenderedPageBreak/>
         <w:t>Total d</w:t>
       </w:r>
       <w:r>
@@ -1618,7 +1191,6 @@
     </w:p>
     <w:p>
       <w:r>
-        <w:lastRenderedPageBreak/>
         <w:t>Pour chaque mois</w:t>
       </w:r>
       <w:r>
@@ -1726,10 +1298,7 @@
       </w:r>
       <w:proofErr w:type="spellStart"/>
       <w:r>
-        <w:t>NomDuMois_T</w:t>
-      </w:r>
-      <w:r>
-        <w:t>D</w:t>
+        <w:t>NomDuMois_TD</w:t>
       </w:r>
       <w:proofErr w:type="spellEnd"/>
       <w:r>
@@ -1953,10 +1522,7 @@
         <w:t>/s » du plus petit au plus grand</w:t>
       </w:r>
       <w:r>
-        <w:t xml:space="preserve">, et masquage de toutes les colonnes sauf </w:t>
-      </w:r>
-      <w:r>
-        <w:t>« </w:t>
+        <w:t>, et masquage de toutes les colonnes sauf « </w:t>
       </w:r>
       <w:proofErr w:type="spellStart"/>
       <w:r>
@@ -1964,10 +1530,7 @@
       </w:r>
       <w:proofErr w:type="spellEnd"/>
       <w:r>
-        <w:t>/s</w:t>
-      </w:r>
-      <w:r>
-        <w:t> »</w:t>
+        <w:t>/s »</w:t>
       </w:r>
       <w:r>
         <w:t xml:space="preserve"> grâce au tri.</w:t>
@@ -2047,6 +1610,7 @@
         <w:ind w:left="405"/>
       </w:pPr>
       <w:r>
+        <w:lastRenderedPageBreak/>
         <w:t xml:space="preserve">Grace aux filtres appliqués sur le TCD de la feuille de calcul </w:t>
       </w:r>
       <w:proofErr w:type="spellStart"/>
@@ -2519,7 +2083,6 @@
         </w:numPr>
       </w:pPr>
       <w:r>
-        <w:lastRenderedPageBreak/>
         <w:t>Le total de location vélo électrique membre et le %</w:t>
       </w:r>
       <w:r>
@@ -2802,6 +2365,11 @@
       </w:r>
     </w:p>
     <w:p/>
+    <w:p/>
+    <w:p/>
+    <w:p/>
+    <w:p/>
+    <w:p/>
     <w:p>
       <w:pPr>
         <w:jc w:val="center"/>
@@ -2810,6 +2378,9 @@
         </w:rPr>
       </w:pPr>
       <w:r>
+        <w:rPr>
+          <w:noProof/>
+        </w:rPr>
         <w:drawing>
           <wp:anchor distT="0" distB="0" distL="114300" distR="114300" simplePos="0" relativeHeight="251658240" behindDoc="0" locked="0" layoutInCell="1" allowOverlap="1" wp14:anchorId="7D60FCC4" wp14:editId="504780BF">
             <wp:simplePos x="0" y="0"/>
@@ -2878,6 +2449,7 @@
       </w:pPr>
       <w:r>
         <w:rPr>
+          <w:noProof/>
           <w:sz w:val="36"/>
           <w:szCs w:val="36"/>
         </w:rPr>
@@ -2956,6 +2528,9 @@
         </w:rPr>
       </w:pPr>
       <w:r>
+        <w:rPr>
+          <w:noProof/>
+        </w:rPr>
         <w:drawing>
           <wp:anchor distT="0" distB="0" distL="114300" distR="114300" simplePos="0" relativeHeight="251660288" behindDoc="0" locked="0" layoutInCell="1" allowOverlap="1" wp14:anchorId="343DFB18" wp14:editId="29B661F7">
             <wp:simplePos x="0" y="0"/>
@@ -3040,39 +2615,6 @@
           <w:u w:val="single"/>
         </w:rPr>
       </w:pPr>
-      <w:r>
-        <w:rPr>
-          <w:u w:val="single"/>
-        </w:rPr>
-        <w:lastRenderedPageBreak/>
-        <w:drawing>
-          <wp:anchor distT="0" distB="0" distL="114300" distR="114300" simplePos="0" relativeHeight="251661312" behindDoc="0" locked="0" layoutInCell="1" allowOverlap="1" wp14:anchorId="20DDD7AD" wp14:editId="507578DD">
-            <wp:simplePos x="0" y="0"/>
-            <wp:positionH relativeFrom="margin">
-              <wp:align>center</wp:align>
-            </wp:positionH>
-            <wp:positionV relativeFrom="paragraph">
-              <wp:posOffset>-699770</wp:posOffset>
-            </wp:positionV>
-            <wp:extent cx="5010150" cy="3141980"/>
-            <wp:effectExtent l="0" t="0" r="0" b="1270"/>
-            <wp:wrapNone/>
-            <wp:docPr id="4" name="Graphique 4">
-              <a:extLst xmlns:a="http://schemas.openxmlformats.org/drawingml/2006/main">
-                <a:ext uri="{FF2B5EF4-FFF2-40B4-BE49-F238E27FC236}">
-                  <a16:creationId xmlns:a16="http://schemas.microsoft.com/office/drawing/2014/main" id="{4FFD4DC7-C20E-44DE-7320-A815D2EC5C0B}"/>
-                </a:ext>
-              </a:extLst>
-            </wp:docPr>
-            <wp:cNvGraphicFramePr/>
-            <a:graphic xmlns:a="http://schemas.openxmlformats.org/drawingml/2006/main">
-              <a:graphicData uri="http://schemas.openxmlformats.org/drawingml/2006/chart">
-                <c:chart xmlns:c="http://schemas.openxmlformats.org/drawingml/2006/chart" xmlns:r="http://schemas.openxmlformats.org/officeDocument/2006/relationships" r:id="rId8"/>
-              </a:graphicData>
-            </a:graphic>
-          </wp:anchor>
-        </w:drawing>
-      </w:r>
     </w:p>
     <w:p>
       <w:pPr>
@@ -3105,9 +2647,62 @@
           <w:u w:val="single"/>
         </w:rPr>
       </w:pPr>
+      <w:r>
+        <w:rPr>
+          <w:noProof/>
+          <w:u w:val="single"/>
+        </w:rPr>
+        <w:drawing>
+          <wp:anchor distT="0" distB="0" distL="114300" distR="114300" simplePos="0" relativeHeight="251661312" behindDoc="0" locked="0" layoutInCell="1" allowOverlap="1" wp14:anchorId="20DDD7AD" wp14:editId="46A05E51">
+            <wp:simplePos x="0" y="0"/>
+            <wp:positionH relativeFrom="margin">
+              <wp:align>center</wp:align>
+            </wp:positionH>
+            <wp:positionV relativeFrom="paragraph">
+              <wp:posOffset>12065</wp:posOffset>
+            </wp:positionV>
+            <wp:extent cx="3924300" cy="2276475"/>
+            <wp:effectExtent l="0" t="0" r="0" b="9525"/>
+            <wp:wrapNone/>
+            <wp:docPr id="4" name="Graphique 4">
+              <a:extLst xmlns:a="http://schemas.openxmlformats.org/drawingml/2006/main">
+                <a:ext uri="{FF2B5EF4-FFF2-40B4-BE49-F238E27FC236}">
+                  <a16:creationId xmlns:a16="http://schemas.microsoft.com/office/drawing/2014/main" id="{4FFD4DC7-C20E-44DE-7320-A815D2EC5C0B}"/>
+                </a:ext>
+              </a:extLst>
+            </wp:docPr>
+            <wp:cNvGraphicFramePr/>
+            <a:graphic xmlns:a="http://schemas.openxmlformats.org/drawingml/2006/main">
+              <a:graphicData uri="http://schemas.openxmlformats.org/drawingml/2006/chart">
+                <c:chart xmlns:c="http://schemas.openxmlformats.org/drawingml/2006/chart" xmlns:r="http://schemas.openxmlformats.org/officeDocument/2006/relationships" r:id="rId8"/>
+              </a:graphicData>
+            </a:graphic>
+            <wp14:sizeRelH relativeFrom="margin">
+              <wp14:pctWidth>0</wp14:pctWidth>
+            </wp14:sizeRelH>
+            <wp14:sizeRelV relativeFrom="margin">
+              <wp14:pctHeight>0</wp14:pctHeight>
+            </wp14:sizeRelV>
+          </wp:anchor>
+        </w:drawing>
+      </w:r>
     </w:p>
+    <w:p/>
+    <w:p/>
+    <w:p/>
+    <w:p/>
+    <w:p/>
+    <w:p/>
+    <w:p/>
+    <w:p/>
+    <w:p/>
+    <w:p/>
     <w:p>
       <w:r>
+        <w:rPr>
+          <w:noProof/>
+        </w:rPr>
+        <w:lastRenderedPageBreak/>
         <w:drawing>
           <wp:anchor distT="0" distB="0" distL="114300" distR="114300" simplePos="0" relativeHeight="251663360" behindDoc="0" locked="0" layoutInCell="1" allowOverlap="1" wp14:anchorId="3D18C371" wp14:editId="2251D372">
             <wp:simplePos x="0" y="0"/>
@@ -3138,6 +2733,7 @@
       </w:r>
       <w:r>
         <w:rPr>
+          <w:noProof/>
           <w:u w:val="single"/>
         </w:rPr>
         <w:drawing>
@@ -3182,6 +2778,155 @@
 <file path=word/numbering.xml><?xml version="1.0" encoding="utf-8"?>
 <w:numbering xmlns:wpc="http://schemas.microsoft.com/office/word/2010/wordprocessingCanvas" xmlns:cx="http://schemas.microsoft.com/office/drawing/2014/chartex" xmlns:cx1="http://schemas.microsoft.com/office/drawing/2015/9/8/chartex" xmlns:cx2="http://schemas.microsoft.com/office/drawing/2015/10/21/chartex" xmlns:cx3="http://schemas.microsoft.com/office/drawing/2016/5/9/chartex" xmlns:cx4="http://schemas.microsoft.com/office/drawing/2016/5/10/chartex" xmlns:cx5="http://schemas.microsoft.com/office/drawing/2016/5/11/chartex" xmlns:cx6="http://schemas.microsoft.com/office/drawing/2016/5/12/chartex" xmlns:cx7="http://schemas.microsoft.com/office/drawing/2016/5/13/chartex" xmlns:cx8="http://schemas.microsoft.com/office/drawing/2016/5/14/chartex" xmlns:mc="http://schemas.openxmlformats.org/markup-compatibility/2006" xmlns:aink="http://schemas.microsoft.com/office/drawing/2016/ink" xmlns:am3d="http://schemas.microsoft.com/office/drawing/2017/model3d" xmlns:o="urn:schemas-microsoft-com:office:office" xmlns:oel="http://schemas.microsoft.com/office/2019/extlst" xmlns:r="http://schemas.openxmlformats.org/officeDocument/2006/relationships" xmlns:m="http://schemas.openxmlformats.org/officeDocument/2006/math" xmlns:v="urn:schemas-microsoft-com:vml" xmlns:wp14="http://schemas.microsoft.com/office/word/2010/wordprocessingDrawing" xmlns:wp="http://schemas.openxmlformats.org/drawingml/2006/wordprocessingDrawing" xmlns:w10="urn:schemas-microsoft-com:office:word" xmlns:w="http://schemas.openxmlformats.org/wordprocessingml/2006/main" xmlns:w14="http://schemas.microsoft.com/office/word/2010/wordml" xmlns:w15="http://schemas.microsoft.com/office/word/2012/wordml" xmlns:w16cex="http://schemas.microsoft.com/office/word/2018/wordml/cex" xmlns:w16cid="http://schemas.microsoft.com/office/word/2016/wordml/cid" xmlns:w16="http://schemas.microsoft.com/office/word/2018/wordml" xmlns:w16sdtdh="http://schemas.microsoft.com/office/word/2020/wordml/sdtdatahash" xmlns:w16se="http://schemas.microsoft.com/office/word/2015/wordml/symex" xmlns:wpg="http://schemas.microsoft.com/office/word/2010/wordprocessingGroup" xmlns:wpi="http://schemas.microsoft.com/office/word/2010/wordprocessingInk" xmlns:wne="http://schemas.microsoft.com/office/word/2006/wordml" xmlns:wps="http://schemas.microsoft.com/office/word/2010/wordprocessingShape" mc:Ignorable="w14 w15 w16se w16cid w16 w16cex w16sdtdh wp14">
   <w:abstractNum w:abstractNumId="0" w15:restartNumberingAfterBreak="0">
+    <w:nsid w:val="0267501D"/>
+    <w:multiLevelType w:val="multilevel"/>
+    <w:tmpl w:val="61B02A14"/>
+    <w:lvl w:ilvl="0">
+      <w:start w:val="1"/>
+      <w:numFmt w:val="bullet"/>
+      <w:lvlText w:val=""/>
+      <w:lvlJc w:val="left"/>
+      <w:pPr>
+        <w:tabs>
+          <w:tab w:val="num" w:pos="720"/>
+        </w:tabs>
+        <w:ind w:left="720" w:hanging="360"/>
+      </w:pPr>
+      <w:rPr>
+        <w:rFonts w:ascii="Symbol" w:hAnsi="Symbol" w:hint="default"/>
+        <w:sz w:val="20"/>
+      </w:rPr>
+    </w:lvl>
+    <w:lvl w:ilvl="1" w:tentative="1">
+      <w:start w:val="1"/>
+      <w:numFmt w:val="bullet"/>
+      <w:lvlText w:val="o"/>
+      <w:lvlJc w:val="left"/>
+      <w:pPr>
+        <w:tabs>
+          <w:tab w:val="num" w:pos="1440"/>
+        </w:tabs>
+        <w:ind w:left="1440" w:hanging="360"/>
+      </w:pPr>
+      <w:rPr>
+        <w:rFonts w:ascii="Courier New" w:hAnsi="Courier New" w:hint="default"/>
+        <w:sz w:val="20"/>
+      </w:rPr>
+    </w:lvl>
+    <w:lvl w:ilvl="2" w:tentative="1">
+      <w:start w:val="1"/>
+      <w:numFmt w:val="bullet"/>
+      <w:lvlText w:val=""/>
+      <w:lvlJc w:val="left"/>
+      <w:pPr>
+        <w:tabs>
+          <w:tab w:val="num" w:pos="2160"/>
+        </w:tabs>
+        <w:ind w:left="2160" w:hanging="360"/>
+      </w:pPr>
+      <w:rPr>
+        <w:rFonts w:ascii="Wingdings" w:hAnsi="Wingdings" w:hint="default"/>
+        <w:sz w:val="20"/>
+      </w:rPr>
+    </w:lvl>
+    <w:lvl w:ilvl="3" w:tentative="1">
+      <w:start w:val="1"/>
+      <w:numFmt w:val="bullet"/>
+      <w:lvlText w:val=""/>
+      <w:lvlJc w:val="left"/>
+      <w:pPr>
+        <w:tabs>
+          <w:tab w:val="num" w:pos="2880"/>
+        </w:tabs>
+        <w:ind w:left="2880" w:hanging="360"/>
+      </w:pPr>
+      <w:rPr>
+        <w:rFonts w:ascii="Wingdings" w:hAnsi="Wingdings" w:hint="default"/>
+        <w:sz w:val="20"/>
+      </w:rPr>
+    </w:lvl>
+    <w:lvl w:ilvl="4" w:tentative="1">
+      <w:start w:val="1"/>
+      <w:numFmt w:val="bullet"/>
+      <w:lvlText w:val=""/>
+      <w:lvlJc w:val="left"/>
+      <w:pPr>
+        <w:tabs>
+          <w:tab w:val="num" w:pos="3600"/>
+        </w:tabs>
+        <w:ind w:left="3600" w:hanging="360"/>
+      </w:pPr>
+      <w:rPr>
+        <w:rFonts w:ascii="Wingdings" w:hAnsi="Wingdings" w:hint="default"/>
+        <w:sz w:val="20"/>
+      </w:rPr>
+    </w:lvl>
+    <w:lvl w:ilvl="5" w:tentative="1">
+      <w:start w:val="1"/>
+      <w:numFmt w:val="bullet"/>
+      <w:lvlText w:val=""/>
+      <w:lvlJc w:val="left"/>
+      <w:pPr>
+        <w:tabs>
+          <w:tab w:val="num" w:pos="4320"/>
+        </w:tabs>
+        <w:ind w:left="4320" w:hanging="360"/>
+      </w:pPr>
+      <w:rPr>
+        <w:rFonts w:ascii="Wingdings" w:hAnsi="Wingdings" w:hint="default"/>
+        <w:sz w:val="20"/>
+      </w:rPr>
+    </w:lvl>
+    <w:lvl w:ilvl="6" w:tentative="1">
+      <w:start w:val="1"/>
+      <w:numFmt w:val="bullet"/>
+      <w:lvlText w:val=""/>
+      <w:lvlJc w:val="left"/>
+      <w:pPr>
+        <w:tabs>
+          <w:tab w:val="num" w:pos="5040"/>
+        </w:tabs>
+        <w:ind w:left="5040" w:hanging="360"/>
+      </w:pPr>
+      <w:rPr>
+        <w:rFonts w:ascii="Wingdings" w:hAnsi="Wingdings" w:hint="default"/>
+        <w:sz w:val="20"/>
+      </w:rPr>
+    </w:lvl>
+    <w:lvl w:ilvl="7" w:tentative="1">
+      <w:start w:val="1"/>
+      <w:numFmt w:val="bullet"/>
+      <w:lvlText w:val=""/>
+      <w:lvlJc w:val="left"/>
+      <w:pPr>
+        <w:tabs>
+          <w:tab w:val="num" w:pos="5760"/>
+        </w:tabs>
+        <w:ind w:left="5760" w:hanging="360"/>
+      </w:pPr>
+      <w:rPr>
+        <w:rFonts w:ascii="Wingdings" w:hAnsi="Wingdings" w:hint="default"/>
+        <w:sz w:val="20"/>
+      </w:rPr>
+    </w:lvl>
+    <w:lvl w:ilvl="8" w:tentative="1">
+      <w:start w:val="1"/>
+      <w:numFmt w:val="bullet"/>
+      <w:lvlText w:val=""/>
+      <w:lvlJc w:val="left"/>
+      <w:pPr>
+        <w:tabs>
+          <w:tab w:val="num" w:pos="6480"/>
+        </w:tabs>
+        <w:ind w:left="6480" w:hanging="360"/>
+      </w:pPr>
+      <w:rPr>
+        <w:rFonts w:ascii="Wingdings" w:hAnsi="Wingdings" w:hint="default"/>
+        <w:sz w:val="20"/>
+      </w:rPr>
+    </w:lvl>
+  </w:abstractNum>
+  <w:abstractNum w:abstractNumId="1" w15:restartNumberingAfterBreak="0">
     <w:nsid w:val="0FD224E5"/>
     <w:multiLevelType w:val="hybridMultilevel"/>
     <w:tmpl w:val="91C24050"/>
@@ -3294,7 +3039,120 @@
       </w:rPr>
     </w:lvl>
   </w:abstractNum>
-  <w:abstractNum w:abstractNumId="1" w15:restartNumberingAfterBreak="0">
+  <w:abstractNum w:abstractNumId="2" w15:restartNumberingAfterBreak="0">
+    <w:nsid w:val="39983D64"/>
+    <w:multiLevelType w:val="multilevel"/>
+    <w:tmpl w:val="D68E8DBA"/>
+    <w:lvl w:ilvl="0">
+      <w:start w:val="1"/>
+      <w:numFmt w:val="decimal"/>
+      <w:lvlText w:val="%1."/>
+      <w:lvlJc w:val="left"/>
+      <w:pPr>
+        <w:tabs>
+          <w:tab w:val="num" w:pos="720"/>
+        </w:tabs>
+        <w:ind w:left="720" w:hanging="360"/>
+      </w:pPr>
+    </w:lvl>
+    <w:lvl w:ilvl="1" w:tentative="1">
+      <w:start w:val="1"/>
+      <w:numFmt w:val="decimal"/>
+      <w:lvlText w:val="%2."/>
+      <w:lvlJc w:val="left"/>
+      <w:pPr>
+        <w:tabs>
+          <w:tab w:val="num" w:pos="1440"/>
+        </w:tabs>
+        <w:ind w:left="1440" w:hanging="360"/>
+      </w:pPr>
+    </w:lvl>
+    <w:lvl w:ilvl="2" w:tentative="1">
+      <w:start w:val="1"/>
+      <w:numFmt w:val="decimal"/>
+      <w:lvlText w:val="%3."/>
+      <w:lvlJc w:val="left"/>
+      <w:pPr>
+        <w:tabs>
+          <w:tab w:val="num" w:pos="2160"/>
+        </w:tabs>
+        <w:ind w:left="2160" w:hanging="360"/>
+      </w:pPr>
+    </w:lvl>
+    <w:lvl w:ilvl="3" w:tentative="1">
+      <w:start w:val="1"/>
+      <w:numFmt w:val="decimal"/>
+      <w:lvlText w:val="%4."/>
+      <w:lvlJc w:val="left"/>
+      <w:pPr>
+        <w:tabs>
+          <w:tab w:val="num" w:pos="2880"/>
+        </w:tabs>
+        <w:ind w:left="2880" w:hanging="360"/>
+      </w:pPr>
+    </w:lvl>
+    <w:lvl w:ilvl="4" w:tentative="1">
+      <w:start w:val="1"/>
+      <w:numFmt w:val="decimal"/>
+      <w:lvlText w:val="%5."/>
+      <w:lvlJc w:val="left"/>
+      <w:pPr>
+        <w:tabs>
+          <w:tab w:val="num" w:pos="3600"/>
+        </w:tabs>
+        <w:ind w:left="3600" w:hanging="360"/>
+      </w:pPr>
+    </w:lvl>
+    <w:lvl w:ilvl="5" w:tentative="1">
+      <w:start w:val="1"/>
+      <w:numFmt w:val="decimal"/>
+      <w:lvlText w:val="%6."/>
+      <w:lvlJc w:val="left"/>
+      <w:pPr>
+        <w:tabs>
+          <w:tab w:val="num" w:pos="4320"/>
+        </w:tabs>
+        <w:ind w:left="4320" w:hanging="360"/>
+      </w:pPr>
+    </w:lvl>
+    <w:lvl w:ilvl="6" w:tentative="1">
+      <w:start w:val="1"/>
+      <w:numFmt w:val="decimal"/>
+      <w:lvlText w:val="%7."/>
+      <w:lvlJc w:val="left"/>
+      <w:pPr>
+        <w:tabs>
+          <w:tab w:val="num" w:pos="5040"/>
+        </w:tabs>
+        <w:ind w:left="5040" w:hanging="360"/>
+      </w:pPr>
+    </w:lvl>
+    <w:lvl w:ilvl="7" w:tentative="1">
+      <w:start w:val="1"/>
+      <w:numFmt w:val="decimal"/>
+      <w:lvlText w:val="%8."/>
+      <w:lvlJc w:val="left"/>
+      <w:pPr>
+        <w:tabs>
+          <w:tab w:val="num" w:pos="5760"/>
+        </w:tabs>
+        <w:ind w:left="5760" w:hanging="360"/>
+      </w:pPr>
+    </w:lvl>
+    <w:lvl w:ilvl="8" w:tentative="1">
+      <w:start w:val="1"/>
+      <w:numFmt w:val="decimal"/>
+      <w:lvlText w:val="%9."/>
+      <w:lvlJc w:val="left"/>
+      <w:pPr>
+        <w:tabs>
+          <w:tab w:val="num" w:pos="6480"/>
+        </w:tabs>
+        <w:ind w:left="6480" w:hanging="360"/>
+      </w:pPr>
+    </w:lvl>
+  </w:abstractNum>
+  <w:abstractNum w:abstractNumId="3" w15:restartNumberingAfterBreak="0">
     <w:nsid w:val="41983045"/>
     <w:multiLevelType w:val="hybridMultilevel"/>
     <w:tmpl w:val="3E6E6F52"/>
@@ -3406,7 +3264,7 @@
       </w:rPr>
     </w:lvl>
   </w:abstractNum>
-  <w:abstractNum w:abstractNumId="2" w15:restartNumberingAfterBreak="0">
+  <w:abstractNum w:abstractNumId="4" w15:restartNumberingAfterBreak="0">
     <w:nsid w:val="7C81345C"/>
     <w:multiLevelType w:val="hybridMultilevel"/>
     <w:tmpl w:val="5C361746"/>
@@ -3520,13 +3378,19 @@
     </w:lvl>
   </w:abstractNum>
   <w:num w:numId="1" w16cid:durableId="115294681">
+    <w:abstractNumId w:val="3"/>
+  </w:num>
+  <w:num w:numId="2" w16cid:durableId="1362633648">
+    <w:abstractNumId w:val="4"/>
+  </w:num>
+  <w:num w:numId="3" w16cid:durableId="765613467">
     <w:abstractNumId w:val="1"/>
   </w:num>
-  <w:num w:numId="2" w16cid:durableId="1362633648">
+  <w:num w:numId="4" w16cid:durableId="1476217879">
+    <w:abstractNumId w:val="0"/>
+  </w:num>
+  <w:num w:numId="5" w16cid:durableId="1552309179">
     <w:abstractNumId w:val="2"/>
-  </w:num>
-  <w:num w:numId="3" w16cid:durableId="765613467">
-    <w:abstractNumId w:val="0"/>
   </w:num>
 </w:numbering>
 </file>

</xml_diff>